<commit_message>
Restore contract template formatting
</commit_message>
<xml_diff>
--- a/templates/contract-template.docx
+++ b/templates/contract-template.docx
@@ -292,15 +292,7 @@
           <w:sz w:val="20"/>
           <w:szCs w:val="20"/>
         </w:rPr>
-        <w:t xml:space="preserve"> </w:t>
-      </w:r>
-      <w:r>
-        <w:rPr>
-          <w:rFonts w:ascii="Aptos" w:hAnsi="Aptos"/>
-          <w:sz w:val="20"/>
-          <w:szCs w:val="20"/>
-        </w:rPr>
-        <w:t>{{</w:t>
+        <w:t xml:space="preserve"> {{</w:t>
       </w:r>
       <w:proofErr w:type="spellStart"/>
       <w:r>
@@ -635,19 +627,72 @@
       </w:pPr>
       <w:r>
         <w:rPr>
-          <w:rFonts w:ascii="Aptos" w:hAnsi="Aptos"/>
-          <w:sz w:val="20"/>
-          <w:szCs w:val="20"/>
-        </w:rPr>
-        <w:t xml:space="preserve">Position: </w:t>
-      </w:r>
-      <w:r>
-        <w:rPr>
-          <w:rFonts w:ascii="Aptos" w:hAnsi="Aptos"/>
-          <w:sz w:val="20"/>
-          <w:szCs w:val="20"/>
-        </w:rPr>
-        <w:t>{{jobTitle}}</w:t>
+          <w:rFonts w:ascii="Aptos" w:hAnsi="Aptos" w:cstheme="minorHAnsi"/>
+          <w:b/>
+          <w:bCs/>
+          <w:sz w:val="20"/>
+          <w:szCs w:val="20"/>
+        </w:rPr>
+        <w:t>Position</w:t>
+      </w:r>
+      <w:r>
+        <w:rPr>
+          <w:rFonts w:ascii="Aptos" w:hAnsi="Aptos" w:cstheme="minorHAnsi"/>
+          <w:b/>
+          <w:bCs/>
+          <w:sz w:val="20"/>
+          <w:szCs w:val="20"/>
+        </w:rPr>
+        <w:t>:</w:t>
+      </w:r>
+      <w:r>
+        <w:rPr>
+          <w:rFonts w:ascii="Aptos" w:hAnsi="Aptos" w:cstheme="minorHAnsi"/>
+          <w:b/>
+          <w:bCs/>
+          <w:sz w:val="20"/>
+          <w:szCs w:val="20"/>
+        </w:rPr>
+        <w:tab/>
+      </w:r>
+      <w:r>
+        <w:rPr>
+          <w:rFonts w:ascii="Aptos" w:hAnsi="Aptos" w:cstheme="minorHAnsi"/>
+          <w:b/>
+          <w:bCs/>
+          <w:sz w:val="20"/>
+          <w:szCs w:val="20"/>
+        </w:rPr>
+        <w:tab/>
+      </w:r>
+      <w:r>
+        <w:rPr>
+          <w:rFonts w:ascii="Aptos" w:hAnsi="Aptos"/>
+          <w:sz w:val="20"/>
+          <w:szCs w:val="20"/>
+          <w:lang w:val="en-US"/>
+        </w:rPr>
+        <w:t>{{</w:t>
+      </w:r>
+      <w:proofErr w:type="spellStart"/>
+      <w:r>
+        <w:rPr>
+          <w:rFonts w:ascii="Aptos" w:hAnsi="Aptos"/>
+          <w:sz w:val="20"/>
+          <w:szCs w:val="20"/>
+          <w:lang w:val="en-US"/>
+        </w:rPr>
+        <w:t>jobTitle</w:t>
+      </w:r>
+      <w:proofErr w:type="spellEnd"/>
+      <w:r>
+        <w:rPr>
+          <w:rFonts w:ascii="Aptos" w:hAnsi="Aptos"/>
+          <w:sz w:val="20"/>
+          <w:szCs w:val="20"/>
+          <w:lang w:val="en-US"/>
+        </w:rPr>
+        <w:t>}}</w:t>
       </w:r>
     </w:p>
     <w:p>
@@ -673,19 +718,62 @@
       </w:pPr>
       <w:r>
         <w:rPr>
-          <w:rFonts w:ascii="Aptos" w:hAnsi="Aptos"/>
-          <w:sz w:val="20"/>
-          <w:szCs w:val="20"/>
-        </w:rPr>
-        <w:t xml:space="preserve">Assignment Start Date: </w:t>
-      </w:r>
-      <w:r>
-        <w:rPr>
-          <w:rFonts w:ascii="Aptos" w:hAnsi="Aptos"/>
-          <w:sz w:val="20"/>
-          <w:szCs w:val="20"/>
-        </w:rPr>
-        <w:t>{{startDate}}</w:t>
+          <w:rFonts w:ascii="Aptos" w:hAnsi="Aptos" w:cstheme="minorHAnsi"/>
+          <w:b/>
+          <w:bCs/>
+          <w:sz w:val="20"/>
+          <w:szCs w:val="20"/>
+        </w:rPr>
+        <w:t>Assignment Start Date:</w:t>
+      </w:r>
+      <w:r>
+        <w:rPr>
+          <w:rFonts w:ascii="Aptos" w:hAnsi="Aptos" w:cstheme="minorHAnsi"/>
+          <w:b/>
+          <w:bCs/>
+          <w:sz w:val="20"/>
+          <w:szCs w:val="20"/>
+        </w:rPr>
+        <w:tab/>
+      </w:r>
+      <w:r>
+        <w:rPr>
+          <w:rFonts w:ascii="Aptos" w:hAnsi="Aptos" w:cstheme="minorHAnsi"/>
+          <w:b/>
+          <w:bCs/>
+          <w:sz w:val="20"/>
+          <w:szCs w:val="20"/>
+        </w:rPr>
+        <w:tab/>
+      </w:r>
+      <w:r>
+        <w:rPr>
+          <w:rFonts w:ascii="Aptos" w:hAnsi="Aptos" w:cstheme="minorHAnsi"/>
+          <w:sz w:val="20"/>
+          <w:szCs w:val="20"/>
+          <w:lang w:val="en-US"/>
+        </w:rPr>
+        <w:t>{{</w:t>
+      </w:r>
+      <w:proofErr w:type="spellStart"/>
+      <w:r>
+        <w:rPr>
+          <w:rFonts w:ascii="Aptos" w:hAnsi="Aptos" w:cstheme="minorHAnsi"/>
+          <w:sz w:val="20"/>
+          <w:szCs w:val="20"/>
+          <w:lang w:val="en-US"/>
+        </w:rPr>
+        <w:t>startDate</w:t>
+      </w:r>
+      <w:proofErr w:type="spellEnd"/>
+      <w:r>
+        <w:rPr>
+          <w:rFonts w:ascii="Aptos" w:hAnsi="Aptos" w:cstheme="minorHAnsi"/>
+          <w:sz w:val="20"/>
+          <w:szCs w:val="20"/>
+          <w:lang w:val="en-US"/>
+        </w:rPr>
+        <w:t>}}</w:t>
       </w:r>
     </w:p>
     <w:p>
@@ -711,19 +799,62 @@
       </w:pPr>
       <w:r>
         <w:rPr>
-          <w:rFonts w:ascii="Aptos" w:hAnsi="Aptos"/>
-          <w:sz w:val="20"/>
-          <w:szCs w:val="20"/>
-        </w:rPr>
-        <w:t xml:space="preserve">Assignment End Date: </w:t>
-      </w:r>
-      <w:r>
-        <w:rPr>
-          <w:rFonts w:ascii="Aptos" w:hAnsi="Aptos"/>
-          <w:sz w:val="20"/>
-          <w:szCs w:val="20"/>
-        </w:rPr>
-        <w:t>{{endDate}}</w:t>
+          <w:rFonts w:ascii="Aptos" w:hAnsi="Aptos" w:cstheme="minorHAnsi"/>
+          <w:b/>
+          <w:bCs/>
+          <w:sz w:val="20"/>
+          <w:szCs w:val="20"/>
+        </w:rPr>
+        <w:t>Assignment End Date:</w:t>
+      </w:r>
+      <w:r>
+        <w:rPr>
+          <w:rFonts w:ascii="Aptos" w:hAnsi="Aptos" w:cstheme="minorHAnsi"/>
+          <w:b/>
+          <w:bCs/>
+          <w:sz w:val="20"/>
+          <w:szCs w:val="20"/>
+        </w:rPr>
+        <w:tab/>
+      </w:r>
+      <w:r>
+        <w:rPr>
+          <w:rFonts w:ascii="Aptos" w:hAnsi="Aptos" w:cstheme="minorHAnsi"/>
+          <w:b/>
+          <w:bCs/>
+          <w:sz w:val="20"/>
+          <w:szCs w:val="20"/>
+        </w:rPr>
+        <w:tab/>
+      </w:r>
+      <w:r>
+        <w:rPr>
+          <w:rFonts w:ascii="Aptos" w:hAnsi="Aptos" w:cstheme="minorHAnsi"/>
+          <w:sz w:val="20"/>
+          <w:szCs w:val="20"/>
+          <w:lang w:val="en-US"/>
+        </w:rPr>
+        <w:t>{{</w:t>
+      </w:r>
+      <w:proofErr w:type="spellStart"/>
+      <w:r>
+        <w:rPr>
+          <w:rFonts w:ascii="Aptos" w:hAnsi="Aptos" w:cstheme="minorHAnsi"/>
+          <w:sz w:val="20"/>
+          <w:szCs w:val="20"/>
+          <w:lang w:val="en-US"/>
+        </w:rPr>
+        <w:t>endDate</w:t>
+      </w:r>
+      <w:proofErr w:type="spellEnd"/>
+      <w:r>
+        <w:rPr>
+          <w:rFonts w:ascii="Aptos" w:hAnsi="Aptos" w:cstheme="minorHAnsi"/>
+          <w:sz w:val="20"/>
+          <w:szCs w:val="20"/>
+          <w:lang w:val="en-US"/>
+        </w:rPr>
+        <w:t>}}</w:t>
       </w:r>
     </w:p>
     <w:p>
@@ -749,19 +880,62 @@
       </w:pPr>
       <w:r>
         <w:rPr>
-          <w:rFonts w:ascii="Aptos" w:hAnsi="Aptos"/>
-          <w:sz w:val="20"/>
-          <w:szCs w:val="20"/>
-        </w:rPr>
-        <w:t xml:space="preserve">Assignment Duration: </w:t>
-      </w:r>
-      <w:r>
-        <w:rPr>
-          <w:rFonts w:ascii="Aptos" w:hAnsi="Aptos"/>
-          <w:sz w:val="20"/>
-          <w:szCs w:val="20"/>
-        </w:rPr>
-        <w:t>{{assignmentWeeks}}</w:t>
+          <w:rFonts w:ascii="Aptos" w:hAnsi="Aptos" w:cstheme="minorHAnsi"/>
+          <w:b/>
+          <w:bCs/>
+          <w:sz w:val="20"/>
+          <w:szCs w:val="20"/>
+        </w:rPr>
+        <w:t>Assignment Duration:</w:t>
+      </w:r>
+      <w:r>
+        <w:rPr>
+          <w:rFonts w:ascii="Aptos" w:hAnsi="Aptos" w:cstheme="minorHAnsi"/>
+          <w:b/>
+          <w:bCs/>
+          <w:sz w:val="20"/>
+          <w:szCs w:val="20"/>
+        </w:rPr>
+        <w:tab/>
+      </w:r>
+      <w:r>
+        <w:rPr>
+          <w:rFonts w:ascii="Aptos" w:hAnsi="Aptos" w:cstheme="minorHAnsi"/>
+          <w:b/>
+          <w:bCs/>
+          <w:sz w:val="20"/>
+          <w:szCs w:val="20"/>
+        </w:rPr>
+        <w:tab/>
+      </w:r>
+      <w:r>
+        <w:rPr>
+          <w:rFonts w:ascii="Aptos" w:hAnsi="Aptos" w:cstheme="minorHAnsi"/>
+          <w:sz w:val="20"/>
+          <w:szCs w:val="20"/>
+          <w:lang w:val="en-US"/>
+        </w:rPr>
+        <w:t>{{</w:t>
+      </w:r>
+      <w:proofErr w:type="spellStart"/>
+      <w:r>
+        <w:rPr>
+          <w:rFonts w:ascii="Aptos" w:hAnsi="Aptos" w:cstheme="minorHAnsi"/>
+          <w:sz w:val="20"/>
+          <w:szCs w:val="20"/>
+          <w:lang w:val="en-US"/>
+        </w:rPr>
+        <w:t>assignmentWeeks</w:t>
+      </w:r>
+      <w:proofErr w:type="spellEnd"/>
+      <w:r>
+        <w:rPr>
+          <w:rFonts w:ascii="Aptos" w:hAnsi="Aptos" w:cstheme="minorHAnsi"/>
+          <w:sz w:val="20"/>
+          <w:szCs w:val="20"/>
+          <w:lang w:val="en-US"/>
+        </w:rPr>
+        <w:t>}}</w:t>
       </w:r>
     </w:p>
     <w:p>
@@ -787,19 +961,62 @@
       </w:pPr>
       <w:r>
         <w:rPr>
-          <w:rFonts w:ascii="Aptos" w:hAnsi="Aptos"/>
-          <w:sz w:val="20"/>
-          <w:szCs w:val="20"/>
-        </w:rPr>
-        <w:t xml:space="preserve">Shift Schedule: </w:t>
-      </w:r>
-      <w:r>
-        <w:rPr>
-          <w:rFonts w:ascii="Aptos" w:hAnsi="Aptos"/>
-          <w:sz w:val="20"/>
-          <w:szCs w:val="20"/>
-        </w:rPr>
-        <w:t>{{scheduleLine}}</w:t>
+          <w:rFonts w:ascii="Aptos" w:hAnsi="Aptos" w:cstheme="minorHAnsi"/>
+          <w:b/>
+          <w:bCs/>
+          <w:sz w:val="20"/>
+          <w:szCs w:val="20"/>
+        </w:rPr>
+        <w:t>Shift Schedule:</w:t>
+      </w:r>
+      <w:r>
+        <w:rPr>
+          <w:rFonts w:ascii="Aptos" w:hAnsi="Aptos" w:cstheme="minorHAnsi"/>
+          <w:b/>
+          <w:bCs/>
+          <w:sz w:val="20"/>
+          <w:szCs w:val="20"/>
+        </w:rPr>
+        <w:tab/>
+      </w:r>
+      <w:r>
+        <w:rPr>
+          <w:rFonts w:ascii="Aptos" w:hAnsi="Aptos" w:cstheme="minorHAnsi"/>
+          <w:b/>
+          <w:bCs/>
+          <w:sz w:val="20"/>
+          <w:szCs w:val="20"/>
+        </w:rPr>
+        <w:tab/>
+      </w:r>
+      <w:r>
+        <w:rPr>
+          <w:rFonts w:ascii="Aptos" w:hAnsi="Aptos" w:cstheme="minorHAnsi"/>
+          <w:sz w:val="20"/>
+          <w:szCs w:val="20"/>
+          <w:lang w:val="en-US"/>
+        </w:rPr>
+        <w:t>{{</w:t>
+      </w:r>
+      <w:proofErr w:type="spellStart"/>
+      <w:r>
+        <w:rPr>
+          <w:rFonts w:ascii="Aptos" w:hAnsi="Aptos" w:cstheme="minorHAnsi"/>
+          <w:sz w:val="20"/>
+          <w:szCs w:val="20"/>
+          <w:lang w:val="en-US"/>
+        </w:rPr>
+        <w:t>scheduleLine</w:t>
+      </w:r>
+      <w:proofErr w:type="spellEnd"/>
+      <w:r>
+        <w:rPr>
+          <w:rFonts w:ascii="Aptos" w:hAnsi="Aptos" w:cstheme="minorHAnsi"/>
+          <w:sz w:val="20"/>
+          <w:szCs w:val="20"/>
+          <w:lang w:val="en-US"/>
+        </w:rPr>
+        <w:t>}}</w:t>
       </w:r>
     </w:p>
     <w:p>
@@ -825,19 +1042,120 @@
       </w:pPr>
       <w:r>
         <w:rPr>
-          <w:rFonts w:ascii="Aptos" w:hAnsi="Aptos"/>
-          <w:sz w:val="20"/>
-          <w:szCs w:val="20"/>
-        </w:rPr>
-        <w:t xml:space="preserve">Hours Per Week: </w:t>
-      </w:r>
-      <w:r>
-        <w:rPr>
-          <w:rFonts w:ascii="Aptos" w:hAnsi="Aptos"/>
-          <w:sz w:val="20"/>
-          <w:szCs w:val="20"/>
-        </w:rPr>
-        <w:t>{{hoursPerWeek}}</w:t>
+          <w:rFonts w:ascii="Aptos" w:hAnsi="Aptos" w:cstheme="minorHAnsi"/>
+          <w:b/>
+          <w:bCs/>
+          <w:sz w:val="20"/>
+          <w:szCs w:val="20"/>
+        </w:rPr>
+        <w:t>Hours</w:t>
+      </w:r>
+      <w:r>
+        <w:rPr>
+          <w:rFonts w:ascii="Aptos" w:hAnsi="Aptos" w:cstheme="minorHAnsi"/>
+          <w:b/>
+          <w:bCs/>
+          <w:sz w:val="20"/>
+          <w:szCs w:val="20"/>
+        </w:rPr>
+        <w:t xml:space="preserve"> Per Week</w:t>
+      </w:r>
+      <w:r>
+        <w:rPr>
+          <w:rFonts w:ascii="Aptos" w:hAnsi="Aptos" w:cstheme="minorHAnsi"/>
+          <w:b/>
+          <w:bCs/>
+          <w:sz w:val="20"/>
+          <w:szCs w:val="20"/>
+        </w:rPr>
+        <w:t>:</w:t>
+      </w:r>
+      <w:r>
+        <w:rPr>
+          <w:rFonts w:ascii="Aptos" w:hAnsi="Aptos" w:cstheme="minorHAnsi"/>
+          <w:b/>
+          <w:bCs/>
+          <w:sz w:val="20"/>
+          <w:szCs w:val="20"/>
+        </w:rPr>
+        <w:tab/>
+      </w:r>
+      <w:r>
+        <w:rPr>
+          <w:rFonts w:ascii="Aptos" w:hAnsi="Aptos" w:cstheme="minorHAnsi"/>
+          <w:b/>
+          <w:bCs/>
+          <w:sz w:val="20"/>
+          <w:szCs w:val="20"/>
+        </w:rPr>
+        <w:tab/>
+      </w:r>
+      <w:r>
+        <w:rPr>
+          <w:rFonts w:ascii="Aptos" w:hAnsi="Aptos" w:cstheme="minorHAnsi"/>
+          <w:sz w:val="20"/>
+          <w:szCs w:val="20"/>
+          <w:lang w:val="en-US"/>
+        </w:rPr>
+        <w:t>{{</w:t>
+      </w:r>
+      <w:proofErr w:type="spellStart"/>
+      <w:r>
+        <w:rPr>
+          <w:rFonts w:ascii="Aptos" w:hAnsi="Aptos" w:cstheme="minorHAnsi"/>
+          <w:sz w:val="20"/>
+          <w:szCs w:val="20"/>
+          <w:lang w:val="en-US"/>
+        </w:rPr>
+        <w:t>hoursPerWeek</w:t>
+      </w:r>
+      <w:proofErr w:type="spellEnd"/>
+      <w:r>
+        <w:rPr>
+          <w:rFonts w:ascii="Aptos" w:hAnsi="Aptos" w:cstheme="minorHAnsi"/>
+          <w:sz w:val="20"/>
+          <w:szCs w:val="20"/>
+          <w:lang w:val="en-US"/>
+        </w:rPr>
+        <w:t>}}</w:t>
+      </w:r>
+      <w:r>
+        <w:rPr>
+          <w:rFonts w:ascii="Aptos" w:hAnsi="Aptos" w:cstheme="minorHAnsi"/>
+          <w:sz w:val="20"/>
+          <w:szCs w:val="20"/>
+        </w:rPr>
+        <w:tab/>
+      </w:r>
+      <w:r>
+        <w:rPr>
+          <w:rFonts w:ascii="Aptos" w:hAnsi="Aptos" w:cstheme="minorHAnsi"/>
+          <w:b/>
+          <w:bCs/>
+          <w:sz w:val="20"/>
+          <w:szCs w:val="20"/>
+        </w:rPr>
+        <w:tab/>
+      </w:r>
+      <w:r>
+        <w:rPr>
+          <w:rFonts w:ascii="Aptos" w:hAnsi="Aptos" w:cstheme="minorHAnsi"/>
+          <w:b/>
+          <w:bCs/>
+          <w:sz w:val="20"/>
+          <w:szCs w:val="20"/>
+        </w:rPr>
+        <w:tab/>
+      </w:r>
+      <w:r>
+        <w:rPr>
+          <w:rFonts w:ascii="Aptos" w:hAnsi="Aptos" w:cstheme="minorHAnsi"/>
+          <w:b/>
+          <w:bCs/>
+          <w:sz w:val="20"/>
+          <w:szCs w:val="20"/>
+        </w:rPr>
+        <w:tab/>
       </w:r>
     </w:p>
     <w:p>
@@ -923,19 +1241,62 @@
       </w:pPr>
       <w:r>
         <w:rPr>
-          <w:rFonts w:ascii="Aptos" w:hAnsi="Aptos"/>
-          <w:sz w:val="20"/>
-          <w:szCs w:val="20"/>
-        </w:rPr>
-        <w:t xml:space="preserve">Requested Time Off: </w:t>
-      </w:r>
-      <w:r>
-        <w:rPr>
-          <w:rFonts w:ascii="Aptos" w:hAnsi="Aptos"/>
-          <w:sz w:val="20"/>
-          <w:szCs w:val="20"/>
-        </w:rPr>
-        <w:t>{{requestedTimeOff}}</w:t>
+          <w:rFonts w:ascii="Aptos" w:hAnsi="Aptos" w:cstheme="minorHAnsi"/>
+          <w:b/>
+          <w:bCs/>
+          <w:sz w:val="20"/>
+          <w:szCs w:val="20"/>
+        </w:rPr>
+        <w:t>Requested Time Off:</w:t>
+      </w:r>
+      <w:r>
+        <w:rPr>
+          <w:rFonts w:ascii="Aptos" w:hAnsi="Aptos" w:cstheme="minorHAnsi"/>
+          <w:b/>
+          <w:bCs/>
+          <w:sz w:val="20"/>
+          <w:szCs w:val="20"/>
+        </w:rPr>
+        <w:tab/>
+      </w:r>
+      <w:r>
+        <w:rPr>
+          <w:rFonts w:ascii="Aptos" w:hAnsi="Aptos" w:cstheme="minorHAnsi"/>
+          <w:b/>
+          <w:bCs/>
+          <w:sz w:val="20"/>
+          <w:szCs w:val="20"/>
+        </w:rPr>
+        <w:tab/>
+      </w:r>
+      <w:r>
+        <w:rPr>
+          <w:rFonts w:ascii="Aptos" w:hAnsi="Aptos" w:cstheme="minorHAnsi"/>
+          <w:sz w:val="20"/>
+          <w:szCs w:val="20"/>
+          <w:lang w:val="en-US"/>
+        </w:rPr>
+        <w:t>{{</w:t>
+      </w:r>
+      <w:proofErr w:type="spellStart"/>
+      <w:r>
+        <w:rPr>
+          <w:rFonts w:ascii="Aptos" w:hAnsi="Aptos" w:cstheme="minorHAnsi"/>
+          <w:sz w:val="20"/>
+          <w:szCs w:val="20"/>
+          <w:lang w:val="en-US"/>
+        </w:rPr>
+        <w:t>requestedTimeOff</w:t>
+      </w:r>
+      <w:proofErr w:type="spellEnd"/>
+      <w:r>
+        <w:rPr>
+          <w:rFonts w:ascii="Aptos" w:hAnsi="Aptos" w:cstheme="minorHAnsi"/>
+          <w:sz w:val="20"/>
+          <w:szCs w:val="20"/>
+          <w:lang w:val="en-US"/>
+        </w:rPr>
+        <w:t>}}</w:t>
       </w:r>
     </w:p>
     <w:p>
@@ -961,19 +1322,62 @@
       </w:pPr>
       <w:r>
         <w:rPr>
-          <w:rFonts w:ascii="Aptos" w:hAnsi="Aptos"/>
-          <w:sz w:val="20"/>
-          <w:szCs w:val="20"/>
-        </w:rPr>
-        <w:t xml:space="preserve">Extension Bonus: </w:t>
-      </w:r>
-      <w:r>
-        <w:rPr>
-          <w:rFonts w:ascii="Aptos" w:hAnsi="Aptos"/>
-          <w:sz w:val="20"/>
-          <w:szCs w:val="20"/>
-        </w:rPr>
-        <w:t>{{extensionBonus}}</w:t>
+          <w:rFonts w:ascii="Aptos" w:hAnsi="Aptos" w:cstheme="minorHAnsi"/>
+          <w:b/>
+          <w:bCs/>
+          <w:sz w:val="20"/>
+          <w:szCs w:val="20"/>
+        </w:rPr>
+        <w:t>Extension Bonus</w:t>
+      </w:r>
+      <w:r>
+        <w:rPr>
+          <w:rFonts w:ascii="Aptos" w:hAnsi="Aptos" w:cstheme="minorHAnsi"/>
+          <w:b/>
+          <w:bCs/>
+          <w:sz w:val="20"/>
+          <w:szCs w:val="20"/>
+        </w:rPr>
+        <w:tab/>
+      </w:r>
+      <w:r>
+        <w:rPr>
+          <w:rFonts w:ascii="Aptos" w:hAnsi="Aptos" w:cstheme="minorHAnsi"/>
+          <w:b/>
+          <w:bCs/>
+          <w:sz w:val="20"/>
+          <w:szCs w:val="20"/>
+        </w:rPr>
+        <w:tab/>
+      </w:r>
+      <w:r>
+        <w:rPr>
+          <w:rFonts w:ascii="Aptos" w:hAnsi="Aptos" w:cstheme="minorHAnsi"/>
+          <w:sz w:val="20"/>
+          <w:szCs w:val="20"/>
+          <w:lang w:val="en-US"/>
+        </w:rPr>
+        <w:t>{{</w:t>
+      </w:r>
+      <w:proofErr w:type="spellStart"/>
+      <w:r>
+        <w:rPr>
+          <w:rFonts w:ascii="Aptos" w:hAnsi="Aptos" w:cstheme="minorHAnsi"/>
+          <w:sz w:val="20"/>
+          <w:szCs w:val="20"/>
+          <w:lang w:val="en-US"/>
+        </w:rPr>
+        <w:t>extensionBonus</w:t>
+      </w:r>
+      <w:proofErr w:type="spellEnd"/>
+      <w:r>
+        <w:rPr>
+          <w:rFonts w:ascii="Aptos" w:hAnsi="Aptos" w:cstheme="minorHAnsi"/>
+          <w:sz w:val="20"/>
+          <w:szCs w:val="20"/>
+          <w:lang w:val="en-US"/>
+        </w:rPr>
+        <w:t>}}</w:t>
       </w:r>
     </w:p>
     <w:p>
@@ -1024,19 +1428,62 @@
       </w:pPr>
       <w:r>
         <w:rPr>
-          <w:rFonts w:ascii="Aptos" w:hAnsi="Aptos"/>
-          <w:sz w:val="20"/>
-          <w:szCs w:val="20"/>
-        </w:rPr>
-        <w:t xml:space="preserve">Gross Weekly: </w:t>
-      </w:r>
-      <w:r>
-        <w:rPr>
-          <w:rFonts w:ascii="Aptos" w:hAnsi="Aptos"/>
-          <w:sz w:val="20"/>
-          <w:szCs w:val="20"/>
-        </w:rPr>
-        <w:t>{{weeklyGross}}</w:t>
+          <w:rFonts w:ascii="Aptos" w:hAnsi="Aptos" w:cstheme="minorHAnsi"/>
+          <w:b/>
+          <w:bCs/>
+          <w:sz w:val="20"/>
+          <w:szCs w:val="20"/>
+        </w:rPr>
+        <w:t>Gross Weekly:</w:t>
+      </w:r>
+      <w:r>
+        <w:rPr>
+          <w:rFonts w:ascii="Aptos" w:hAnsi="Aptos" w:cstheme="minorHAnsi"/>
+          <w:b/>
+          <w:bCs/>
+          <w:sz w:val="20"/>
+          <w:szCs w:val="20"/>
+        </w:rPr>
+        <w:tab/>
+      </w:r>
+      <w:r>
+        <w:rPr>
+          <w:rFonts w:ascii="Aptos" w:hAnsi="Aptos" w:cstheme="minorHAnsi"/>
+          <w:b/>
+          <w:bCs/>
+          <w:sz w:val="20"/>
+          <w:szCs w:val="20"/>
+        </w:rPr>
+        <w:tab/>
+      </w:r>
+      <w:r>
+        <w:rPr>
+          <w:rFonts w:ascii="Aptos" w:hAnsi="Aptos" w:cstheme="minorHAnsi"/>
+          <w:sz w:val="20"/>
+          <w:szCs w:val="20"/>
+          <w:lang w:val="en-US"/>
+        </w:rPr>
+        <w:t>{{</w:t>
+      </w:r>
+      <w:proofErr w:type="spellStart"/>
+      <w:r>
+        <w:rPr>
+          <w:rFonts w:ascii="Aptos" w:hAnsi="Aptos" w:cstheme="minorHAnsi"/>
+          <w:sz w:val="20"/>
+          <w:szCs w:val="20"/>
+          <w:lang w:val="en-US"/>
+        </w:rPr>
+        <w:t>weeklyGross</w:t>
+      </w:r>
+      <w:proofErr w:type="spellEnd"/>
+      <w:r>
+        <w:rPr>
+          <w:rFonts w:ascii="Aptos" w:hAnsi="Aptos" w:cstheme="minorHAnsi"/>
+          <w:sz w:val="20"/>
+          <w:szCs w:val="20"/>
+          <w:lang w:val="en-US"/>
+        </w:rPr>
+        <w:t>}}</w:t>
       </w:r>
     </w:p>
     <w:p>
@@ -1062,19 +1509,62 @@
       </w:pPr>
       <w:r>
         <w:rPr>
-          <w:rFonts w:ascii="Aptos" w:hAnsi="Aptos"/>
-          <w:sz w:val="20"/>
-          <w:szCs w:val="20"/>
-        </w:rPr>
-        <w:t xml:space="preserve">Taxable: </w:t>
-      </w:r>
-      <w:r>
-        <w:rPr>
-          <w:rFonts w:ascii="Aptos" w:hAnsi="Aptos"/>
-          <w:sz w:val="20"/>
-          <w:szCs w:val="20"/>
-        </w:rPr>
-        <w:t>{{taxableHourly}}</w:t>
+          <w:rFonts w:ascii="Aptos" w:hAnsi="Aptos" w:cstheme="minorHAnsi"/>
+          <w:b/>
+          <w:bCs/>
+          <w:sz w:val="20"/>
+          <w:szCs w:val="20"/>
+        </w:rPr>
+        <w:t>Taxable:</w:t>
+      </w:r>
+      <w:r>
+        <w:rPr>
+          <w:rFonts w:ascii="Aptos" w:hAnsi="Aptos" w:cstheme="minorHAnsi"/>
+          <w:b/>
+          <w:bCs/>
+          <w:sz w:val="20"/>
+          <w:szCs w:val="20"/>
+        </w:rPr>
+        <w:tab/>
+      </w:r>
+      <w:r>
+        <w:rPr>
+          <w:rFonts w:ascii="Aptos" w:hAnsi="Aptos" w:cstheme="minorHAnsi"/>
+          <w:b/>
+          <w:bCs/>
+          <w:sz w:val="20"/>
+          <w:szCs w:val="20"/>
+        </w:rPr>
+        <w:tab/>
+      </w:r>
+      <w:r>
+        <w:rPr>
+          <w:rFonts w:ascii="Aptos" w:hAnsi="Aptos" w:cstheme="minorHAnsi"/>
+          <w:sz w:val="20"/>
+          <w:szCs w:val="20"/>
+          <w:lang w:val="en-US"/>
+        </w:rPr>
+        <w:t>{{</w:t>
+      </w:r>
+      <w:proofErr w:type="spellStart"/>
+      <w:r>
+        <w:rPr>
+          <w:rFonts w:ascii="Aptos" w:hAnsi="Aptos" w:cstheme="minorHAnsi"/>
+          <w:sz w:val="20"/>
+          <w:szCs w:val="20"/>
+          <w:lang w:val="en-US"/>
+        </w:rPr>
+        <w:t>taxableHourly</w:t>
+      </w:r>
+      <w:proofErr w:type="spellEnd"/>
+      <w:r>
+        <w:rPr>
+          <w:rFonts w:ascii="Aptos" w:hAnsi="Aptos" w:cstheme="minorHAnsi"/>
+          <w:sz w:val="20"/>
+          <w:szCs w:val="20"/>
+          <w:lang w:val="en-US"/>
+        </w:rPr>
+        <w:t>}}</w:t>
       </w:r>
     </w:p>
     <w:p>
@@ -1100,27 +1590,60 @@
       </w:pPr>
       <w:r>
         <w:rPr>
-          <w:rFonts w:ascii="Aptos" w:hAnsi="Aptos"/>
-          <w:sz w:val="20"/>
-          <w:szCs w:val="20"/>
-        </w:rPr>
-        <w:t xml:space="preserve">Non-Taxable Stipend: </w:t>
-      </w:r>
-      <w:r>
-        <w:rPr>
-          <w:rFonts w:ascii="Aptos" w:hAnsi="Aptos"/>
-          <w:sz w:val="20"/>
-          <w:szCs w:val="20"/>
-        </w:rPr>
-        <w:t>{{stipend}}</w:t>
-      </w:r>
-      <w:r>
-        <w:rPr>
-          <w:rFonts w:ascii="Aptos" w:hAnsi="Aptos"/>
-          <w:sz w:val="20"/>
-          <w:szCs w:val="20"/>
-        </w:rPr>
-        <w:t xml:space="preserve"> (Housing + Meals and Incidentals)</w:t>
+          <w:rFonts w:ascii="Aptos" w:hAnsi="Aptos" w:cstheme="minorHAnsi"/>
+          <w:b/>
+          <w:bCs/>
+          <w:sz w:val="20"/>
+          <w:szCs w:val="20"/>
+        </w:rPr>
+        <w:t>Non-Taxable Stipend</w:t>
+      </w:r>
+      <w:r>
+        <w:rPr>
+          <w:rFonts w:ascii="Aptos" w:hAnsi="Aptos" w:cstheme="minorHAnsi"/>
+          <w:b/>
+          <w:bCs/>
+          <w:sz w:val="20"/>
+          <w:szCs w:val="20"/>
+        </w:rPr>
+        <w:t>:</w:t>
+      </w:r>
+      <w:r>
+        <w:rPr>
+          <w:rFonts w:ascii="Aptos" w:hAnsi="Aptos" w:cstheme="minorHAnsi"/>
+          <w:b/>
+          <w:bCs/>
+          <w:sz w:val="20"/>
+          <w:szCs w:val="20"/>
+        </w:rPr>
+        <w:tab/>
+      </w:r>
+      <w:r>
+        <w:rPr>
+          <w:rFonts w:ascii="Aptos" w:hAnsi="Aptos" w:cstheme="minorHAnsi"/>
+          <w:b/>
+          <w:bCs/>
+          <w:sz w:val="20"/>
+          <w:szCs w:val="20"/>
+        </w:rPr>
+        <w:tab/>
+      </w:r>
+      <w:r>
+        <w:rPr>
+          <w:rFonts w:ascii="Aptos" w:hAnsi="Aptos" w:cstheme="minorHAnsi"/>
+          <w:sz w:val="20"/>
+          <w:szCs w:val="20"/>
+          <w:lang w:val="en-US"/>
+        </w:rPr>
+        <w:t xml:space="preserve">{{stipend}} </w:t>
+      </w:r>
+      <w:r>
+        <w:rPr>
+          <w:rFonts w:ascii="Aptos" w:hAnsi="Aptos" w:cstheme="minorHAnsi"/>
+          <w:sz w:val="20"/>
+          <w:szCs w:val="20"/>
+        </w:rPr>
+        <w:t>(Housing + Meals and Incidentals)</w:t>
       </w:r>
     </w:p>
     <w:p>
@@ -1144,27 +1667,58 @@
       </w:pPr>
       <w:r>
         <w:rPr>
-          <w:rFonts w:ascii="Aptos" w:hAnsi="Aptos"/>
-          <w:sz w:val="20"/>
-          <w:szCs w:val="20"/>
-        </w:rPr>
-        <w:t xml:space="preserve">Charge Rate: </w:t>
-      </w:r>
-      <w:r>
-        <w:rPr>
-          <w:rFonts w:ascii="Aptos" w:hAnsi="Aptos"/>
-          <w:sz w:val="20"/>
-          <w:szCs w:val="20"/>
-        </w:rPr>
-        <w:t>{{chargeRate}}</w:t>
-      </w:r>
-      <w:r>
-        <w:rPr>
-          <w:rFonts w:ascii="Aptos" w:hAnsi="Aptos"/>
-          <w:sz w:val="20"/>
-          <w:szCs w:val="20"/>
-        </w:rPr>
-        <w:t xml:space="preserve"> taxed</w:t>
+          <w:rFonts w:ascii="Aptos" w:hAnsi="Aptos" w:cstheme="minorHAnsi"/>
+          <w:b/>
+          <w:bCs/>
+          <w:sz w:val="20"/>
+          <w:szCs w:val="20"/>
+        </w:rPr>
+        <w:t>Charge Rate:</w:t>
+      </w:r>
+      <w:r>
+        <w:rPr>
+          <w:rFonts w:ascii="Aptos" w:hAnsi="Aptos" w:cstheme="minorHAnsi"/>
+          <w:sz w:val="20"/>
+          <w:szCs w:val="20"/>
+        </w:rPr>
+        <w:tab/>
+      </w:r>
+      <w:r>
+        <w:rPr>
+          <w:rFonts w:ascii="Aptos" w:hAnsi="Aptos" w:cstheme="minorHAnsi"/>
+          <w:sz w:val="20"/>
+          <w:szCs w:val="20"/>
+        </w:rPr>
+        <w:tab/>
+      </w:r>
+      <w:r>
+        <w:rPr>
+          <w:rFonts w:ascii="Aptos" w:hAnsi="Aptos" w:cstheme="minorHAnsi"/>
+          <w:sz w:val="20"/>
+          <w:szCs w:val="20"/>
+          <w:lang w:val="en-US"/>
+        </w:rPr>
+        <w:t>{{</w:t>
+      </w:r>
+      <w:proofErr w:type="spellStart"/>
+      <w:r>
+        <w:rPr>
+          <w:rFonts w:ascii="Aptos" w:hAnsi="Aptos" w:cstheme="minorHAnsi"/>
+          <w:sz w:val="20"/>
+          <w:szCs w:val="20"/>
+          <w:lang w:val="en-US"/>
+        </w:rPr>
+        <w:t>chargeRate</w:t>
+      </w:r>
+      <w:proofErr w:type="spellEnd"/>
+      <w:r>
+        <w:rPr>
+          <w:rFonts w:ascii="Aptos" w:hAnsi="Aptos" w:cstheme="minorHAnsi"/>
+          <w:sz w:val="20"/>
+          <w:szCs w:val="20"/>
+          <w:lang w:val="en-US"/>
+        </w:rPr>
+        <w:t>}} taxed</w:t>
       </w:r>
     </w:p>
     <w:p>
@@ -1188,27 +1742,58 @@
       </w:pPr>
       <w:r>
         <w:rPr>
-          <w:rFonts w:ascii="Aptos" w:hAnsi="Aptos"/>
-          <w:sz w:val="20"/>
-          <w:szCs w:val="20"/>
-        </w:rPr>
-        <w:t xml:space="preserve">On Call Rate: </w:t>
-      </w:r>
-      <w:r>
-        <w:rPr>
-          <w:rFonts w:ascii="Aptos" w:hAnsi="Aptos"/>
-          <w:sz w:val="20"/>
-          <w:szCs w:val="20"/>
-        </w:rPr>
-        <w:t>{{onCallPay}}</w:t>
-      </w:r>
-      <w:r>
-        <w:rPr>
-          <w:rFonts w:ascii="Aptos" w:hAnsi="Aptos"/>
-          <w:sz w:val="20"/>
-          <w:szCs w:val="20"/>
-        </w:rPr>
-        <w:t xml:space="preserve"> taxed</w:t>
+          <w:rFonts w:ascii="Aptos" w:hAnsi="Aptos" w:cstheme="minorHAnsi"/>
+          <w:b/>
+          <w:bCs/>
+          <w:sz w:val="20"/>
+          <w:szCs w:val="20"/>
+        </w:rPr>
+        <w:t>On Call Rate:</w:t>
+      </w:r>
+      <w:r>
+        <w:rPr>
+          <w:rFonts w:ascii="Aptos" w:hAnsi="Aptos" w:cstheme="minorHAnsi"/>
+          <w:sz w:val="20"/>
+          <w:szCs w:val="20"/>
+        </w:rPr>
+        <w:tab/>
+      </w:r>
+      <w:r>
+        <w:rPr>
+          <w:rFonts w:ascii="Aptos" w:hAnsi="Aptos" w:cstheme="minorHAnsi"/>
+          <w:sz w:val="20"/>
+          <w:szCs w:val="20"/>
+        </w:rPr>
+        <w:tab/>
+      </w:r>
+      <w:r>
+        <w:rPr>
+          <w:rFonts w:ascii="Aptos" w:hAnsi="Aptos" w:cstheme="minorHAnsi"/>
+          <w:sz w:val="20"/>
+          <w:szCs w:val="20"/>
+          <w:lang w:val="en-US"/>
+        </w:rPr>
+        <w:t>{{</w:t>
+      </w:r>
+      <w:proofErr w:type="spellStart"/>
+      <w:r>
+        <w:rPr>
+          <w:rFonts w:ascii="Aptos" w:hAnsi="Aptos" w:cstheme="minorHAnsi"/>
+          <w:sz w:val="20"/>
+          <w:szCs w:val="20"/>
+          <w:lang w:val="en-US"/>
+        </w:rPr>
+        <w:t>onCallPay</w:t>
+      </w:r>
+      <w:proofErr w:type="spellEnd"/>
+      <w:r>
+        <w:rPr>
+          <w:rFonts w:ascii="Aptos" w:hAnsi="Aptos" w:cstheme="minorHAnsi"/>
+          <w:sz w:val="20"/>
+          <w:szCs w:val="20"/>
+          <w:lang w:val="en-US"/>
+        </w:rPr>
+        <w:t>}} taxed</w:t>
       </w:r>
     </w:p>
     <w:p>
@@ -1232,27 +1817,58 @@
       </w:pPr>
       <w:r>
         <w:rPr>
-          <w:rFonts w:ascii="Aptos" w:hAnsi="Aptos"/>
-          <w:sz w:val="20"/>
-          <w:szCs w:val="20"/>
-        </w:rPr>
-        <w:t xml:space="preserve">Call Back Rate: </w:t>
-      </w:r>
-      <w:r>
-        <w:rPr>
-          <w:rFonts w:ascii="Aptos" w:hAnsi="Aptos"/>
-          <w:sz w:val="20"/>
-          <w:szCs w:val="20"/>
-        </w:rPr>
-        <w:t>{{callBackRate}}</w:t>
-      </w:r>
-      <w:r>
-        <w:rPr>
-          <w:rFonts w:ascii="Aptos" w:hAnsi="Aptos"/>
-          <w:sz w:val="20"/>
-          <w:szCs w:val="20"/>
-        </w:rPr>
-        <w:t xml:space="preserve"> taxed</w:t>
+          <w:rFonts w:ascii="Aptos" w:hAnsi="Aptos" w:cstheme="minorHAnsi"/>
+          <w:b/>
+          <w:bCs/>
+          <w:sz w:val="20"/>
+          <w:szCs w:val="20"/>
+        </w:rPr>
+        <w:t>Call Back Rate:</w:t>
+      </w:r>
+      <w:r>
+        <w:rPr>
+          <w:rFonts w:ascii="Aptos" w:hAnsi="Aptos" w:cstheme="minorHAnsi"/>
+          <w:sz w:val="20"/>
+          <w:szCs w:val="20"/>
+        </w:rPr>
+        <w:tab/>
+      </w:r>
+      <w:r>
+        <w:rPr>
+          <w:rFonts w:ascii="Aptos" w:hAnsi="Aptos" w:cstheme="minorHAnsi"/>
+          <w:sz w:val="20"/>
+          <w:szCs w:val="20"/>
+        </w:rPr>
+        <w:tab/>
+      </w:r>
+      <w:r>
+        <w:rPr>
+          <w:rFonts w:ascii="Aptos" w:hAnsi="Aptos" w:cstheme="minorHAnsi"/>
+          <w:sz w:val="20"/>
+          <w:szCs w:val="20"/>
+          <w:lang w:val="en-US"/>
+        </w:rPr>
+        <w:t>{{</w:t>
+      </w:r>
+      <w:proofErr w:type="spellStart"/>
+      <w:r>
+        <w:rPr>
+          <w:rFonts w:ascii="Aptos" w:hAnsi="Aptos" w:cstheme="minorHAnsi"/>
+          <w:sz w:val="20"/>
+          <w:szCs w:val="20"/>
+          <w:lang w:val="en-US"/>
+        </w:rPr>
+        <w:t>callBackRate</w:t>
+      </w:r>
+      <w:proofErr w:type="spellEnd"/>
+      <w:r>
+        <w:rPr>
+          <w:rFonts w:ascii="Aptos" w:hAnsi="Aptos" w:cstheme="minorHAnsi"/>
+          <w:sz w:val="20"/>
+          <w:szCs w:val="20"/>
+          <w:lang w:val="en-US"/>
+        </w:rPr>
+        <w:t>}} taxed</w:t>
       </w:r>
     </w:p>
     <w:p>
@@ -1276,27 +1892,62 @@
       </w:pPr>
       <w:r>
         <w:rPr>
-          <w:rFonts w:ascii="Aptos" w:hAnsi="Aptos"/>
-          <w:sz w:val="20"/>
-          <w:szCs w:val="20"/>
-        </w:rPr>
-        <w:t xml:space="preserve">Overtime Rate: </w:t>
-      </w:r>
-      <w:r>
-        <w:rPr>
-          <w:rFonts w:ascii="Aptos" w:hAnsi="Aptos"/>
-          <w:sz w:val="20"/>
-          <w:szCs w:val="20"/>
-        </w:rPr>
-        <w:t>{{overtimeRate}}</w:t>
-      </w:r>
-      <w:r>
-        <w:rPr>
-          <w:rFonts w:ascii="Aptos" w:hAnsi="Aptos"/>
-          <w:sz w:val="20"/>
-          <w:szCs w:val="20"/>
-        </w:rPr>
-        <w:t xml:space="preserve"> taxed</w:t>
+          <w:rFonts w:ascii="Aptos" w:hAnsi="Aptos" w:cstheme="minorHAnsi"/>
+          <w:b/>
+          <w:bCs/>
+          <w:sz w:val="20"/>
+          <w:szCs w:val="20"/>
+        </w:rPr>
+        <w:t>Overtime Rate:</w:t>
+      </w:r>
+      <w:r>
+        <w:rPr>
+          <w:rFonts w:ascii="Aptos" w:hAnsi="Aptos" w:cstheme="minorHAnsi"/>
+          <w:b/>
+          <w:bCs/>
+          <w:sz w:val="20"/>
+          <w:szCs w:val="20"/>
+        </w:rPr>
+        <w:tab/>
+      </w:r>
+      <w:r>
+        <w:rPr>
+          <w:rFonts w:ascii="Aptos" w:hAnsi="Aptos" w:cstheme="minorHAnsi"/>
+          <w:b/>
+          <w:bCs/>
+          <w:sz w:val="20"/>
+          <w:szCs w:val="20"/>
+        </w:rPr>
+        <w:tab/>
+      </w:r>
+      <w:r>
+        <w:rPr>
+          <w:rFonts w:ascii="Aptos" w:hAnsi="Aptos" w:cstheme="minorHAnsi"/>
+          <w:sz w:val="20"/>
+          <w:szCs w:val="20"/>
+          <w:lang w:val="en-US"/>
+        </w:rPr>
+        <w:t>{{</w:t>
+      </w:r>
+      <w:proofErr w:type="spellStart"/>
+      <w:r>
+        <w:rPr>
+          <w:rFonts w:ascii="Aptos" w:hAnsi="Aptos" w:cstheme="minorHAnsi"/>
+          <w:sz w:val="20"/>
+          <w:szCs w:val="20"/>
+          <w:lang w:val="en-US"/>
+        </w:rPr>
+        <w:t>overtimeRate</w:t>
+      </w:r>
+      <w:proofErr w:type="spellEnd"/>
+      <w:r>
+        <w:rPr>
+          <w:rFonts w:ascii="Aptos" w:hAnsi="Aptos" w:cstheme="minorHAnsi"/>
+          <w:sz w:val="20"/>
+          <w:szCs w:val="20"/>
+          <w:lang w:val="en-US"/>
+        </w:rPr>
+        <w:t>}} taxed</w:t>
       </w:r>
     </w:p>
     <w:p>
@@ -1322,27 +1973,62 @@
       </w:pPr>
       <w:r>
         <w:rPr>
-          <w:rFonts w:ascii="Aptos" w:hAnsi="Aptos"/>
-          <w:sz w:val="20"/>
-          <w:szCs w:val="20"/>
-        </w:rPr>
-        <w:t xml:space="preserve">Holiday Rate: </w:t>
-      </w:r>
-      <w:r>
-        <w:rPr>
-          <w:rFonts w:ascii="Aptos" w:hAnsi="Aptos"/>
-          <w:sz w:val="20"/>
-          <w:szCs w:val="20"/>
-        </w:rPr>
-        <w:t>{{holidayRate}}</w:t>
-      </w:r>
-      <w:r>
-        <w:rPr>
-          <w:rFonts w:ascii="Aptos" w:hAnsi="Aptos"/>
-          <w:sz w:val="20"/>
-          <w:szCs w:val="20"/>
-        </w:rPr>
-        <w:t xml:space="preserve"> taxed</w:t>
+          <w:rFonts w:ascii="Aptos" w:hAnsi="Aptos" w:cstheme="minorHAnsi"/>
+          <w:b/>
+          <w:bCs/>
+          <w:sz w:val="20"/>
+          <w:szCs w:val="20"/>
+        </w:rPr>
+        <w:t>Holiday Rate:</w:t>
+      </w:r>
+      <w:r>
+        <w:rPr>
+          <w:rFonts w:ascii="Aptos" w:hAnsi="Aptos" w:cstheme="minorHAnsi"/>
+          <w:b/>
+          <w:bCs/>
+          <w:sz w:val="20"/>
+          <w:szCs w:val="20"/>
+        </w:rPr>
+        <w:tab/>
+      </w:r>
+      <w:r>
+        <w:rPr>
+          <w:rFonts w:ascii="Aptos" w:hAnsi="Aptos" w:cstheme="minorHAnsi"/>
+          <w:b/>
+          <w:bCs/>
+          <w:sz w:val="20"/>
+          <w:szCs w:val="20"/>
+        </w:rPr>
+        <w:tab/>
+      </w:r>
+      <w:r>
+        <w:rPr>
+          <w:rFonts w:ascii="Aptos" w:hAnsi="Aptos" w:cstheme="minorHAnsi"/>
+          <w:sz w:val="20"/>
+          <w:szCs w:val="20"/>
+          <w:lang w:val="en-US"/>
+        </w:rPr>
+        <w:t>{{</w:t>
+      </w:r>
+      <w:proofErr w:type="spellStart"/>
+      <w:r>
+        <w:rPr>
+          <w:rFonts w:ascii="Aptos" w:hAnsi="Aptos" w:cstheme="minorHAnsi"/>
+          <w:sz w:val="20"/>
+          <w:szCs w:val="20"/>
+          <w:lang w:val="en-US"/>
+        </w:rPr>
+        <w:t>holidayRate</w:t>
+      </w:r>
+      <w:proofErr w:type="spellEnd"/>
+      <w:r>
+        <w:rPr>
+          <w:rFonts w:ascii="Aptos" w:hAnsi="Aptos" w:cstheme="minorHAnsi"/>
+          <w:sz w:val="20"/>
+          <w:szCs w:val="20"/>
+          <w:lang w:val="en-US"/>
+        </w:rPr>
+        <w:t>}} taxed</w:t>
       </w:r>
     </w:p>
     <w:p>
@@ -1388,18 +2074,81 @@
       <w:r>
         <w:rPr>
           <w:rFonts w:ascii="Aptos" w:hAnsi="Aptos"/>
-          <w:sz w:val="20"/>
-          <w:szCs w:val="20"/>
-        </w:rPr>
-        <w:t xml:space="preserve">Facility Name: </w:t>
-      </w:r>
-      <w:r>
-        <w:rPr>
-          <w:rFonts w:ascii="Aptos" w:hAnsi="Aptos"/>
-          <w:sz w:val="20"/>
-          <w:szCs w:val="20"/>
-        </w:rPr>
-        <w:t>{{facilityName}}</w:t>
+          <w:b/>
+          <w:bCs/>
+          <w:sz w:val="20"/>
+          <w:szCs w:val="20"/>
+        </w:rPr>
+        <w:t>Facility Name:</w:t>
+      </w:r>
+      <w:r>
+        <w:rPr>
+          <w:rFonts w:ascii="Aptos" w:hAnsi="Aptos"/>
+          <w:b/>
+          <w:bCs/>
+          <w:sz w:val="20"/>
+          <w:szCs w:val="20"/>
+        </w:rPr>
+        <w:tab/>
+      </w:r>
+      <w:r>
+        <w:rPr>
+          <w:rFonts w:ascii="Aptos" w:hAnsi="Aptos"/>
+          <w:b/>
+          <w:bCs/>
+          <w:sz w:val="20"/>
+          <w:szCs w:val="20"/>
+        </w:rPr>
+        <w:tab/>
+      </w:r>
+      <w:r>
+        <w:rPr>
+          <w:rFonts w:ascii="Aptos" w:hAnsi="Aptos"/>
+          <w:b/>
+          <w:bCs/>
+          <w:sz w:val="20"/>
+          <w:szCs w:val="20"/>
+        </w:rPr>
+        <w:tab/>
+      </w:r>
+      <w:r>
+        <w:rPr>
+          <w:rFonts w:ascii="Aptos" w:hAnsi="Aptos"/>
+          <w:b/>
+          <w:bCs/>
+          <w:sz w:val="20"/>
+          <w:szCs w:val="20"/>
+        </w:rPr>
+        <w:tab/>
+      </w:r>
+      <w:r>
+        <w:rPr>
+          <w:rFonts w:ascii="Aptos" w:hAnsi="Aptos"/>
+          <w:sz w:val="20"/>
+          <w:szCs w:val="20"/>
+          <w:lang w:val="en-US"/>
+        </w:rPr>
+        <w:t>{{</w:t>
+      </w:r>
+      <w:proofErr w:type="spellStart"/>
+      <w:r>
+        <w:rPr>
+          <w:rFonts w:ascii="Aptos" w:hAnsi="Aptos"/>
+          <w:sz w:val="20"/>
+          <w:szCs w:val="20"/>
+          <w:lang w:val="en-US"/>
+        </w:rPr>
+        <w:t>facilityName</w:t>
+      </w:r>
+      <w:proofErr w:type="spellEnd"/>
+      <w:r>
+        <w:rPr>
+          <w:rFonts w:ascii="Aptos" w:hAnsi="Aptos"/>
+          <w:sz w:val="20"/>
+          <w:szCs w:val="20"/>
+          <w:lang w:val="en-US"/>
+        </w:rPr>
+        <w:t>}}</w:t>
       </w:r>
     </w:p>
     <w:p>
@@ -1422,18 +2171,81 @@
       <w:r>
         <w:rPr>
           <w:rFonts w:ascii="Aptos" w:hAnsi="Aptos"/>
-          <w:sz w:val="20"/>
-          <w:szCs w:val="20"/>
-        </w:rPr>
-        <w:t xml:space="preserve">Address: </w:t>
-      </w:r>
-      <w:r>
-        <w:rPr>
-          <w:rFonts w:ascii="Aptos" w:hAnsi="Aptos"/>
-          <w:sz w:val="20"/>
-          <w:szCs w:val="20"/>
-        </w:rPr>
-        <w:t>{{facilityAddress}}</w:t>
+          <w:b/>
+          <w:bCs/>
+          <w:sz w:val="20"/>
+          <w:szCs w:val="20"/>
+        </w:rPr>
+        <w:t>Address:</w:t>
+      </w:r>
+      <w:r>
+        <w:rPr>
+          <w:rFonts w:ascii="Aptos" w:hAnsi="Aptos"/>
+          <w:b/>
+          <w:bCs/>
+          <w:sz w:val="20"/>
+          <w:szCs w:val="20"/>
+        </w:rPr>
+        <w:tab/>
+      </w:r>
+      <w:r>
+        <w:rPr>
+          <w:rFonts w:ascii="Aptos" w:hAnsi="Aptos"/>
+          <w:b/>
+          <w:bCs/>
+          <w:sz w:val="20"/>
+          <w:szCs w:val="20"/>
+        </w:rPr>
+        <w:tab/>
+      </w:r>
+      <w:r>
+        <w:rPr>
+          <w:rFonts w:ascii="Aptos" w:hAnsi="Aptos"/>
+          <w:b/>
+          <w:bCs/>
+          <w:sz w:val="20"/>
+          <w:szCs w:val="20"/>
+        </w:rPr>
+        <w:tab/>
+      </w:r>
+      <w:r>
+        <w:rPr>
+          <w:rFonts w:ascii="Aptos" w:hAnsi="Aptos"/>
+          <w:b/>
+          <w:bCs/>
+          <w:sz w:val="20"/>
+          <w:szCs w:val="20"/>
+        </w:rPr>
+        <w:tab/>
+      </w:r>
+      <w:r>
+        <w:rPr>
+          <w:rFonts w:ascii="Aptos" w:hAnsi="Aptos"/>
+          <w:sz w:val="20"/>
+          <w:szCs w:val="20"/>
+          <w:lang w:val="en-US"/>
+        </w:rPr>
+        <w:t>{{</w:t>
+      </w:r>
+      <w:proofErr w:type="spellStart"/>
+      <w:r>
+        <w:rPr>
+          <w:rFonts w:ascii="Aptos" w:hAnsi="Aptos"/>
+          <w:sz w:val="20"/>
+          <w:szCs w:val="20"/>
+          <w:lang w:val="en-US"/>
+        </w:rPr>
+        <w:t>facilityAddress</w:t>
+      </w:r>
+      <w:proofErr w:type="spellEnd"/>
+      <w:r>
+        <w:rPr>
+          <w:rFonts w:ascii="Aptos" w:hAnsi="Aptos"/>
+          <w:sz w:val="20"/>
+          <w:szCs w:val="20"/>
+          <w:lang w:val="en-US"/>
+        </w:rPr>
+        <w:t>}}</w:t>
       </w:r>
     </w:p>
     <w:p>
@@ -1452,18 +2264,81 @@
       <w:r>
         <w:rPr>
           <w:rFonts w:ascii="Aptos" w:hAnsi="Aptos"/>
-          <w:sz w:val="20"/>
-          <w:szCs w:val="20"/>
-        </w:rPr>
-        <w:t xml:space="preserve">City, State, Zip: </w:t>
-      </w:r>
-      <w:r>
-        <w:rPr>
-          <w:rFonts w:ascii="Aptos" w:hAnsi="Aptos"/>
-          <w:sz w:val="20"/>
-          <w:szCs w:val="20"/>
-        </w:rPr>
-        <w:t>{{facilityCityStateZip}}</w:t>
+          <w:b/>
+          <w:bCs/>
+          <w:sz w:val="20"/>
+          <w:szCs w:val="20"/>
+        </w:rPr>
+        <w:t>City, State, Zip:</w:t>
+      </w:r>
+      <w:r>
+        <w:rPr>
+          <w:rFonts w:ascii="Aptos" w:hAnsi="Aptos"/>
+          <w:b/>
+          <w:bCs/>
+          <w:sz w:val="20"/>
+          <w:szCs w:val="20"/>
+        </w:rPr>
+        <w:tab/>
+      </w:r>
+      <w:r>
+        <w:rPr>
+          <w:rFonts w:ascii="Aptos" w:hAnsi="Aptos"/>
+          <w:b/>
+          <w:bCs/>
+          <w:sz w:val="20"/>
+          <w:szCs w:val="20"/>
+        </w:rPr>
+        <w:tab/>
+      </w:r>
+      <w:r>
+        <w:rPr>
+          <w:rFonts w:ascii="Aptos" w:hAnsi="Aptos"/>
+          <w:b/>
+          <w:bCs/>
+          <w:sz w:val="20"/>
+          <w:szCs w:val="20"/>
+        </w:rPr>
+        <w:tab/>
+      </w:r>
+      <w:r>
+        <w:rPr>
+          <w:rFonts w:ascii="Aptos" w:hAnsi="Aptos"/>
+          <w:b/>
+          <w:bCs/>
+          <w:sz w:val="20"/>
+          <w:szCs w:val="20"/>
+        </w:rPr>
+        <w:tab/>
+      </w:r>
+      <w:r>
+        <w:rPr>
+          <w:rFonts w:ascii="Aptos" w:hAnsi="Aptos"/>
+          <w:sz w:val="20"/>
+          <w:szCs w:val="20"/>
+          <w:lang w:val="en-US"/>
+        </w:rPr>
+        <w:t>{{</w:t>
+      </w:r>
+      <w:proofErr w:type="spellStart"/>
+      <w:r>
+        <w:rPr>
+          <w:rFonts w:ascii="Aptos" w:hAnsi="Aptos"/>
+          <w:sz w:val="20"/>
+          <w:szCs w:val="20"/>
+          <w:lang w:val="en-US"/>
+        </w:rPr>
+        <w:t>facilityCityStateZip</w:t>
+      </w:r>
+      <w:proofErr w:type="spellEnd"/>
+      <w:r>
+        <w:rPr>
+          <w:rFonts w:ascii="Aptos" w:hAnsi="Aptos"/>
+          <w:sz w:val="20"/>
+          <w:szCs w:val="20"/>
+          <w:lang w:val="en-US"/>
+        </w:rPr>
+        <w:t>}}</w:t>
       </w:r>
     </w:p>
     <w:p>
@@ -1775,18 +2650,71 @@
       <w:r>
         <w:rPr>
           <w:rFonts w:ascii="Aptos" w:hAnsi="Aptos"/>
-          <w:sz w:val="20"/>
-          <w:szCs w:val="20"/>
-        </w:rPr>
-        <w:t xml:space="preserve">Pay Schedule: Compensation earned is paid </w:t>
-      </w:r>
-      <w:r>
-        <w:rPr>
-          <w:rFonts w:ascii="Aptos" w:hAnsi="Aptos"/>
-          <w:sz w:val="20"/>
-          <w:szCs w:val="20"/>
-        </w:rPr>
-        <w:t>{{payScheduleFrequency}}</w:t>
+          <w:b/>
+          <w:bCs/>
+          <w:sz w:val="20"/>
+          <w:szCs w:val="20"/>
+          <w:u w:val="single"/>
+        </w:rPr>
+        <w:t>Pay Schedule:</w:t>
+      </w:r>
+      <w:r>
+        <w:rPr>
+          <w:rFonts w:ascii="Aptos" w:hAnsi="Aptos"/>
+          <w:sz w:val="20"/>
+          <w:szCs w:val="20"/>
+        </w:rPr>
+        <w:t xml:space="preserve"> </w:t>
+      </w:r>
+      <w:r>
+        <w:rPr>
+          <w:rFonts w:ascii="Aptos" w:hAnsi="Aptos"/>
+          <w:sz w:val="20"/>
+          <w:szCs w:val="20"/>
+        </w:rPr>
+        <w:t xml:space="preserve"> </w:t>
+      </w:r>
+      <w:r>
+        <w:rPr>
+          <w:rFonts w:ascii="Aptos" w:hAnsi="Aptos"/>
+          <w:sz w:val="20"/>
+          <w:szCs w:val="20"/>
+        </w:rPr>
+        <w:t xml:space="preserve">Compensation earned is paid </w:t>
+      </w:r>
+      <w:r>
+        <w:rPr>
+          <w:rFonts w:ascii="Aptos" w:hAnsi="Aptos"/>
+          <w:sz w:val="20"/>
+          <w:szCs w:val="20"/>
+        </w:rPr>
+        <w:t>{{</w:t>
+      </w:r>
+      <w:proofErr w:type="spellStart"/>
+      <w:r>
+        <w:rPr>
+          <w:rFonts w:ascii="Aptos" w:hAnsi="Aptos"/>
+          <w:sz w:val="20"/>
+          <w:szCs w:val="20"/>
+        </w:rPr>
+        <w:t>payScheduleFrequency</w:t>
+      </w:r>
+      <w:proofErr w:type="spellEnd"/>
+      <w:r>
+        <w:rPr>
+          <w:rFonts w:ascii="Aptos" w:hAnsi="Aptos"/>
+          <w:sz w:val="20"/>
+          <w:szCs w:val="20"/>
+        </w:rPr>
+        <w:t>}}</w:t>
+      </w:r>
+      <w:r>
+        <w:rPr>
+          <w:rFonts w:ascii="Aptos" w:hAnsi="Aptos"/>
+          <w:sz w:val="20"/>
+          <w:szCs w:val="20"/>
+        </w:rPr>
+        <w:t>.</w:t>
       </w:r>
     </w:p>
     <w:p>
@@ -5837,6 +6765,7 @@
   <w:style w:type="character" w:default="1" w:styleId="DefaultParagraphFont">
     <w:name w:val="Default Paragraph Font"/>
     <w:uiPriority w:val="1"/>
+    <w:semiHidden/>
     <w:unhideWhenUsed/>
   </w:style>
   <w:style w:type="table" w:default="1" w:styleId="TableNormal">
@@ -6440,6 +7369,23 @@
 </file>
 
 <file path=customXml/item1.xml><?xml version="1.0" encoding="utf-8"?>
+<p:properties xmlns:p="http://schemas.microsoft.com/office/2006/metadata/properties" xmlns:xsi="http://www.w3.org/2001/XMLSchema-instance" xmlns:pc="http://schemas.microsoft.com/office/infopath/2007/PartnerControls">
+  <documentManagement>
+    <_activity xmlns="2169045f-e607-4534-844d-fccd73ad8fdf" xsi:nil="true"/>
+  </documentManagement>
+</p:properties>
+</file>
+
+<file path=customXml/item2.xml><?xml version="1.0" encoding="utf-8"?>
+<?mso-contentType ?>
+<FormTemplates xmlns="http://schemas.microsoft.com/sharepoint/v3/contenttype/forms">
+  <Display>DocumentLibraryForm</Display>
+  <Edit>DocumentLibraryForm</Edit>
+  <New>DocumentLibraryForm</New>
+</FormTemplates>
+</file>
+
+<file path=customXml/item3.xml><?xml version="1.0" encoding="utf-8"?>
 <ct:contentTypeSchema xmlns:ct="http://schemas.microsoft.com/office/2006/metadata/contentType" xmlns:ma="http://schemas.microsoft.com/office/2006/metadata/properties/metaAttributes" ct:_="" ma:_="" ma:contentTypeName="Document" ma:contentTypeID="0x010100F3365D30B7BA604CBF10B41D4887A9AD" ma:contentTypeVersion="9" ma:contentTypeDescription="Create a new document." ma:contentTypeScope="" ma:versionID="0039b0dff1a773dffb7957b278b56eef">
   <xsd:schema xmlns:xsd="http://www.w3.org/2001/XMLSchema" xmlns:xs="http://www.w3.org/2001/XMLSchema" xmlns:p="http://schemas.microsoft.com/office/2006/metadata/properties" xmlns:ns3="2169045f-e607-4534-844d-fccd73ad8fdf" targetNamespace="http://schemas.microsoft.com/office/2006/metadata/properties" ma:root="true" ma:fieldsID="2a088f01f83aaa5fd78ab1ee0be9b847" ns3:_="">
     <xsd:import namespace="2169045f-e607-4534-844d-fccd73ad8fdf"/>
@@ -6615,24 +7561,25 @@
 </ct:contentTypeSchema>
 </file>
 
-<file path=customXml/item2.xml><?xml version="1.0" encoding="utf-8"?>
-<?mso-contentType ?>
-<FormTemplates xmlns="http://schemas.microsoft.com/sharepoint/v3/contenttype/forms">
-  <Display>DocumentLibraryForm</Display>
-  <Edit>DocumentLibraryForm</Edit>
-  <New>DocumentLibraryForm</New>
-</FormTemplates>
+<file path=customXml/itemProps1.xml><?xml version="1.0" encoding="utf-8"?>
+<ds:datastoreItem xmlns:ds="http://schemas.openxmlformats.org/officeDocument/2006/customXml" ds:itemID="{D6D565AC-DA50-4173-8B25-C149C30CFA36}">
+  <ds:schemaRefs>
+    <ds:schemaRef ds:uri="http://schemas.microsoft.com/office/2006/metadata/properties"/>
+    <ds:schemaRef ds:uri="http://schemas.microsoft.com/office/infopath/2007/PartnerControls"/>
+    <ds:schemaRef ds:uri="2169045f-e607-4534-844d-fccd73ad8fdf"/>
+  </ds:schemaRefs>
+</ds:datastoreItem>
 </file>
 
-<file path=customXml/item3.xml><?xml version="1.0" encoding="utf-8"?>
-<p:properties xmlns:p="http://schemas.microsoft.com/office/2006/metadata/properties" xmlns:xsi="http://www.w3.org/2001/XMLSchema-instance" xmlns:pc="http://schemas.microsoft.com/office/infopath/2007/PartnerControls">
-  <documentManagement>
-    <_activity xmlns="2169045f-e607-4534-844d-fccd73ad8fdf" xsi:nil="true"/>
-  </documentManagement>
-</p:properties>
+<file path=customXml/itemProps2.xml><?xml version="1.0" encoding="utf-8"?>
+<ds:datastoreItem xmlns:ds="http://schemas.openxmlformats.org/officeDocument/2006/customXml" ds:itemID="{59393987-0C0B-4D6F-A718-E27F3D924901}">
+  <ds:schemaRefs>
+    <ds:schemaRef ds:uri="http://schemas.microsoft.com/sharepoint/v3/contenttype/forms"/>
+  </ds:schemaRefs>
+</ds:datastoreItem>
 </file>
 
-<file path=customXml/itemProps1.xml><?xml version="1.0" encoding="utf-8"?>
+<file path=customXml/itemProps3.xml><?xml version="1.0" encoding="utf-8"?>
 <ds:datastoreItem xmlns:ds="http://schemas.openxmlformats.org/officeDocument/2006/customXml" ds:itemID="{F096A583-D72D-443E-A7C0-05E146F2C94E}">
   <ds:schemaRefs>
     <ds:schemaRef ds:uri="http://schemas.microsoft.com/office/2006/metadata/contentType"/>
@@ -6648,22 +7595,4 @@
     <ds:schemaRef ds:uri="http://schemas.microsoft.com/internal/obd"/>
   </ds:schemaRefs>
 </ds:datastoreItem>
-</file>
-
-<file path=customXml/itemProps2.xml><?xml version="1.0" encoding="utf-8"?>
-<ds:datastoreItem xmlns:ds="http://schemas.openxmlformats.org/officeDocument/2006/customXml" ds:itemID="{59393987-0C0B-4D6F-A718-E27F3D924901}">
-  <ds:schemaRefs>
-    <ds:schemaRef ds:uri="http://schemas.microsoft.com/sharepoint/v3/contenttype/forms"/>
-  </ds:schemaRefs>
-</ds:datastoreItem>
-</file>
-
-<file path=customXml/itemProps3.xml><?xml version="1.0" encoding="utf-8"?>
-<ds:datastoreItem xmlns:ds="http://schemas.openxmlformats.org/officeDocument/2006/customXml" ds:itemID="{D6D565AC-DA50-4173-8B25-C149C30CFA36}">
-  <ds:schemaRefs>
-    <ds:schemaRef ds:uri="http://schemas.microsoft.com/office/2006/metadata/properties"/>
-    <ds:schemaRef ds:uri="http://schemas.microsoft.com/office/infopath/2007/PartnerControls"/>
-    <ds:schemaRef ds:uri="2169045f-e607-4534-844d-fccd73ad8fdf"/>
-  </ds:schemaRefs>
-</ds:datastoreItem>
 </file>
</xml_diff>

<commit_message>
Correct extension bonus placement
</commit_message>
<xml_diff>
--- a/templates/contract-template.docx
+++ b/templates/contract-template.docx
@@ -108,10 +108,13 @@
           <w:szCs w:val="20"/>
           <w:lang w:val="en-US" w:eastAsia="en-US"/>
         </w:rPr>
-        <w:t>{{</w:t>
-      </w:r>
-      <w:proofErr w:type="spellStart"/>
-      <w:r>
+        <w:t>{{contractorName}}</w:t>
+      </w:r>
+    </w:p>
+    <w:p>
+      <w:pPr>
+        <w:pStyle w:val="Heading2"/>
+        <w:spacing w:before="0" w:after="0" w:line="240" w:lineRule="auto"/>
         <w:rPr>
           <w:rFonts w:ascii="Aptos" w:eastAsiaTheme="minorHAnsi" w:hAnsi="Aptos" w:cstheme="minorBidi"/>
           <w:b w:val="0"/>
@@ -121,9 +124,7 @@
           <w:szCs w:val="20"/>
           <w:lang w:val="en-US" w:eastAsia="en-US"/>
         </w:rPr>
-        <w:t>contractorName</w:t>
-      </w:r>
-      <w:proofErr w:type="spellEnd"/>
+      </w:pPr>
       <w:r>
         <w:rPr>
           <w:rFonts w:ascii="Aptos" w:eastAsiaTheme="minorHAnsi" w:hAnsi="Aptos" w:cstheme="minorBidi"/>
@@ -134,7 +135,7 @@
           <w:szCs w:val="20"/>
           <w:lang w:val="en-US" w:eastAsia="en-US"/>
         </w:rPr>
-        <w:t>}}</w:t>
+        <w:t>{{contractorAddress1}}</w:t>
       </w:r>
     </w:p>
     <w:p>
@@ -161,7 +162,7 @@
           <w:szCs w:val="20"/>
           <w:lang w:val="en-US" w:eastAsia="en-US"/>
         </w:rPr>
-        <w:t>{{contractorAddress1}}</w:t>
+        <w:t>{{contractorAddress2}}</w:t>
       </w:r>
     </w:p>
     <w:p>
@@ -178,7 +179,11 @@
           <w:lang w:val="en-US" w:eastAsia="en-US"/>
         </w:rPr>
       </w:pPr>
-      <w:r>
+    </w:p>
+    <w:p>
+      <w:pPr>
+        <w:pStyle w:val="Heading2"/>
+        <w:spacing w:before="0" w:after="0" w:line="240" w:lineRule="auto"/>
         <w:rPr>
           <w:rFonts w:ascii="Aptos" w:eastAsiaTheme="minorHAnsi" w:hAnsi="Aptos" w:cstheme="minorBidi"/>
           <w:b w:val="0"/>
@@ -188,13 +193,8 @@
           <w:szCs w:val="20"/>
           <w:lang w:val="en-US" w:eastAsia="en-US"/>
         </w:rPr>
-        <w:t>{{contractorAddress2}}</w:t>
-      </w:r>
-    </w:p>
-    <w:p>
-      <w:pPr>
-        <w:pStyle w:val="Heading2"/>
-        <w:spacing w:before="0" w:after="0" w:line="240" w:lineRule="auto"/>
+      </w:pPr>
+      <w:r>
         <w:rPr>
           <w:rFonts w:ascii="Aptos" w:eastAsiaTheme="minorHAnsi" w:hAnsi="Aptos" w:cstheme="minorBidi"/>
           <w:b w:val="0"/>
@@ -204,59 +204,7 @@
           <w:szCs w:val="20"/>
           <w:lang w:val="en-US" w:eastAsia="en-US"/>
         </w:rPr>
-      </w:pPr>
-    </w:p>
-    <w:p>
-      <w:pPr>
-        <w:pStyle w:val="Heading2"/>
-        <w:spacing w:before="0" w:after="0" w:line="240" w:lineRule="auto"/>
-        <w:rPr>
-          <w:rFonts w:ascii="Aptos" w:eastAsiaTheme="minorHAnsi" w:hAnsi="Aptos" w:cstheme="minorBidi"/>
-          <w:b w:val="0"/>
-          <w:bCs w:val="0"/>
-          <w:iCs w:val="0"/>
-          <w:sz w:val="20"/>
-          <w:szCs w:val="20"/>
-          <w:lang w:val="en-US" w:eastAsia="en-US"/>
-        </w:rPr>
-      </w:pPr>
-      <w:r>
-        <w:rPr>
-          <w:rFonts w:ascii="Aptos" w:eastAsiaTheme="minorHAnsi" w:hAnsi="Aptos" w:cstheme="minorBidi"/>
-          <w:b w:val="0"/>
-          <w:bCs w:val="0"/>
-          <w:iCs w:val="0"/>
-          <w:sz w:val="20"/>
-          <w:szCs w:val="20"/>
-          <w:lang w:val="en-US" w:eastAsia="en-US"/>
-        </w:rPr>
-        <w:t>{{</w:t>
-      </w:r>
-      <w:proofErr w:type="spellStart"/>
-      <w:r>
-        <w:rPr>
-          <w:rFonts w:ascii="Aptos" w:eastAsiaTheme="minorHAnsi" w:hAnsi="Aptos" w:cstheme="minorBidi"/>
-          <w:b w:val="0"/>
-          <w:bCs w:val="0"/>
-          <w:iCs w:val="0"/>
-          <w:sz w:val="20"/>
-          <w:szCs w:val="20"/>
-          <w:lang w:val="en-US" w:eastAsia="en-US"/>
-        </w:rPr>
-        <w:t>todaysDate</w:t>
-      </w:r>
-      <w:proofErr w:type="spellEnd"/>
-      <w:r>
-        <w:rPr>
-          <w:rFonts w:ascii="Aptos" w:eastAsiaTheme="minorHAnsi" w:hAnsi="Aptos" w:cstheme="minorBidi"/>
-          <w:b w:val="0"/>
-          <w:bCs w:val="0"/>
-          <w:iCs w:val="0"/>
-          <w:sz w:val="20"/>
-          <w:szCs w:val="20"/>
-          <w:lang w:val="en-US" w:eastAsia="en-US"/>
-        </w:rPr>
-        <w:t>}}</w:t>
+        <w:t>{{todaysDate}}</w:t>
       </w:r>
     </w:p>
     <w:p>
@@ -292,25 +240,7 @@
           <w:sz w:val="20"/>
           <w:szCs w:val="20"/>
         </w:rPr>
-        <w:t xml:space="preserve"> {{</w:t>
-      </w:r>
-      <w:proofErr w:type="spellStart"/>
-      <w:r>
-        <w:rPr>
-          <w:rFonts w:ascii="Aptos" w:hAnsi="Aptos"/>
-          <w:sz w:val="20"/>
-          <w:szCs w:val="20"/>
-        </w:rPr>
-        <w:t>contractorFirstName</w:t>
-      </w:r>
-      <w:proofErr w:type="spellEnd"/>
-      <w:r>
-        <w:rPr>
-          <w:rFonts w:ascii="Aptos" w:hAnsi="Aptos"/>
-          <w:sz w:val="20"/>
-          <w:szCs w:val="20"/>
-        </w:rPr>
-        <w:t>}}</w:t>
+        <w:t xml:space="preserve"> {{contractorFirstName}}</w:t>
       </w:r>
       <w:r>
         <w:rPr>
@@ -390,25 +320,7 @@
           <w:sz w:val="20"/>
           <w:szCs w:val="20"/>
         </w:rPr>
-        <w:t>at {{</w:t>
-      </w:r>
-      <w:proofErr w:type="spellStart"/>
-      <w:r>
-        <w:rPr>
-          <w:rFonts w:ascii="Aptos" w:hAnsi="Aptos"/>
-          <w:sz w:val="20"/>
-          <w:szCs w:val="20"/>
-        </w:rPr>
-        <w:t>facilityName</w:t>
-      </w:r>
-      <w:proofErr w:type="spellEnd"/>
-      <w:r>
-        <w:rPr>
-          <w:rFonts w:ascii="Aptos" w:hAnsi="Aptos"/>
-          <w:sz w:val="20"/>
-          <w:szCs w:val="20"/>
-        </w:rPr>
-        <w:t xml:space="preserve">}}. </w:t>
+        <w:t xml:space="preserve">at {{facilityName}}. </w:t>
       </w:r>
       <w:r>
         <w:rPr>
@@ -672,27 +584,7 @@
           <w:szCs w:val="20"/>
           <w:lang w:val="en-US"/>
         </w:rPr>
-        <w:t>{{</w:t>
-      </w:r>
-      <w:proofErr w:type="spellStart"/>
-      <w:r>
-        <w:rPr>
-          <w:rFonts w:ascii="Aptos" w:hAnsi="Aptos"/>
-          <w:sz w:val="20"/>
-          <w:szCs w:val="20"/>
-          <w:lang w:val="en-US"/>
-        </w:rPr>
-        <w:t>jobTitle</w:t>
-      </w:r>
-      <w:proofErr w:type="spellEnd"/>
-      <w:r>
-        <w:rPr>
-          <w:rFonts w:ascii="Aptos" w:hAnsi="Aptos"/>
-          <w:sz w:val="20"/>
-          <w:szCs w:val="20"/>
-          <w:lang w:val="en-US"/>
-        </w:rPr>
-        <w:t>}}</w:t>
+        <w:t>{{jobTitle}}</w:t>
       </w:r>
     </w:p>
     <w:p>
@@ -753,27 +645,7 @@
           <w:szCs w:val="20"/>
           <w:lang w:val="en-US"/>
         </w:rPr>
-        <w:t>{{</w:t>
-      </w:r>
-      <w:proofErr w:type="spellStart"/>
-      <w:r>
-        <w:rPr>
-          <w:rFonts w:ascii="Aptos" w:hAnsi="Aptos" w:cstheme="minorHAnsi"/>
-          <w:sz w:val="20"/>
-          <w:szCs w:val="20"/>
-          <w:lang w:val="en-US"/>
-        </w:rPr>
-        <w:t>startDate</w:t>
-      </w:r>
-      <w:proofErr w:type="spellEnd"/>
-      <w:r>
-        <w:rPr>
-          <w:rFonts w:ascii="Aptos" w:hAnsi="Aptos" w:cstheme="minorHAnsi"/>
-          <w:sz w:val="20"/>
-          <w:szCs w:val="20"/>
-          <w:lang w:val="en-US"/>
-        </w:rPr>
-        <w:t>}}</w:t>
+        <w:t>{{startDate}}</w:t>
       </w:r>
     </w:p>
     <w:p>
@@ -834,27 +706,7 @@
           <w:szCs w:val="20"/>
           <w:lang w:val="en-US"/>
         </w:rPr>
-        <w:t>{{</w:t>
-      </w:r>
-      <w:proofErr w:type="spellStart"/>
-      <w:r>
-        <w:rPr>
-          <w:rFonts w:ascii="Aptos" w:hAnsi="Aptos" w:cstheme="minorHAnsi"/>
-          <w:sz w:val="20"/>
-          <w:szCs w:val="20"/>
-          <w:lang w:val="en-US"/>
-        </w:rPr>
-        <w:t>endDate</w:t>
-      </w:r>
-      <w:proofErr w:type="spellEnd"/>
-      <w:r>
-        <w:rPr>
-          <w:rFonts w:ascii="Aptos" w:hAnsi="Aptos" w:cstheme="minorHAnsi"/>
-          <w:sz w:val="20"/>
-          <w:szCs w:val="20"/>
-          <w:lang w:val="en-US"/>
-        </w:rPr>
-        <w:t>}}</w:t>
+        <w:t>{{endDate}}</w:t>
       </w:r>
     </w:p>
     <w:p>
@@ -915,27 +767,7 @@
           <w:szCs w:val="20"/>
           <w:lang w:val="en-US"/>
         </w:rPr>
-        <w:t>{{</w:t>
-      </w:r>
-      <w:proofErr w:type="spellStart"/>
-      <w:r>
-        <w:rPr>
-          <w:rFonts w:ascii="Aptos" w:hAnsi="Aptos" w:cstheme="minorHAnsi"/>
-          <w:sz w:val="20"/>
-          <w:szCs w:val="20"/>
-          <w:lang w:val="en-US"/>
-        </w:rPr>
-        <w:t>assignmentWeeks</w:t>
-      </w:r>
-      <w:proofErr w:type="spellEnd"/>
-      <w:r>
-        <w:rPr>
-          <w:rFonts w:ascii="Aptos" w:hAnsi="Aptos" w:cstheme="minorHAnsi"/>
-          <w:sz w:val="20"/>
-          <w:szCs w:val="20"/>
-          <w:lang w:val="en-US"/>
-        </w:rPr>
-        <w:t>}}</w:t>
+        <w:t>{{assignmentWeeks}}</w:t>
       </w:r>
     </w:p>
     <w:p>
@@ -996,27 +828,7 @@
           <w:szCs w:val="20"/>
           <w:lang w:val="en-US"/>
         </w:rPr>
-        <w:t>{{</w:t>
-      </w:r>
-      <w:proofErr w:type="spellStart"/>
-      <w:r>
-        <w:rPr>
-          <w:rFonts w:ascii="Aptos" w:hAnsi="Aptos" w:cstheme="minorHAnsi"/>
-          <w:sz w:val="20"/>
-          <w:szCs w:val="20"/>
-          <w:lang w:val="en-US"/>
-        </w:rPr>
-        <w:t>scheduleLine</w:t>
-      </w:r>
-      <w:proofErr w:type="spellEnd"/>
-      <w:r>
-        <w:rPr>
-          <w:rFonts w:ascii="Aptos" w:hAnsi="Aptos" w:cstheme="minorHAnsi"/>
-          <w:sz w:val="20"/>
-          <w:szCs w:val="20"/>
-          <w:lang w:val="en-US"/>
-        </w:rPr>
-        <w:t>}}</w:t>
+        <w:t>{{scheduleLine}}</w:t>
       </w:r>
     </w:p>
     <w:p>
@@ -1097,27 +909,7 @@
           <w:szCs w:val="20"/>
           <w:lang w:val="en-US"/>
         </w:rPr>
-        <w:t>{{</w:t>
-      </w:r>
-      <w:proofErr w:type="spellStart"/>
-      <w:r>
-        <w:rPr>
-          <w:rFonts w:ascii="Aptos" w:hAnsi="Aptos" w:cstheme="minorHAnsi"/>
-          <w:sz w:val="20"/>
-          <w:szCs w:val="20"/>
-          <w:lang w:val="en-US"/>
-        </w:rPr>
-        <w:t>hoursPerWeek</w:t>
-      </w:r>
-      <w:proofErr w:type="spellEnd"/>
-      <w:r>
-        <w:rPr>
-          <w:rFonts w:ascii="Aptos" w:hAnsi="Aptos" w:cstheme="minorHAnsi"/>
-          <w:sz w:val="20"/>
-          <w:szCs w:val="20"/>
-          <w:lang w:val="en-US"/>
-        </w:rPr>
-        <w:t>}}</w:t>
+        <w:t>{{hoursPerWeek}}</w:t>
       </w:r>
       <w:r>
         <w:rPr>
@@ -1276,27 +1068,32 @@
           <w:szCs w:val="20"/>
           <w:lang w:val="en-US"/>
         </w:rPr>
-        <w:t>{{</w:t>
-      </w:r>
-      <w:proofErr w:type="spellStart"/>
-      <w:r>
-        <w:rPr>
-          <w:rFonts w:ascii="Aptos" w:hAnsi="Aptos" w:cstheme="minorHAnsi"/>
-          <w:sz w:val="20"/>
-          <w:szCs w:val="20"/>
-          <w:lang w:val="en-US"/>
-        </w:rPr>
-        <w:t>requestedTimeOff</w:t>
-      </w:r>
-      <w:proofErr w:type="spellEnd"/>
-      <w:r>
-        <w:rPr>
-          <w:rFonts w:ascii="Aptos" w:hAnsi="Aptos" w:cstheme="minorHAnsi"/>
-          <w:sz w:val="20"/>
-          <w:szCs w:val="20"/>
-          <w:lang w:val="en-US"/>
-        </w:rPr>
-        <w:t>}}</w:t>
+        <w:t>{{requestedTimeOff}}</w:t>
+      </w:r>
+    </w:p>
+    <w:p>
+      <w:pPr>
+        <w:spacing w:after="0" w:line="240" w:lineRule="auto"/>
+        <w:jc w:val="both"/>
+        <w:rPr>
+          <w:rFonts w:ascii="Aptos" w:hAnsi="Aptos"/>
+          <w:b/>
+          <w:bCs/>
+          <w:sz w:val="20"/>
+          <w:szCs w:val="20"/>
+          <w:u w:val="single"/>
+        </w:rPr>
+      </w:pPr>
+      <w:r>
+        <w:rPr>
+          <w:rFonts w:ascii="Aptos" w:hAnsi="Aptos"/>
+          <w:b/>
+          <w:bCs/>
+          <w:sz w:val="20"/>
+          <w:szCs w:val="20"/>
+          <w:u w:val="single"/>
+        </w:rPr>
+        <w:t>Compensation</w:t>
       </w:r>
     </w:p>
     <w:p>
@@ -1309,7 +1106,7 @@
         <w:tabs>
           <w:tab w:val="left" w:pos="3960"/>
         </w:tabs>
-        <w:spacing w:line="240" w:lineRule="auto"/>
+        <w:spacing w:before="120" w:line="240" w:lineRule="auto"/>
         <w:ind w:left="540" w:hanging="180"/>
         <w:jc w:val="both"/>
         <w:rPr>
@@ -1328,7 +1125,7 @@
           <w:sz w:val="20"/>
           <w:szCs w:val="20"/>
         </w:rPr>
-        <w:t>Extension Bonus</w:t>
+        <w:t>Gross Weekly:</w:t>
       </w:r>
       <w:r>
         <w:rPr>
@@ -1357,9 +1154,60 @@
           <w:szCs w:val="20"/>
           <w:lang w:val="en-US"/>
         </w:rPr>
-        <w:t>{{</w:t>
-      </w:r>
-      <w:proofErr w:type="spellStart"/>
+        <w:t>{{weeklyGross}}</w:t>
+      </w:r>
+    </w:p>
+    <w:p>
+      <w:pPr>
+        <w:pStyle w:val="ListParagraph"/>
+        <w:numPr>
+          <w:ilvl w:val="1"/>
+          <w:numId w:val="5"/>
+        </w:numPr>
+        <w:tabs>
+          <w:tab w:val="left" w:pos="3960"/>
+        </w:tabs>
+        <w:spacing w:line="240" w:lineRule="auto"/>
+        <w:ind w:left="900" w:hanging="270"/>
+        <w:jc w:val="both"/>
+        <w:rPr>
+          <w:rFonts w:ascii="Aptos" w:hAnsi="Aptos" w:cstheme="minorHAnsi"/>
+          <w:b/>
+          <w:bCs/>
+          <w:sz w:val="20"/>
+          <w:szCs w:val="20"/>
+        </w:rPr>
+      </w:pPr>
+      <w:r>
+        <w:rPr>
+          <w:rFonts w:ascii="Aptos" w:hAnsi="Aptos" w:cstheme="minorHAnsi"/>
+          <w:b/>
+          <w:bCs/>
+          <w:sz w:val="20"/>
+          <w:szCs w:val="20"/>
+        </w:rPr>
+        <w:t>Taxable:</w:t>
+      </w:r>
+      <w:r>
+        <w:rPr>
+          <w:rFonts w:ascii="Aptos" w:hAnsi="Aptos" w:cstheme="minorHAnsi"/>
+          <w:b/>
+          <w:bCs/>
+          <w:sz w:val="20"/>
+          <w:szCs w:val="20"/>
+        </w:rPr>
+        <w:tab/>
+      </w:r>
+      <w:r>
+        <w:rPr>
+          <w:rFonts w:ascii="Aptos" w:hAnsi="Aptos" w:cstheme="minorHAnsi"/>
+          <w:b/>
+          <w:bCs/>
+          <w:sz w:val="20"/>
+          <w:szCs w:val="20"/>
+        </w:rPr>
+        <w:tab/>
+      </w:r>
       <w:r>
         <w:rPr>
           <w:rFonts w:ascii="Aptos" w:hAnsi="Aptos" w:cstheme="minorHAnsi"/>
@@ -1367,9 +1215,70 @@
           <w:szCs w:val="20"/>
           <w:lang w:val="en-US"/>
         </w:rPr>
-        <w:t>extensionBonus</w:t>
-      </w:r>
-      <w:proofErr w:type="spellEnd"/>
+        <w:t>{{taxableHourly}}</w:t>
+      </w:r>
+    </w:p>
+    <w:p>
+      <w:pPr>
+        <w:pStyle w:val="ListParagraph"/>
+        <w:numPr>
+          <w:ilvl w:val="1"/>
+          <w:numId w:val="5"/>
+        </w:numPr>
+        <w:tabs>
+          <w:tab w:val="left" w:pos="3960"/>
+        </w:tabs>
+        <w:spacing w:line="240" w:lineRule="auto"/>
+        <w:ind w:left="900" w:hanging="270"/>
+        <w:jc w:val="both"/>
+        <w:rPr>
+          <w:rFonts w:ascii="Aptos" w:hAnsi="Aptos" w:cstheme="minorHAnsi"/>
+          <w:b/>
+          <w:bCs/>
+          <w:sz w:val="20"/>
+          <w:szCs w:val="20"/>
+        </w:rPr>
+      </w:pPr>
+      <w:r>
+        <w:rPr>
+          <w:rFonts w:ascii="Aptos" w:hAnsi="Aptos" w:cstheme="minorHAnsi"/>
+          <w:b/>
+          <w:bCs/>
+          <w:sz w:val="20"/>
+          <w:szCs w:val="20"/>
+        </w:rPr>
+        <w:t>Non-Taxable Stipend</w:t>
+      </w:r>
+      <w:r>
+        <w:rPr>
+          <w:rFonts w:ascii="Aptos" w:hAnsi="Aptos" w:cstheme="minorHAnsi"/>
+          <w:b/>
+          <w:bCs/>
+          <w:sz w:val="20"/>
+          <w:szCs w:val="20"/>
+        </w:rPr>
+        <w:t>:</w:t>
+      </w:r>
+      <w:r>
+        <w:rPr>
+          <w:rFonts w:ascii="Aptos" w:hAnsi="Aptos" w:cstheme="minorHAnsi"/>
+          <w:b/>
+          <w:bCs/>
+          <w:sz w:val="20"/>
+          <w:szCs w:val="20"/>
+        </w:rPr>
+        <w:tab/>
+      </w:r>
+      <w:r>
+        <w:rPr>
+          <w:rFonts w:ascii="Aptos" w:hAnsi="Aptos" w:cstheme="minorHAnsi"/>
+          <w:b/>
+          <w:bCs/>
+          <w:sz w:val="20"/>
+          <w:szCs w:val="20"/>
+        </w:rPr>
+        <w:tab/>
+      </w:r>
       <w:r>
         <w:rPr>
           <w:rFonts w:ascii="Aptos" w:hAnsi="Aptos" w:cstheme="minorHAnsi"/>
@@ -1377,32 +1286,15 @@
           <w:szCs w:val="20"/>
           <w:lang w:val="en-US"/>
         </w:rPr>
-        <w:t>}}</w:t>
-      </w:r>
-    </w:p>
-    <w:p>
-      <w:pPr>
-        <w:spacing w:after="0" w:line="240" w:lineRule="auto"/>
-        <w:jc w:val="both"/>
-        <w:rPr>
-          <w:rFonts w:ascii="Aptos" w:hAnsi="Aptos"/>
-          <w:b/>
-          <w:bCs/>
-          <w:sz w:val="20"/>
-          <w:szCs w:val="20"/>
-          <w:u w:val="single"/>
-        </w:rPr>
-      </w:pPr>
-      <w:r>
-        <w:rPr>
-          <w:rFonts w:ascii="Aptos" w:hAnsi="Aptos"/>
-          <w:b/>
-          <w:bCs/>
-          <w:sz w:val="20"/>
-          <w:szCs w:val="20"/>
-          <w:u w:val="single"/>
-        </w:rPr>
-        <w:t>Compensation</w:t>
+        <w:t xml:space="preserve">{{stipend}} </w:t>
+      </w:r>
+      <w:r>
+        <w:rPr>
+          <w:rFonts w:ascii="Aptos" w:hAnsi="Aptos" w:cstheme="minorHAnsi"/>
+          <w:sz w:val="20"/>
+          <w:szCs w:val="20"/>
+        </w:rPr>
+        <w:t>(Housing + Meals and Incidentals)</w:t>
       </w:r>
     </w:p>
     <w:p>
@@ -1415,32 +1307,28 @@
         <w:tabs>
           <w:tab w:val="left" w:pos="3960"/>
         </w:tabs>
-        <w:spacing w:before="120" w:line="240" w:lineRule="auto"/>
+        <w:spacing w:line="240" w:lineRule="auto"/>
         <w:ind w:left="540" w:hanging="180"/>
         <w:jc w:val="both"/>
         <w:rPr>
           <w:rFonts w:ascii="Aptos" w:hAnsi="Aptos" w:cstheme="minorHAnsi"/>
-          <w:b/>
-          <w:bCs/>
-          <w:sz w:val="20"/>
-          <w:szCs w:val="20"/>
-        </w:rPr>
-      </w:pPr>
-      <w:r>
-        <w:rPr>
-          <w:rFonts w:ascii="Aptos" w:hAnsi="Aptos" w:cstheme="minorHAnsi"/>
-          <w:b/>
-          <w:bCs/>
-          <w:sz w:val="20"/>
-          <w:szCs w:val="20"/>
-        </w:rPr>
-        <w:t>Gross Weekly:</w:t>
-      </w:r>
-      <w:r>
-        <w:rPr>
-          <w:rFonts w:ascii="Aptos" w:hAnsi="Aptos" w:cstheme="minorHAnsi"/>
-          <w:b/>
-          <w:bCs/>
+          <w:sz w:val="20"/>
+          <w:szCs w:val="20"/>
+        </w:rPr>
+      </w:pPr>
+      <w:r>
+        <w:rPr>
+          <w:rFonts w:ascii="Aptos" w:hAnsi="Aptos" w:cstheme="minorHAnsi"/>
+          <w:b/>
+          <w:bCs/>
+          <w:sz w:val="20"/>
+          <w:szCs w:val="20"/>
+        </w:rPr>
+        <w:t>Charge Rate:</w:t>
+      </w:r>
+      <w:r>
+        <w:rPr>
+          <w:rFonts w:ascii="Aptos" w:hAnsi="Aptos" w:cstheme="minorHAnsi"/>
           <w:sz w:val="20"/>
           <w:szCs w:val="20"/>
         </w:rPr>
@@ -1449,8 +1337,6 @@
       <w:r>
         <w:rPr>
           <w:rFonts w:ascii="Aptos" w:hAnsi="Aptos" w:cstheme="minorHAnsi"/>
-          <w:b/>
-          <w:bCs/>
           <w:sz w:val="20"/>
           <w:szCs w:val="20"/>
         </w:rPr>
@@ -1463,187 +1349,7 @@
           <w:szCs w:val="20"/>
           <w:lang w:val="en-US"/>
         </w:rPr>
-        <w:t>{{</w:t>
-      </w:r>
-      <w:proofErr w:type="spellStart"/>
-      <w:r>
-        <w:rPr>
-          <w:rFonts w:ascii="Aptos" w:hAnsi="Aptos" w:cstheme="minorHAnsi"/>
-          <w:sz w:val="20"/>
-          <w:szCs w:val="20"/>
-          <w:lang w:val="en-US"/>
-        </w:rPr>
-        <w:t>weeklyGross</w:t>
-      </w:r>
-      <w:proofErr w:type="spellEnd"/>
-      <w:r>
-        <w:rPr>
-          <w:rFonts w:ascii="Aptos" w:hAnsi="Aptos" w:cstheme="minorHAnsi"/>
-          <w:sz w:val="20"/>
-          <w:szCs w:val="20"/>
-          <w:lang w:val="en-US"/>
-        </w:rPr>
-        <w:t>}}</w:t>
-      </w:r>
-    </w:p>
-    <w:p>
-      <w:pPr>
-        <w:pStyle w:val="ListParagraph"/>
-        <w:numPr>
-          <w:ilvl w:val="1"/>
-          <w:numId w:val="5"/>
-        </w:numPr>
-        <w:tabs>
-          <w:tab w:val="left" w:pos="3960"/>
-        </w:tabs>
-        <w:spacing w:line="240" w:lineRule="auto"/>
-        <w:ind w:left="900" w:hanging="270"/>
-        <w:jc w:val="both"/>
-        <w:rPr>
-          <w:rFonts w:ascii="Aptos" w:hAnsi="Aptos" w:cstheme="minorHAnsi"/>
-          <w:b/>
-          <w:bCs/>
-          <w:sz w:val="20"/>
-          <w:szCs w:val="20"/>
-        </w:rPr>
-      </w:pPr>
-      <w:r>
-        <w:rPr>
-          <w:rFonts w:ascii="Aptos" w:hAnsi="Aptos" w:cstheme="minorHAnsi"/>
-          <w:b/>
-          <w:bCs/>
-          <w:sz w:val="20"/>
-          <w:szCs w:val="20"/>
-        </w:rPr>
-        <w:t>Taxable:</w:t>
-      </w:r>
-      <w:r>
-        <w:rPr>
-          <w:rFonts w:ascii="Aptos" w:hAnsi="Aptos" w:cstheme="minorHAnsi"/>
-          <w:b/>
-          <w:bCs/>
-          <w:sz w:val="20"/>
-          <w:szCs w:val="20"/>
-        </w:rPr>
-        <w:tab/>
-      </w:r>
-      <w:r>
-        <w:rPr>
-          <w:rFonts w:ascii="Aptos" w:hAnsi="Aptos" w:cstheme="minorHAnsi"/>
-          <w:b/>
-          <w:bCs/>
-          <w:sz w:val="20"/>
-          <w:szCs w:val="20"/>
-        </w:rPr>
-        <w:tab/>
-      </w:r>
-      <w:r>
-        <w:rPr>
-          <w:rFonts w:ascii="Aptos" w:hAnsi="Aptos" w:cstheme="minorHAnsi"/>
-          <w:sz w:val="20"/>
-          <w:szCs w:val="20"/>
-          <w:lang w:val="en-US"/>
-        </w:rPr>
-        <w:t>{{</w:t>
-      </w:r>
-      <w:proofErr w:type="spellStart"/>
-      <w:r>
-        <w:rPr>
-          <w:rFonts w:ascii="Aptos" w:hAnsi="Aptos" w:cstheme="minorHAnsi"/>
-          <w:sz w:val="20"/>
-          <w:szCs w:val="20"/>
-          <w:lang w:val="en-US"/>
-        </w:rPr>
-        <w:t>taxableHourly</w:t>
-      </w:r>
-      <w:proofErr w:type="spellEnd"/>
-      <w:r>
-        <w:rPr>
-          <w:rFonts w:ascii="Aptos" w:hAnsi="Aptos" w:cstheme="minorHAnsi"/>
-          <w:sz w:val="20"/>
-          <w:szCs w:val="20"/>
-          <w:lang w:val="en-US"/>
-        </w:rPr>
-        <w:t>}}</w:t>
-      </w:r>
-    </w:p>
-    <w:p>
-      <w:pPr>
-        <w:pStyle w:val="ListParagraph"/>
-        <w:numPr>
-          <w:ilvl w:val="1"/>
-          <w:numId w:val="5"/>
-        </w:numPr>
-        <w:tabs>
-          <w:tab w:val="left" w:pos="3960"/>
-        </w:tabs>
-        <w:spacing w:line="240" w:lineRule="auto"/>
-        <w:ind w:left="900" w:hanging="270"/>
-        <w:jc w:val="both"/>
-        <w:rPr>
-          <w:rFonts w:ascii="Aptos" w:hAnsi="Aptos" w:cstheme="minorHAnsi"/>
-          <w:b/>
-          <w:bCs/>
-          <w:sz w:val="20"/>
-          <w:szCs w:val="20"/>
-        </w:rPr>
-      </w:pPr>
-      <w:r>
-        <w:rPr>
-          <w:rFonts w:ascii="Aptos" w:hAnsi="Aptos" w:cstheme="minorHAnsi"/>
-          <w:b/>
-          <w:bCs/>
-          <w:sz w:val="20"/>
-          <w:szCs w:val="20"/>
-        </w:rPr>
-        <w:t>Non-Taxable Stipend</w:t>
-      </w:r>
-      <w:r>
-        <w:rPr>
-          <w:rFonts w:ascii="Aptos" w:hAnsi="Aptos" w:cstheme="minorHAnsi"/>
-          <w:b/>
-          <w:bCs/>
-          <w:sz w:val="20"/>
-          <w:szCs w:val="20"/>
-        </w:rPr>
-        <w:t>:</w:t>
-      </w:r>
-      <w:r>
-        <w:rPr>
-          <w:rFonts w:ascii="Aptos" w:hAnsi="Aptos" w:cstheme="minorHAnsi"/>
-          <w:b/>
-          <w:bCs/>
-          <w:sz w:val="20"/>
-          <w:szCs w:val="20"/>
-        </w:rPr>
-        <w:tab/>
-      </w:r>
-      <w:r>
-        <w:rPr>
-          <w:rFonts w:ascii="Aptos" w:hAnsi="Aptos" w:cstheme="minorHAnsi"/>
-          <w:b/>
-          <w:bCs/>
-          <w:sz w:val="20"/>
-          <w:szCs w:val="20"/>
-        </w:rPr>
-        <w:tab/>
-      </w:r>
-      <w:r>
-        <w:rPr>
-          <w:rFonts w:ascii="Aptos" w:hAnsi="Aptos" w:cstheme="minorHAnsi"/>
-          <w:sz w:val="20"/>
-          <w:szCs w:val="20"/>
-          <w:lang w:val="en-US"/>
-        </w:rPr>
-        <w:t xml:space="preserve">{{stipend}} </w:t>
-      </w:r>
-      <w:r>
-        <w:rPr>
-          <w:rFonts w:ascii="Aptos" w:hAnsi="Aptos" w:cstheme="minorHAnsi"/>
-          <w:sz w:val="20"/>
-          <w:szCs w:val="20"/>
-        </w:rPr>
-        <w:t>(Housing + Meals and Incidentals)</w:t>
+        <w:t>{{chargeRate}} taxed</w:t>
       </w:r>
     </w:p>
     <w:p>
@@ -1673,7 +1379,7 @@
           <w:sz w:val="20"/>
           <w:szCs w:val="20"/>
         </w:rPr>
-        <w:t>Charge Rate:</w:t>
+        <w:t>On Call Rate:</w:t>
       </w:r>
       <w:r>
         <w:rPr>
@@ -1698,27 +1404,7 @@
           <w:szCs w:val="20"/>
           <w:lang w:val="en-US"/>
         </w:rPr>
-        <w:t>{{</w:t>
-      </w:r>
-      <w:proofErr w:type="spellStart"/>
-      <w:r>
-        <w:rPr>
-          <w:rFonts w:ascii="Aptos" w:hAnsi="Aptos" w:cstheme="minorHAnsi"/>
-          <w:sz w:val="20"/>
-          <w:szCs w:val="20"/>
-          <w:lang w:val="en-US"/>
-        </w:rPr>
-        <w:t>chargeRate</w:t>
-      </w:r>
-      <w:proofErr w:type="spellEnd"/>
-      <w:r>
-        <w:rPr>
-          <w:rFonts w:ascii="Aptos" w:hAnsi="Aptos" w:cstheme="minorHAnsi"/>
-          <w:sz w:val="20"/>
-          <w:szCs w:val="20"/>
-          <w:lang w:val="en-US"/>
-        </w:rPr>
-        <w:t>}} taxed</w:t>
+        <w:t>{{onCallPay}} taxed</w:t>
       </w:r>
     </w:p>
     <w:p>
@@ -1748,7 +1434,7 @@
           <w:sz w:val="20"/>
           <w:szCs w:val="20"/>
         </w:rPr>
-        <w:t>On Call Rate:</w:t>
+        <w:t>Call Back Rate:</w:t>
       </w:r>
       <w:r>
         <w:rPr>
@@ -1773,27 +1459,7 @@
           <w:szCs w:val="20"/>
           <w:lang w:val="en-US"/>
         </w:rPr>
-        <w:t>{{</w:t>
-      </w:r>
-      <w:proofErr w:type="spellStart"/>
-      <w:r>
-        <w:rPr>
-          <w:rFonts w:ascii="Aptos" w:hAnsi="Aptos" w:cstheme="minorHAnsi"/>
-          <w:sz w:val="20"/>
-          <w:szCs w:val="20"/>
-          <w:lang w:val="en-US"/>
-        </w:rPr>
-        <w:t>onCallPay</w:t>
-      </w:r>
-      <w:proofErr w:type="spellEnd"/>
-      <w:r>
-        <w:rPr>
-          <w:rFonts w:ascii="Aptos" w:hAnsi="Aptos" w:cstheme="minorHAnsi"/>
-          <w:sz w:val="20"/>
-          <w:szCs w:val="20"/>
-          <w:lang w:val="en-US"/>
-        </w:rPr>
-        <w:t>}} taxed</w:t>
+        <w:t>{{callBackRate}} taxed</w:t>
       </w:r>
     </w:p>
     <w:p>
@@ -1823,11 +1489,13 @@
           <w:sz w:val="20"/>
           <w:szCs w:val="20"/>
         </w:rPr>
-        <w:t>Call Back Rate:</w:t>
-      </w:r>
-      <w:r>
-        <w:rPr>
-          <w:rFonts w:ascii="Aptos" w:hAnsi="Aptos" w:cstheme="minorHAnsi"/>
+        <w:t>Overtime Rate:</w:t>
+      </w:r>
+      <w:r>
+        <w:rPr>
+          <w:rFonts w:ascii="Aptos" w:hAnsi="Aptos" w:cstheme="minorHAnsi"/>
+          <w:b/>
+          <w:bCs/>
           <w:sz w:val="20"/>
           <w:szCs w:val="20"/>
         </w:rPr>
@@ -1836,6 +1504,8 @@
       <w:r>
         <w:rPr>
           <w:rFonts w:ascii="Aptos" w:hAnsi="Aptos" w:cstheme="minorHAnsi"/>
+          <w:b/>
+          <w:bCs/>
           <w:sz w:val="20"/>
           <w:szCs w:val="20"/>
         </w:rPr>
@@ -1848,106 +1518,7 @@
           <w:szCs w:val="20"/>
           <w:lang w:val="en-US"/>
         </w:rPr>
-        <w:t>{{</w:t>
-      </w:r>
-      <w:proofErr w:type="spellStart"/>
-      <w:r>
-        <w:rPr>
-          <w:rFonts w:ascii="Aptos" w:hAnsi="Aptos" w:cstheme="minorHAnsi"/>
-          <w:sz w:val="20"/>
-          <w:szCs w:val="20"/>
-          <w:lang w:val="en-US"/>
-        </w:rPr>
-        <w:t>callBackRate</w:t>
-      </w:r>
-      <w:proofErr w:type="spellEnd"/>
-      <w:r>
-        <w:rPr>
-          <w:rFonts w:ascii="Aptos" w:hAnsi="Aptos" w:cstheme="minorHAnsi"/>
-          <w:sz w:val="20"/>
-          <w:szCs w:val="20"/>
-          <w:lang w:val="en-US"/>
-        </w:rPr>
-        <w:t>}} taxed</w:t>
-      </w:r>
-    </w:p>
-    <w:p>
-      <w:pPr>
-        <w:pStyle w:val="ListParagraph"/>
-        <w:numPr>
-          <w:ilvl w:val="0"/>
-          <w:numId w:val="5"/>
-        </w:numPr>
-        <w:tabs>
-          <w:tab w:val="left" w:pos="3960"/>
-        </w:tabs>
-        <w:spacing w:line="240" w:lineRule="auto"/>
-        <w:ind w:left="540" w:hanging="180"/>
-        <w:jc w:val="both"/>
-        <w:rPr>
-          <w:rFonts w:ascii="Aptos" w:hAnsi="Aptos" w:cstheme="minorHAnsi"/>
-          <w:sz w:val="20"/>
-          <w:szCs w:val="20"/>
-        </w:rPr>
-      </w:pPr>
-      <w:r>
-        <w:rPr>
-          <w:rFonts w:ascii="Aptos" w:hAnsi="Aptos" w:cstheme="minorHAnsi"/>
-          <w:b/>
-          <w:bCs/>
-          <w:sz w:val="20"/>
-          <w:szCs w:val="20"/>
-        </w:rPr>
-        <w:t>Overtime Rate:</w:t>
-      </w:r>
-      <w:r>
-        <w:rPr>
-          <w:rFonts w:ascii="Aptos" w:hAnsi="Aptos" w:cstheme="minorHAnsi"/>
-          <w:b/>
-          <w:bCs/>
-          <w:sz w:val="20"/>
-          <w:szCs w:val="20"/>
-        </w:rPr>
-        <w:tab/>
-      </w:r>
-      <w:r>
-        <w:rPr>
-          <w:rFonts w:ascii="Aptos" w:hAnsi="Aptos" w:cstheme="minorHAnsi"/>
-          <w:b/>
-          <w:bCs/>
-          <w:sz w:val="20"/>
-          <w:szCs w:val="20"/>
-        </w:rPr>
-        <w:tab/>
-      </w:r>
-      <w:r>
-        <w:rPr>
-          <w:rFonts w:ascii="Aptos" w:hAnsi="Aptos" w:cstheme="minorHAnsi"/>
-          <w:sz w:val="20"/>
-          <w:szCs w:val="20"/>
-          <w:lang w:val="en-US"/>
-        </w:rPr>
-        <w:t>{{</w:t>
-      </w:r>
-      <w:proofErr w:type="spellStart"/>
-      <w:r>
-        <w:rPr>
-          <w:rFonts w:ascii="Aptos" w:hAnsi="Aptos" w:cstheme="minorHAnsi"/>
-          <w:sz w:val="20"/>
-          <w:szCs w:val="20"/>
-          <w:lang w:val="en-US"/>
-        </w:rPr>
-        <w:t>overtimeRate</w:t>
-      </w:r>
-      <w:proofErr w:type="spellEnd"/>
-      <w:r>
-        <w:rPr>
-          <w:rFonts w:ascii="Aptos" w:hAnsi="Aptos" w:cstheme="minorHAnsi"/>
-          <w:sz w:val="20"/>
-          <w:szCs w:val="20"/>
-          <w:lang w:val="en-US"/>
-        </w:rPr>
-        <w:t>}} taxed</w:t>
+        <w:t>{{overtimeRate}} taxed</w:t>
       </w:r>
     </w:p>
     <w:p>
@@ -2008,9 +1579,60 @@
           <w:szCs w:val="20"/>
           <w:lang w:val="en-US"/>
         </w:rPr>
-        <w:t>{{</w:t>
-      </w:r>
-      <w:proofErr w:type="spellStart"/>
+        <w:t>{{holidayRate}} taxed</w:t>
+      </w:r>
+    </w:p>
+    <w:p>
+      <w:pPr>
+        <w:pStyle w:val="ListParagraph"/>
+        <w:numPr>
+          <w:ilvl w:val="0"/>
+          <w:numId w:val="6"/>
+        </w:numPr>
+        <w:tabs>
+          <w:tab w:val="left" w:pos="3960"/>
+        </w:tabs>
+        <w:spacing w:line="240" w:lineRule="auto"/>
+        <w:ind w:left="540" w:hanging="180"/>
+        <w:jc w:val="both"/>
+        <w:rPr>
+          <w:rFonts w:ascii="Aptos" w:hAnsi="Aptos" w:cstheme="minorHAnsi"/>
+          <w:b/>
+          <w:bCs/>
+          <w:sz w:val="20"/>
+          <w:szCs w:val="20"/>
+        </w:rPr>
+      </w:pPr>
+      <w:r>
+        <w:rPr>
+          <w:rFonts w:ascii="Aptos" w:hAnsi="Aptos" w:cstheme="minorHAnsi"/>
+          <w:b/>
+          <w:bCs/>
+          <w:sz w:val="20"/>
+          <w:szCs w:val="20"/>
+        </w:rPr>
+        <w:t>Extension Bonus</w:t>
+      </w:r>
+      <w:r>
+        <w:rPr>
+          <w:rFonts w:ascii="Aptos" w:hAnsi="Aptos" w:cstheme="minorHAnsi"/>
+          <w:b/>
+          <w:bCs/>
+          <w:sz w:val="20"/>
+          <w:szCs w:val="20"/>
+        </w:rPr>
+        <w:tab/>
+      </w:r>
+      <w:r>
+        <w:rPr>
+          <w:rFonts w:ascii="Aptos" w:hAnsi="Aptos" w:cstheme="minorHAnsi"/>
+          <w:b/>
+          <w:bCs/>
+          <w:sz w:val="20"/>
+          <w:szCs w:val="20"/>
+        </w:rPr>
+        <w:tab/>
+      </w:r>
       <w:r>
         <w:rPr>
           <w:rFonts w:ascii="Aptos" w:hAnsi="Aptos" w:cstheme="minorHAnsi"/>
@@ -2018,17 +1640,7 @@
           <w:szCs w:val="20"/>
           <w:lang w:val="en-US"/>
         </w:rPr>
-        <w:t>holidayRate</w:t>
-      </w:r>
-      <w:proofErr w:type="spellEnd"/>
-      <w:r>
-        <w:rPr>
-          <w:rFonts w:ascii="Aptos" w:hAnsi="Aptos" w:cstheme="minorHAnsi"/>
-          <w:sz w:val="20"/>
-          <w:szCs w:val="20"/>
-          <w:lang w:val="en-US"/>
-        </w:rPr>
-        <w:t>}} taxed</w:t>
+        <w:t>{{extensionBonus}}</w:t>
       </w:r>
     </w:p>
     <w:p>
@@ -2128,27 +1740,7 @@
           <w:szCs w:val="20"/>
           <w:lang w:val="en-US"/>
         </w:rPr>
-        <w:t>{{</w:t>
-      </w:r>
-      <w:proofErr w:type="spellStart"/>
-      <w:r>
-        <w:rPr>
-          <w:rFonts w:ascii="Aptos" w:hAnsi="Aptos"/>
-          <w:sz w:val="20"/>
-          <w:szCs w:val="20"/>
-          <w:lang w:val="en-US"/>
-        </w:rPr>
-        <w:t>facilityName</w:t>
-      </w:r>
-      <w:proofErr w:type="spellEnd"/>
-      <w:r>
-        <w:rPr>
-          <w:rFonts w:ascii="Aptos" w:hAnsi="Aptos"/>
-          <w:sz w:val="20"/>
-          <w:szCs w:val="20"/>
-          <w:lang w:val="en-US"/>
-        </w:rPr>
-        <w:t>}}</w:t>
+        <w:t>{{facilityName}}</w:t>
       </w:r>
     </w:p>
     <w:p>
@@ -2225,27 +1817,7 @@
           <w:szCs w:val="20"/>
           <w:lang w:val="en-US"/>
         </w:rPr>
-        <w:t>{{</w:t>
-      </w:r>
-      <w:proofErr w:type="spellStart"/>
-      <w:r>
-        <w:rPr>
-          <w:rFonts w:ascii="Aptos" w:hAnsi="Aptos"/>
-          <w:sz w:val="20"/>
-          <w:szCs w:val="20"/>
-          <w:lang w:val="en-US"/>
-        </w:rPr>
-        <w:t>facilityAddress</w:t>
-      </w:r>
-      <w:proofErr w:type="spellEnd"/>
-      <w:r>
-        <w:rPr>
-          <w:rFonts w:ascii="Aptos" w:hAnsi="Aptos"/>
-          <w:sz w:val="20"/>
-          <w:szCs w:val="20"/>
-          <w:lang w:val="en-US"/>
-        </w:rPr>
-        <w:t>}}</w:t>
+        <w:t>{{facilityAddress}}</w:t>
       </w:r>
     </w:p>
     <w:p>
@@ -2318,27 +1890,7 @@
           <w:szCs w:val="20"/>
           <w:lang w:val="en-US"/>
         </w:rPr>
-        <w:t>{{</w:t>
-      </w:r>
-      <w:proofErr w:type="spellStart"/>
-      <w:r>
-        <w:rPr>
-          <w:rFonts w:ascii="Aptos" w:hAnsi="Aptos"/>
-          <w:sz w:val="20"/>
-          <w:szCs w:val="20"/>
-          <w:lang w:val="en-US"/>
-        </w:rPr>
-        <w:t>facilityCityStateZip</w:t>
-      </w:r>
-      <w:proofErr w:type="spellEnd"/>
-      <w:r>
-        <w:rPr>
-          <w:rFonts w:ascii="Aptos" w:hAnsi="Aptos"/>
-          <w:sz w:val="20"/>
-          <w:szCs w:val="20"/>
-          <w:lang w:val="en-US"/>
-        </w:rPr>
-        <w:t>}}</w:t>
+        <w:t>{{facilityCityStateZip}}</w:t>
       </w:r>
     </w:p>
     <w:p>
@@ -2466,18 +2018,8 @@
           <w:sz w:val="20"/>
           <w:szCs w:val="20"/>
         </w:rPr>
-        <w:t xml:space="preserve">weekly </w:t>
-      </w:r>
-      <w:proofErr w:type="gramStart"/>
-      <w:r>
-        <w:rPr>
-          <w:rFonts w:ascii="Aptos" w:hAnsi="Aptos"/>
-          <w:sz w:val="20"/>
-          <w:szCs w:val="20"/>
-        </w:rPr>
-        <w:t>by</w:t>
-      </w:r>
-      <w:proofErr w:type="gramEnd"/>
+        <w:t>weekly by</w:t>
+      </w:r>
       <w:r>
         <w:rPr>
           <w:rFonts w:ascii="Aptos" w:hAnsi="Aptos"/>
@@ -2688,25 +2230,7 @@
           <w:sz w:val="20"/>
           <w:szCs w:val="20"/>
         </w:rPr>
-        <w:t>{{</w:t>
-      </w:r>
-      <w:proofErr w:type="spellStart"/>
-      <w:r>
-        <w:rPr>
-          <w:rFonts w:ascii="Aptos" w:hAnsi="Aptos"/>
-          <w:sz w:val="20"/>
-          <w:szCs w:val="20"/>
-        </w:rPr>
-        <w:t>payScheduleFrequency</w:t>
-      </w:r>
-      <w:proofErr w:type="spellEnd"/>
-      <w:r>
-        <w:rPr>
-          <w:rFonts w:ascii="Aptos" w:hAnsi="Aptos"/>
-          <w:sz w:val="20"/>
-          <w:szCs w:val="20"/>
-        </w:rPr>
-        <w:t>}}</w:t>
+        <w:t>{{payScheduleFrequency}}</w:t>
       </w:r>
       <w:r>
         <w:rPr>
@@ -3063,25 +2587,7 @@
           <w:sz w:val="20"/>
           <w:szCs w:val="20"/>
         </w:rPr>
-        <w:t xml:space="preserve">Trailblazer or the Employee may terminate this agreement at any time by providing 14 days' written notice. If the Employee terminates the assignment without the required notice, they may be subject to a $1,000 cancellation fee and/or recovery of any client-assessed penalties or other direct costs incurred by Trailblazer </w:t>
-      </w:r>
-      <w:proofErr w:type="gramStart"/>
-      <w:r>
-        <w:rPr>
-          <w:rFonts w:ascii="Aptos" w:hAnsi="Aptos"/>
-          <w:sz w:val="20"/>
-          <w:szCs w:val="20"/>
-        </w:rPr>
-        <w:t>as a result of</w:t>
-      </w:r>
-      <w:proofErr w:type="gramEnd"/>
-      <w:r>
-        <w:rPr>
-          <w:rFonts w:ascii="Aptos" w:hAnsi="Aptos"/>
-          <w:sz w:val="20"/>
-          <w:szCs w:val="20"/>
-        </w:rPr>
-        <w:t xml:space="preserve"> the Employee's early termination, where permitted by applicable law.</w:t>
+        <w:t>Trailblazer or the Employee may terminate this agreement at any time by providing 14 days' written notice. If the Employee terminates the assignment without the required notice, they may be subject to a $1,000 cancellation fee and/or recovery of any client-assessed penalties or other direct costs incurred by Trailblazer as a result of the Employee's early termination, where permitted by applicable law.</w:t>
       </w:r>
     </w:p>
     <w:p>
@@ -3915,25 +3421,7 @@
           <w:sz w:val="20"/>
           <w:szCs w:val="20"/>
         </w:rPr>
-        <w:t xml:space="preserve">e would like to take this opportunity to thank you for accepting our offer and </w:t>
-      </w:r>
-      <w:proofErr w:type="gramStart"/>
-      <w:r>
-        <w:rPr>
-          <w:rFonts w:ascii="Aptos" w:hAnsi="Aptos"/>
-          <w:sz w:val="20"/>
-          <w:szCs w:val="20"/>
-        </w:rPr>
-        <w:t>welcome</w:t>
-      </w:r>
-      <w:proofErr w:type="gramEnd"/>
-      <w:r>
-        <w:rPr>
-          <w:rFonts w:ascii="Aptos" w:hAnsi="Aptos"/>
-          <w:sz w:val="20"/>
-          <w:szCs w:val="20"/>
-        </w:rPr>
-        <w:t xml:space="preserve"> you to TrailBlazer Staffing Solutions.</w:t>
+        <w:t>e would like to take this opportunity to thank you for accepting our offer and welcome you to TrailBlazer Staffing Solutions.</w:t>
       </w:r>
     </w:p>
     <w:p>
@@ -3971,23 +3459,13 @@
           <w:szCs w:val="36"/>
         </w:rPr>
       </w:pPr>
-      <w:proofErr w:type="spellStart"/>
       <w:r>
         <w:rPr>
           <w:rFonts w:ascii="Bradley Hand ITC" w:hAnsi="Bradley Hand ITC"/>
           <w:sz w:val="36"/>
           <w:szCs w:val="36"/>
         </w:rPr>
-        <w:t>Purba</w:t>
-      </w:r>
-      <w:proofErr w:type="spellEnd"/>
-      <w:r>
-        <w:rPr>
-          <w:rFonts w:ascii="Bradley Hand ITC" w:hAnsi="Bradley Hand ITC"/>
-          <w:sz w:val="36"/>
-          <w:szCs w:val="36"/>
-        </w:rPr>
-        <w:t xml:space="preserve"> Majumder</w:t>
+        <w:t>Purba Majumder</w:t>
       </w:r>
     </w:p>
     <w:p>
@@ -4001,27 +3479,15 @@
           <w:szCs w:val="20"/>
         </w:rPr>
       </w:pPr>
-      <w:proofErr w:type="spellStart"/>
-      <w:r>
-        <w:rPr>
-          <w:rFonts w:ascii="Aptos" w:hAnsi="Aptos"/>
-          <w:b/>
-          <w:bCs/>
-          <w:sz w:val="20"/>
-          <w:szCs w:val="20"/>
-        </w:rPr>
-        <w:t>Purba</w:t>
-      </w:r>
-      <w:proofErr w:type="spellEnd"/>
-      <w:r>
-        <w:rPr>
-          <w:rFonts w:ascii="Aptos" w:hAnsi="Aptos"/>
-          <w:b/>
-          <w:bCs/>
-          <w:sz w:val="20"/>
-          <w:szCs w:val="20"/>
-        </w:rPr>
-        <w:t xml:space="preserve"> B.</w:t>
+      <w:r>
+        <w:rPr>
+          <w:rFonts w:ascii="Aptos" w:hAnsi="Aptos"/>
+          <w:b/>
+          <w:bCs/>
+          <w:sz w:val="20"/>
+          <w:szCs w:val="20"/>
+        </w:rPr>
+        <w:t>Purba B.</w:t>
       </w:r>
       <w:r>
         <w:rPr>
@@ -7369,20 +6835,20 @@
 </file>
 
 <file path=customXml/item1.xml><?xml version="1.0" encoding="utf-8"?>
-<p:properties xmlns:p="http://schemas.microsoft.com/office/2006/metadata/properties" xmlns:xsi="http://www.w3.org/2001/XMLSchema-instance" xmlns:pc="http://schemas.microsoft.com/office/infopath/2007/PartnerControls">
-  <documentManagement>
-    <_activity xmlns="2169045f-e607-4534-844d-fccd73ad8fdf" xsi:nil="true"/>
-  </documentManagement>
-</p:properties>
-</file>
-
-<file path=customXml/item2.xml><?xml version="1.0" encoding="utf-8"?>
 <?mso-contentType ?>
 <FormTemplates xmlns="http://schemas.microsoft.com/sharepoint/v3/contenttype/forms">
   <Display>DocumentLibraryForm</Display>
   <Edit>DocumentLibraryForm</Edit>
   <New>DocumentLibraryForm</New>
 </FormTemplates>
+</file>
+
+<file path=customXml/item2.xml><?xml version="1.0" encoding="utf-8"?>
+<p:properties xmlns:p="http://schemas.microsoft.com/office/2006/metadata/properties" xmlns:xsi="http://www.w3.org/2001/XMLSchema-instance" xmlns:pc="http://schemas.microsoft.com/office/infopath/2007/PartnerControls">
+  <documentManagement>
+    <_activity xmlns="2169045f-e607-4534-844d-fccd73ad8fdf" xsi:nil="true"/>
+  </documentManagement>
+</p:properties>
 </file>
 
 <file path=customXml/item3.xml><?xml version="1.0" encoding="utf-8"?>
@@ -7562,19 +7028,19 @@
 </file>
 
 <file path=customXml/itemProps1.xml><?xml version="1.0" encoding="utf-8"?>
+<ds:datastoreItem xmlns:ds="http://schemas.openxmlformats.org/officeDocument/2006/customXml" ds:itemID="{59393987-0C0B-4D6F-A718-E27F3D924901}">
+  <ds:schemaRefs>
+    <ds:schemaRef ds:uri="http://schemas.microsoft.com/sharepoint/v3/contenttype/forms"/>
+  </ds:schemaRefs>
+</ds:datastoreItem>
+</file>
+
+<file path=customXml/itemProps2.xml><?xml version="1.0" encoding="utf-8"?>
 <ds:datastoreItem xmlns:ds="http://schemas.openxmlformats.org/officeDocument/2006/customXml" ds:itemID="{D6D565AC-DA50-4173-8B25-C149C30CFA36}">
   <ds:schemaRefs>
     <ds:schemaRef ds:uri="http://schemas.microsoft.com/office/2006/metadata/properties"/>
     <ds:schemaRef ds:uri="http://schemas.microsoft.com/office/infopath/2007/PartnerControls"/>
     <ds:schemaRef ds:uri="2169045f-e607-4534-844d-fccd73ad8fdf"/>
-  </ds:schemaRefs>
-</ds:datastoreItem>
-</file>
-
-<file path=customXml/itemProps2.xml><?xml version="1.0" encoding="utf-8"?>
-<ds:datastoreItem xmlns:ds="http://schemas.openxmlformats.org/officeDocument/2006/customXml" ds:itemID="{59393987-0C0B-4D6F-A718-E27F3D924901}">
-  <ds:schemaRefs>
-    <ds:schemaRef ds:uri="http://schemas.microsoft.com/sharepoint/v3/contenttype/forms"/>
   </ds:schemaRefs>
 </ds:datastoreItem>
 </file>

</xml_diff>

<commit_message>
Align contract stipend fallback and update template
</commit_message>
<xml_diff>
--- a/templates/contract-template.docx
+++ b/templates/contract-template.docx
@@ -1,6 +1,6 @@
 
 <file path=word/document.xml><?xml version="1.0" encoding="utf-8"?>
-<w:document xmlns:wpc="http://schemas.microsoft.com/office/word/2010/wordprocessingCanvas" xmlns:cx="http://schemas.microsoft.com/office/drawing/2014/chartex" xmlns:cx1="http://schemas.microsoft.com/office/drawing/2015/9/8/chartex" xmlns:cx2="http://schemas.microsoft.com/office/drawing/2015/10/21/chartex" xmlns:cx3="http://schemas.microsoft.com/office/drawing/2016/5/9/chartex" xmlns:cx4="http://schemas.microsoft.com/office/drawing/2016/5/10/chartex" xmlns:cx5="http://schemas.microsoft.com/office/drawing/2016/5/11/chartex" xmlns:cx6="http://schemas.microsoft.com/office/drawing/2016/5/12/chartex" xmlns:cx7="http://schemas.microsoft.com/office/drawing/2016/5/13/chartex" xmlns:cx8="http://schemas.microsoft.com/office/drawing/2016/5/14/chartex" xmlns:mc="http://schemas.openxmlformats.org/markup-compatibility/2006" xmlns:aink="http://schemas.microsoft.com/office/drawing/2016/ink" xmlns:am3d="http://schemas.microsoft.com/office/drawing/2017/model3d" xmlns:o="urn:schemas-microsoft-com:office:office" xmlns:oel="http://schemas.microsoft.com/office/2019/extlst" xmlns:r="http://schemas.openxmlformats.org/officeDocument/2006/relationships" xmlns:m="http://schemas.openxmlformats.org/officeDocument/2006/math" xmlns:v="urn:schemas-microsoft-com:vml" xmlns:wp14="http://schemas.microsoft.com/office/word/2010/wordprocessingDrawing" xmlns:wp="http://schemas.openxmlformats.org/drawingml/2006/wordprocessingDrawing" xmlns:w10="urn:schemas-microsoft-com:office:word" xmlns:w="http://schemas.openxmlformats.org/wordprocessingml/2006/main" xmlns:w14="http://schemas.microsoft.com/office/word/2010/wordml" xmlns:w15="http://schemas.microsoft.com/office/word/2012/wordml" xmlns:w16cex="http://schemas.microsoft.com/office/word/2018/wordml/cex" xmlns:w16cid="http://schemas.microsoft.com/office/word/2016/wordml/cid" xmlns:w16="http://schemas.microsoft.com/office/word/2018/wordml" xmlns:w16du="http://schemas.microsoft.com/office/word/2023/wordml/word16du" xmlns:w16sdtdh="http://schemas.microsoft.com/office/word/2020/wordml/sdtdatahash" xmlns:w16sdtfl="http://schemas.microsoft.com/office/word/2024/wordml/sdtformatlock" xmlns:w16se="http://schemas.microsoft.com/office/word/2015/wordml/symex" xmlns:wpg="http://schemas.microsoft.com/office/word/2010/wordprocessingGroup" xmlns:wpi="http://schemas.microsoft.com/office/word/2010/wordprocessingInk" xmlns:wne="http://schemas.microsoft.com/office/word/2006/wordml" xmlns:wps="http://schemas.microsoft.com/office/word/2010/wordprocessingShape" mc:Ignorable="w14 w15 w16se w16cid w16 w16cex w16sdtdh w16sdtfl w16du wp14">
+<w:document xmlns:wpc="http://schemas.microsoft.com/office/word/2010/wordprocessingCanvas" xmlns:cx="http://schemas.microsoft.com/office/drawing/2014/chartex" xmlns:cx1="http://schemas.microsoft.com/office/drawing/2015/9/8/chartex" xmlns:cx2="http://schemas.microsoft.com/office/drawing/2015/10/21/chartex" xmlns:cx3="http://schemas.microsoft.com/office/drawing/2016/5/9/chartex" xmlns:cx4="http://schemas.microsoft.com/office/drawing/2016/5/10/chartex" xmlns:cx5="http://schemas.microsoft.com/office/drawing/2016/5/11/chartex" xmlns:cx6="http://schemas.microsoft.com/office/drawing/2016/5/12/chartex" xmlns:cx7="http://schemas.microsoft.com/office/drawing/2016/5/13/chartex" xmlns:cx8="http://schemas.microsoft.com/office/drawing/2016/5/14/chartex" xmlns:mc="http://schemas.openxmlformats.org/markup-compatibility/2006" xmlns:aink="http://schemas.microsoft.com/office/drawing/2016/ink" xmlns:am3d="http://schemas.microsoft.com/office/drawing/2017/model3d" xmlns:o="urn:schemas-microsoft-com:office:office" xmlns:oel="http://schemas.microsoft.com/office/2019/extlst" xmlns:r="http://schemas.openxmlformats.org/officeDocument/2006/relationships" xmlns:m="http://schemas.openxmlformats.org/officeDocument/2006/math" xmlns:v="urn:schemas-microsoft-com:vml" xmlns:wp14="http://schemas.microsoft.com/office/word/2010/wordprocessingDrawing" xmlns:wp="http://schemas.openxmlformats.org/drawingml/2006/wordprocessingDrawing" xmlns:w10="urn:schemas-microsoft-com:office:word" xmlns:w="http://schemas.openxmlformats.org/wordprocessingml/2006/main" xmlns:w14="http://schemas.microsoft.com/office/word/2010/wordml" xmlns:w15="http://schemas.microsoft.com/office/word/2012/wordml" xmlns:w16cei="http://schemas.microsoft.com/office/word/2026/wordml/cei" xmlns:w16cex="http://schemas.microsoft.com/office/word/2018/wordml/cex" xmlns:w16cid="http://schemas.microsoft.com/office/word/2016/wordml/cid" xmlns:w16="http://schemas.microsoft.com/office/word/2018/wordml" xmlns:w16du="http://schemas.microsoft.com/office/word/2023/wordml/word16du" xmlns:w16sdtdh="http://schemas.microsoft.com/office/word/2020/wordml/sdtdatahash" xmlns:w16sdtfl="http://schemas.microsoft.com/office/word/2024/wordml/sdtformatlock" xmlns:w16se="http://schemas.microsoft.com/office/word/2015/wordml/symex" xmlns:wpg="http://schemas.microsoft.com/office/word/2010/wordprocessingGroup" xmlns:wpi="http://schemas.microsoft.com/office/word/2010/wordprocessingInk" xmlns:wne="http://schemas.microsoft.com/office/word/2006/wordml" xmlns:wps="http://schemas.microsoft.com/office/word/2010/wordprocessingShape" mc:Ignorable="w14 w15 w16se w16cid w16 w16cex w16sdtdh w16sdtfl w16du wp14">
   <w:body>
     <w:p>
       <w:pPr>
@@ -108,13 +108,10 @@
           <w:szCs w:val="20"/>
           <w:lang w:val="en-US" w:eastAsia="en-US"/>
         </w:rPr>
-        <w:t>{{contractorName}}</w:t>
-      </w:r>
-    </w:p>
-    <w:p>
-      <w:pPr>
-        <w:pStyle w:val="Heading2"/>
-        <w:spacing w:before="0" w:after="0" w:line="240" w:lineRule="auto"/>
+        <w:t>{{</w:t>
+      </w:r>
+      <w:proofErr w:type="spellStart"/>
+      <w:r>
         <w:rPr>
           <w:rFonts w:ascii="Aptos" w:eastAsiaTheme="minorHAnsi" w:hAnsi="Aptos" w:cstheme="minorBidi"/>
           <w:b w:val="0"/>
@@ -124,7 +121,9 @@
           <w:szCs w:val="20"/>
           <w:lang w:val="en-US" w:eastAsia="en-US"/>
         </w:rPr>
-      </w:pPr>
+        <w:t>contractorName</w:t>
+      </w:r>
+      <w:proofErr w:type="spellEnd"/>
       <w:r>
         <w:rPr>
           <w:rFonts w:ascii="Aptos" w:eastAsiaTheme="minorHAnsi" w:hAnsi="Aptos" w:cstheme="minorBidi"/>
@@ -135,7 +134,7 @@
           <w:szCs w:val="20"/>
           <w:lang w:val="en-US" w:eastAsia="en-US"/>
         </w:rPr>
-        <w:t>{{contractorAddress1}}</w:t>
+        <w:t>}}</w:t>
       </w:r>
     </w:p>
     <w:p>
@@ -162,7 +161,7 @@
           <w:szCs w:val="20"/>
           <w:lang w:val="en-US" w:eastAsia="en-US"/>
         </w:rPr>
-        <w:t>{{contractorAddress2}}</w:t>
+        <w:t>{{contractorAddress1}}</w:t>
       </w:r>
     </w:p>
     <w:p>
@@ -179,11 +178,7 @@
           <w:lang w:val="en-US" w:eastAsia="en-US"/>
         </w:rPr>
       </w:pPr>
-    </w:p>
-    <w:p>
-      <w:pPr>
-        <w:pStyle w:val="Heading2"/>
-        <w:spacing w:before="0" w:after="0" w:line="240" w:lineRule="auto"/>
+      <w:r>
         <w:rPr>
           <w:rFonts w:ascii="Aptos" w:eastAsiaTheme="minorHAnsi" w:hAnsi="Aptos" w:cstheme="minorBidi"/>
           <w:b w:val="0"/>
@@ -193,8 +188,13 @@
           <w:szCs w:val="20"/>
           <w:lang w:val="en-US" w:eastAsia="en-US"/>
         </w:rPr>
-      </w:pPr>
-      <w:r>
+        <w:t>{{contractorAddress2}}</w:t>
+      </w:r>
+    </w:p>
+    <w:p>
+      <w:pPr>
+        <w:pStyle w:val="Heading2"/>
+        <w:spacing w:before="0" w:after="0" w:line="240" w:lineRule="auto"/>
         <w:rPr>
           <w:rFonts w:ascii="Aptos" w:eastAsiaTheme="minorHAnsi" w:hAnsi="Aptos" w:cstheme="minorBidi"/>
           <w:b w:val="0"/>
@@ -204,9 +204,62 @@
           <w:szCs w:val="20"/>
           <w:lang w:val="en-US" w:eastAsia="en-US"/>
         </w:rPr>
-        <w:t>{{todaysDate}}</w:t>
-      </w:r>
-    </w:p>
+      </w:pPr>
+    </w:p>
+    <w:p>
+      <w:pPr>
+        <w:pStyle w:val="Heading2"/>
+        <w:spacing w:before="0" w:after="0" w:line="240" w:lineRule="auto"/>
+        <w:rPr>
+          <w:rFonts w:ascii="Aptos" w:eastAsiaTheme="minorHAnsi" w:hAnsi="Aptos" w:cstheme="minorBidi"/>
+          <w:b w:val="0"/>
+          <w:bCs w:val="0"/>
+          <w:iCs w:val="0"/>
+          <w:sz w:val="20"/>
+          <w:szCs w:val="20"/>
+          <w:lang w:val="en-US" w:eastAsia="en-US"/>
+        </w:rPr>
+      </w:pPr>
+      <w:r>
+        <w:rPr>
+          <w:rFonts w:ascii="Aptos" w:eastAsiaTheme="minorHAnsi" w:hAnsi="Aptos" w:cstheme="minorBidi"/>
+          <w:b w:val="0"/>
+          <w:bCs w:val="0"/>
+          <w:iCs w:val="0"/>
+          <w:sz w:val="20"/>
+          <w:szCs w:val="20"/>
+          <w:lang w:val="en-US" w:eastAsia="en-US"/>
+        </w:rPr>
+        <w:t>{{</w:t>
+      </w:r>
+      <w:proofErr w:type="spellStart"/>
+      <w:r>
+        <w:rPr>
+          <w:rFonts w:ascii="Aptos" w:eastAsiaTheme="minorHAnsi" w:hAnsi="Aptos" w:cstheme="minorBidi"/>
+          <w:b w:val="0"/>
+          <w:bCs w:val="0"/>
+          <w:iCs w:val="0"/>
+          <w:sz w:val="20"/>
+          <w:szCs w:val="20"/>
+          <w:lang w:val="en-US" w:eastAsia="en-US"/>
+        </w:rPr>
+        <w:t>todaysDate</w:t>
+      </w:r>
+      <w:proofErr w:type="spellEnd"/>
+      <w:r>
+        <w:rPr>
+          <w:rFonts w:ascii="Aptos" w:eastAsiaTheme="minorHAnsi" w:hAnsi="Aptos" w:cstheme="minorBidi"/>
+          <w:b w:val="0"/>
+          <w:bCs w:val="0"/>
+          <w:iCs w:val="0"/>
+          <w:sz w:val="20"/>
+          <w:szCs w:val="20"/>
+          <w:lang w:val="en-US" w:eastAsia="en-US"/>
+        </w:rPr>
+        <w:t>}}</w:t>
+      </w:r>
+    </w:p>
+    <w:p/>
     <w:p>
       <w:pPr>
         <w:jc w:val="both"/>
@@ -216,6 +269,48 @@
           <w:szCs w:val="20"/>
         </w:rPr>
       </w:pPr>
+      <w:r>
+        <w:rPr>
+          <w:rFonts w:ascii="Aptos" w:hAnsi="Aptos"/>
+          <w:sz w:val="20"/>
+          <w:szCs w:val="20"/>
+        </w:rPr>
+        <w:t xml:space="preserve">Dear </w:t>
+      </w:r>
+      <w:r>
+        <w:rPr>
+          <w:rFonts w:ascii="Aptos" w:hAnsi="Aptos"/>
+          <w:sz w:val="20"/>
+          <w:szCs w:val="20"/>
+        </w:rPr>
+        <w:t>{{</w:t>
+      </w:r>
+      <w:proofErr w:type="spellStart"/>
+      <w:r>
+        <w:rPr>
+          <w:rFonts w:ascii="Aptos" w:hAnsi="Aptos"/>
+          <w:sz w:val="20"/>
+          <w:szCs w:val="20"/>
+        </w:rPr>
+        <w:t>contractorFirstName</w:t>
+      </w:r>
+      <w:proofErr w:type="spellEnd"/>
+      <w:r>
+        <w:rPr>
+          <w:rFonts w:ascii="Aptos" w:hAnsi="Aptos"/>
+          <w:sz w:val="20"/>
+          <w:szCs w:val="20"/>
+        </w:rPr>
+        <w:t>}}</w:t>
+      </w:r>
+      <w:r>
+        <w:rPr>
+          <w:rFonts w:ascii="Aptos" w:hAnsi="Aptos"/>
+          <w:sz w:val="20"/>
+          <w:szCs w:val="20"/>
+        </w:rPr>
+        <w:t>,</w:t>
+      </w:r>
     </w:p>
     <w:p>
       <w:pPr>
@@ -232,23 +327,7 @@
           <w:sz w:val="20"/>
           <w:szCs w:val="20"/>
         </w:rPr>
-        <w:t>Congratulations</w:t>
-      </w:r>
-      <w:r>
-        <w:rPr>
-          <w:rFonts w:ascii="Aptos" w:hAnsi="Aptos"/>
-          <w:sz w:val="20"/>
-          <w:szCs w:val="20"/>
-        </w:rPr>
-        <w:t xml:space="preserve"> {{contractorFirstName}}</w:t>
-      </w:r>
-      <w:r>
-        <w:rPr>
-          <w:rFonts w:ascii="Aptos" w:hAnsi="Aptos"/>
-          <w:sz w:val="20"/>
-          <w:szCs w:val="20"/>
-        </w:rPr>
-        <w:t xml:space="preserve">! </w:t>
+        <w:t xml:space="preserve">Congratulations! </w:t>
       </w:r>
       <w:r>
         <w:rPr>
@@ -272,7 +351,7 @@
           <w:sz w:val="20"/>
           <w:szCs w:val="20"/>
         </w:rPr>
-        <w:t>excited</w:t>
+        <w:t>pleased</w:t>
       </w:r>
       <w:r>
         <w:rPr>
@@ -312,15 +391,109 @@
           <w:sz w:val="20"/>
           <w:szCs w:val="20"/>
         </w:rPr>
-        <w:t xml:space="preserve">offer </w:t>
-      </w:r>
-      <w:r>
-        <w:rPr>
-          <w:rFonts w:ascii="Aptos" w:hAnsi="Aptos"/>
-          <w:sz w:val="20"/>
-          <w:szCs w:val="20"/>
-        </w:rPr>
-        <w:t xml:space="preserve">at {{facilityName}}. </w:t>
+        <w:t>offer</w:t>
+      </w:r>
+      <w:r>
+        <w:rPr>
+          <w:rFonts w:ascii="Aptos" w:hAnsi="Aptos"/>
+          <w:sz w:val="20"/>
+          <w:szCs w:val="20"/>
+        </w:rPr>
+        <w:t xml:space="preserve"> as a </w:t>
+      </w:r>
+      <w:r>
+        <w:rPr>
+          <w:rFonts w:ascii="Aptos" w:hAnsi="Aptos"/>
+          <w:sz w:val="20"/>
+          <w:szCs w:val="20"/>
+        </w:rPr>
+        <w:t>{{</w:t>
+      </w:r>
+      <w:proofErr w:type="spellStart"/>
+      <w:r>
+        <w:rPr>
+          <w:rFonts w:ascii="Aptos" w:hAnsi="Aptos"/>
+          <w:sz w:val="20"/>
+          <w:szCs w:val="20"/>
+        </w:rPr>
+        <w:t>jobTitle</w:t>
+      </w:r>
+      <w:proofErr w:type="spellEnd"/>
+      <w:r>
+        <w:rPr>
+          <w:rFonts w:ascii="Aptos" w:hAnsi="Aptos"/>
+          <w:sz w:val="20"/>
+          <w:szCs w:val="20"/>
+        </w:rPr>
+        <w:t>}}</w:t>
+      </w:r>
+      <w:r>
+        <w:rPr>
+          <w:rFonts w:ascii="Aptos" w:hAnsi="Aptos"/>
+          <w:sz w:val="20"/>
+          <w:szCs w:val="20"/>
+        </w:rPr>
+        <w:t xml:space="preserve"> with Trailblazer Staffing Solutions, </w:t>
+      </w:r>
+      <w:r>
+        <w:rPr>
+          <w:rFonts w:ascii="Aptos" w:hAnsi="Aptos"/>
+          <w:sz w:val="20"/>
+          <w:szCs w:val="20"/>
+        </w:rPr>
+        <w:t>at</w:t>
+      </w:r>
+      <w:r>
+        <w:rPr>
+          <w:rFonts w:ascii="Aptos" w:hAnsi="Aptos"/>
+          <w:sz w:val="20"/>
+          <w:szCs w:val="20"/>
+        </w:rPr>
+        <w:t xml:space="preserve"> our client’s </w:t>
+      </w:r>
+      <w:proofErr w:type="gramStart"/>
+      <w:r>
+        <w:rPr>
+          <w:rFonts w:ascii="Aptos" w:hAnsi="Aptos"/>
+          <w:sz w:val="20"/>
+          <w:szCs w:val="20"/>
+        </w:rPr>
+        <w:t>facility,</w:t>
+      </w:r>
+      <w:r>
+        <w:rPr>
+          <w:rFonts w:ascii="Aptos" w:hAnsi="Aptos"/>
+          <w:sz w:val="20"/>
+          <w:szCs w:val="20"/>
+        </w:rPr>
+        <w:t xml:space="preserve"> {{</w:t>
+      </w:r>
+      <w:proofErr w:type="spellStart"/>
+      <w:r>
+        <w:rPr>
+          <w:rFonts w:ascii="Aptos" w:hAnsi="Aptos"/>
+          <w:sz w:val="20"/>
+          <w:szCs w:val="20"/>
+        </w:rPr>
+        <w:t>facilityName</w:t>
+      </w:r>
+      <w:proofErr w:type="spellEnd"/>
+      <w:r>
+        <w:rPr>
+          <w:rFonts w:ascii="Aptos" w:hAnsi="Aptos"/>
+          <w:sz w:val="20"/>
+          <w:szCs w:val="20"/>
+        </w:rPr>
+        <w:t>}}.</w:t>
+      </w:r>
+      <w:proofErr w:type="gramEnd"/>
+      <w:r>
+        <w:rPr>
+          <w:rFonts w:ascii="Aptos" w:hAnsi="Aptos"/>
+          <w:sz w:val="20"/>
+          <w:szCs w:val="20"/>
+        </w:rPr>
+        <w:t xml:space="preserve"> </w:t>
       </w:r>
       <w:r>
         <w:rPr>
@@ -368,95 +541,7 @@
           <w:sz w:val="20"/>
           <w:szCs w:val="20"/>
         </w:rPr>
-        <w:t xml:space="preserve">Failure to </w:t>
-      </w:r>
-      <w:r>
-        <w:rPr>
-          <w:rFonts w:ascii="Aptos" w:hAnsi="Aptos"/>
-          <w:sz w:val="20"/>
-          <w:szCs w:val="20"/>
-        </w:rPr>
-        <w:t>complete</w:t>
-      </w:r>
-      <w:r>
-        <w:rPr>
-          <w:rFonts w:ascii="Aptos" w:hAnsi="Aptos"/>
-          <w:sz w:val="20"/>
-          <w:szCs w:val="20"/>
-        </w:rPr>
-        <w:t xml:space="preserve"> </w:t>
-      </w:r>
-      <w:r>
-        <w:rPr>
-          <w:rFonts w:ascii="Aptos" w:hAnsi="Aptos"/>
-          <w:sz w:val="20"/>
-          <w:szCs w:val="20"/>
-        </w:rPr>
-        <w:t>these</w:t>
-      </w:r>
-      <w:r>
-        <w:rPr>
-          <w:rFonts w:ascii="Aptos" w:hAnsi="Aptos"/>
-          <w:sz w:val="20"/>
-          <w:szCs w:val="20"/>
-        </w:rPr>
-        <w:t xml:space="preserve"> </w:t>
-      </w:r>
-      <w:r>
-        <w:rPr>
-          <w:rFonts w:ascii="Aptos" w:hAnsi="Aptos"/>
-          <w:sz w:val="20"/>
-          <w:szCs w:val="20"/>
-        </w:rPr>
-        <w:t>requirements</w:t>
-      </w:r>
-      <w:r>
-        <w:rPr>
-          <w:rFonts w:ascii="Aptos" w:hAnsi="Aptos"/>
-          <w:sz w:val="20"/>
-          <w:szCs w:val="20"/>
-        </w:rPr>
-        <w:t xml:space="preserve"> </w:t>
-      </w:r>
-      <w:r>
-        <w:rPr>
-          <w:rFonts w:ascii="Aptos" w:hAnsi="Aptos"/>
-          <w:sz w:val="20"/>
-          <w:szCs w:val="20"/>
-        </w:rPr>
-        <w:t>may</w:t>
-      </w:r>
-      <w:r>
-        <w:rPr>
-          <w:rFonts w:ascii="Aptos" w:hAnsi="Aptos"/>
-          <w:sz w:val="20"/>
-          <w:szCs w:val="20"/>
-        </w:rPr>
-        <w:t xml:space="preserve"> result in immediate withdrawal of this offer. </w:t>
-      </w:r>
-      <w:r>
-        <w:rPr>
-          <w:rFonts w:ascii="Aptos" w:hAnsi="Aptos"/>
-          <w:sz w:val="20"/>
-          <w:szCs w:val="20"/>
-        </w:rPr>
-        <w:t xml:space="preserve">Completion of these items is a prerequisite </w:t>
-      </w:r>
-      <w:r>
-        <w:rPr>
-          <w:rFonts w:ascii="Aptos" w:hAnsi="Aptos"/>
-          <w:sz w:val="20"/>
-          <w:szCs w:val="20"/>
-        </w:rPr>
-        <w:t>for</w:t>
-      </w:r>
-      <w:r>
-        <w:rPr>
-          <w:rFonts w:ascii="Aptos" w:hAnsi="Aptos"/>
-          <w:sz w:val="20"/>
-          <w:szCs w:val="20"/>
-        </w:rPr>
-        <w:t xml:space="preserve"> employment and therefore not compensable.</w:t>
+        <w:t>Failure to complete all tests successfully will result in the immediate withdrawal of this offer. Participation in all tests and assessments is considered part of the pre-employment qualification process and is not eligible for compensation.</w:t>
       </w:r>
     </w:p>
     <w:p>
@@ -584,7 +669,27 @@
           <w:szCs w:val="20"/>
           <w:lang w:val="en-US"/>
         </w:rPr>
-        <w:t>{{jobTitle}}</w:t>
+        <w:t>{{</w:t>
+      </w:r>
+      <w:proofErr w:type="spellStart"/>
+      <w:r>
+        <w:rPr>
+          <w:rFonts w:ascii="Aptos" w:hAnsi="Aptos"/>
+          <w:sz w:val="20"/>
+          <w:szCs w:val="20"/>
+          <w:lang w:val="en-US"/>
+        </w:rPr>
+        <w:t>jobTitle</w:t>
+      </w:r>
+      <w:proofErr w:type="spellEnd"/>
+      <w:r>
+        <w:rPr>
+          <w:rFonts w:ascii="Aptos" w:hAnsi="Aptos"/>
+          <w:sz w:val="20"/>
+          <w:szCs w:val="20"/>
+          <w:lang w:val="en-US"/>
+        </w:rPr>
+        <w:t>}}</w:t>
       </w:r>
     </w:p>
     <w:p>
@@ -645,7 +750,27 @@
           <w:szCs w:val="20"/>
           <w:lang w:val="en-US"/>
         </w:rPr>
-        <w:t>{{startDate}}</w:t>
+        <w:t>{{</w:t>
+      </w:r>
+      <w:proofErr w:type="spellStart"/>
+      <w:r>
+        <w:rPr>
+          <w:rFonts w:ascii="Aptos" w:hAnsi="Aptos" w:cstheme="minorHAnsi"/>
+          <w:sz w:val="20"/>
+          <w:szCs w:val="20"/>
+          <w:lang w:val="en-US"/>
+        </w:rPr>
+        <w:t>startDate</w:t>
+      </w:r>
+      <w:proofErr w:type="spellEnd"/>
+      <w:r>
+        <w:rPr>
+          <w:rFonts w:ascii="Aptos" w:hAnsi="Aptos" w:cstheme="minorHAnsi"/>
+          <w:sz w:val="20"/>
+          <w:szCs w:val="20"/>
+          <w:lang w:val="en-US"/>
+        </w:rPr>
+        <w:t>}}</w:t>
       </w:r>
     </w:p>
     <w:p>
@@ -706,7 +831,27 @@
           <w:szCs w:val="20"/>
           <w:lang w:val="en-US"/>
         </w:rPr>
-        <w:t>{{endDate}}</w:t>
+        <w:t>{{</w:t>
+      </w:r>
+      <w:proofErr w:type="spellStart"/>
+      <w:r>
+        <w:rPr>
+          <w:rFonts w:ascii="Aptos" w:hAnsi="Aptos" w:cstheme="minorHAnsi"/>
+          <w:sz w:val="20"/>
+          <w:szCs w:val="20"/>
+          <w:lang w:val="en-US"/>
+        </w:rPr>
+        <w:t>endDate</w:t>
+      </w:r>
+      <w:proofErr w:type="spellEnd"/>
+      <w:r>
+        <w:rPr>
+          <w:rFonts w:ascii="Aptos" w:hAnsi="Aptos" w:cstheme="minorHAnsi"/>
+          <w:sz w:val="20"/>
+          <w:szCs w:val="20"/>
+          <w:lang w:val="en-US"/>
+        </w:rPr>
+        <w:t>}}</w:t>
       </w:r>
     </w:p>
     <w:p>
@@ -767,7 +912,27 @@
           <w:szCs w:val="20"/>
           <w:lang w:val="en-US"/>
         </w:rPr>
-        <w:t>{{assignmentWeeks}}</w:t>
+        <w:t>{{</w:t>
+      </w:r>
+      <w:proofErr w:type="spellStart"/>
+      <w:r>
+        <w:rPr>
+          <w:rFonts w:ascii="Aptos" w:hAnsi="Aptos" w:cstheme="minorHAnsi"/>
+          <w:sz w:val="20"/>
+          <w:szCs w:val="20"/>
+          <w:lang w:val="en-US"/>
+        </w:rPr>
+        <w:t>assignmentWeeks</w:t>
+      </w:r>
+      <w:proofErr w:type="spellEnd"/>
+      <w:r>
+        <w:rPr>
+          <w:rFonts w:ascii="Aptos" w:hAnsi="Aptos" w:cstheme="minorHAnsi"/>
+          <w:sz w:val="20"/>
+          <w:szCs w:val="20"/>
+          <w:lang w:val="en-US"/>
+        </w:rPr>
+        <w:t>}}</w:t>
       </w:r>
     </w:p>
     <w:p>
@@ -828,7 +993,27 @@
           <w:szCs w:val="20"/>
           <w:lang w:val="en-US"/>
         </w:rPr>
-        <w:t>{{scheduleLine}}</w:t>
+        <w:t>{{</w:t>
+      </w:r>
+      <w:proofErr w:type="spellStart"/>
+      <w:r>
+        <w:rPr>
+          <w:rFonts w:ascii="Aptos" w:hAnsi="Aptos" w:cstheme="minorHAnsi"/>
+          <w:sz w:val="20"/>
+          <w:szCs w:val="20"/>
+          <w:lang w:val="en-US"/>
+        </w:rPr>
+        <w:t>scheduleLine</w:t>
+      </w:r>
+      <w:proofErr w:type="spellEnd"/>
+      <w:r>
+        <w:rPr>
+          <w:rFonts w:ascii="Aptos" w:hAnsi="Aptos" w:cstheme="minorHAnsi"/>
+          <w:sz w:val="20"/>
+          <w:szCs w:val="20"/>
+          <w:lang w:val="en-US"/>
+        </w:rPr>
+        <w:t>}}</w:t>
       </w:r>
     </w:p>
     <w:p>
@@ -909,7 +1094,27 @@
           <w:szCs w:val="20"/>
           <w:lang w:val="en-US"/>
         </w:rPr>
-        <w:t>{{hoursPerWeek}}</w:t>
+        <w:t>{{</w:t>
+      </w:r>
+      <w:proofErr w:type="spellStart"/>
+      <w:r>
+        <w:rPr>
+          <w:rFonts w:ascii="Aptos" w:hAnsi="Aptos" w:cstheme="minorHAnsi"/>
+          <w:sz w:val="20"/>
+          <w:szCs w:val="20"/>
+          <w:lang w:val="en-US"/>
+        </w:rPr>
+        <w:t>hoursPerWeek</w:t>
+      </w:r>
+      <w:proofErr w:type="spellEnd"/>
+      <w:r>
+        <w:rPr>
+          <w:rFonts w:ascii="Aptos" w:hAnsi="Aptos" w:cstheme="minorHAnsi"/>
+          <w:sz w:val="20"/>
+          <w:szCs w:val="20"/>
+          <w:lang w:val="en-US"/>
+        </w:rPr>
+        <w:t>}}</w:t>
       </w:r>
       <w:r>
         <w:rPr>
@@ -1068,7 +1273,27 @@
           <w:szCs w:val="20"/>
           <w:lang w:val="en-US"/>
         </w:rPr>
-        <w:t>{{requestedTimeOff}}</w:t>
+        <w:t>{{</w:t>
+      </w:r>
+      <w:proofErr w:type="spellStart"/>
+      <w:r>
+        <w:rPr>
+          <w:rFonts w:ascii="Aptos" w:hAnsi="Aptos" w:cstheme="minorHAnsi"/>
+          <w:sz w:val="20"/>
+          <w:szCs w:val="20"/>
+          <w:lang w:val="en-US"/>
+        </w:rPr>
+        <w:t>requestedTimeOff</w:t>
+      </w:r>
+      <w:proofErr w:type="spellEnd"/>
+      <w:r>
+        <w:rPr>
+          <w:rFonts w:ascii="Aptos" w:hAnsi="Aptos" w:cstheme="minorHAnsi"/>
+          <w:sz w:val="20"/>
+          <w:szCs w:val="20"/>
+          <w:lang w:val="en-US"/>
+        </w:rPr>
+        <w:t>}}</w:t>
       </w:r>
     </w:p>
     <w:p>
@@ -1154,7 +1379,27 @@
           <w:szCs w:val="20"/>
           <w:lang w:val="en-US"/>
         </w:rPr>
-        <w:t>{{weeklyGross}}</w:t>
+        <w:t>{{</w:t>
+      </w:r>
+      <w:proofErr w:type="spellStart"/>
+      <w:r>
+        <w:rPr>
+          <w:rFonts w:ascii="Aptos" w:hAnsi="Aptos" w:cstheme="minorHAnsi"/>
+          <w:sz w:val="20"/>
+          <w:szCs w:val="20"/>
+          <w:lang w:val="en-US"/>
+        </w:rPr>
+        <w:t>weeklyGross</w:t>
+      </w:r>
+      <w:proofErr w:type="spellEnd"/>
+      <w:r>
+        <w:rPr>
+          <w:rFonts w:ascii="Aptos" w:hAnsi="Aptos" w:cstheme="minorHAnsi"/>
+          <w:sz w:val="20"/>
+          <w:szCs w:val="20"/>
+          <w:lang w:val="en-US"/>
+        </w:rPr>
+        <w:t>}}</w:t>
       </w:r>
     </w:p>
     <w:p>
@@ -1215,7 +1460,27 @@
           <w:szCs w:val="20"/>
           <w:lang w:val="en-US"/>
         </w:rPr>
-        <w:t>{{taxableHourly}}</w:t>
+        <w:t>{{</w:t>
+      </w:r>
+      <w:proofErr w:type="spellStart"/>
+      <w:r>
+        <w:rPr>
+          <w:rFonts w:ascii="Aptos" w:hAnsi="Aptos" w:cstheme="minorHAnsi"/>
+          <w:sz w:val="20"/>
+          <w:szCs w:val="20"/>
+          <w:lang w:val="en-US"/>
+        </w:rPr>
+        <w:t>taxableHourly</w:t>
+      </w:r>
+      <w:proofErr w:type="spellEnd"/>
+      <w:r>
+        <w:rPr>
+          <w:rFonts w:ascii="Aptos" w:hAnsi="Aptos" w:cstheme="minorHAnsi"/>
+          <w:sz w:val="20"/>
+          <w:szCs w:val="20"/>
+          <w:lang w:val="en-US"/>
+        </w:rPr>
+        <w:t>}}</w:t>
       </w:r>
     </w:p>
     <w:p>
@@ -1349,7 +1614,27 @@
           <w:szCs w:val="20"/>
           <w:lang w:val="en-US"/>
         </w:rPr>
-        <w:t>{{chargeRate}} taxed</w:t>
+        <w:t>{{</w:t>
+      </w:r>
+      <w:proofErr w:type="spellStart"/>
+      <w:r>
+        <w:rPr>
+          <w:rFonts w:ascii="Aptos" w:hAnsi="Aptos" w:cstheme="minorHAnsi"/>
+          <w:sz w:val="20"/>
+          <w:szCs w:val="20"/>
+          <w:lang w:val="en-US"/>
+        </w:rPr>
+        <w:t>chargeRate</w:t>
+      </w:r>
+      <w:proofErr w:type="spellEnd"/>
+      <w:r>
+        <w:rPr>
+          <w:rFonts w:ascii="Aptos" w:hAnsi="Aptos" w:cstheme="minorHAnsi"/>
+          <w:sz w:val="20"/>
+          <w:szCs w:val="20"/>
+          <w:lang w:val="en-US"/>
+        </w:rPr>
+        <w:t>}} taxed</w:t>
       </w:r>
     </w:p>
     <w:p>
@@ -1404,7 +1689,27 @@
           <w:szCs w:val="20"/>
           <w:lang w:val="en-US"/>
         </w:rPr>
-        <w:t>{{onCallPay}} taxed</w:t>
+        <w:t>{{</w:t>
+      </w:r>
+      <w:proofErr w:type="spellStart"/>
+      <w:r>
+        <w:rPr>
+          <w:rFonts w:ascii="Aptos" w:hAnsi="Aptos" w:cstheme="minorHAnsi"/>
+          <w:sz w:val="20"/>
+          <w:szCs w:val="20"/>
+          <w:lang w:val="en-US"/>
+        </w:rPr>
+        <w:t>onCallPay</w:t>
+      </w:r>
+      <w:proofErr w:type="spellEnd"/>
+      <w:r>
+        <w:rPr>
+          <w:rFonts w:ascii="Aptos" w:hAnsi="Aptos" w:cstheme="minorHAnsi"/>
+          <w:sz w:val="20"/>
+          <w:szCs w:val="20"/>
+          <w:lang w:val="en-US"/>
+        </w:rPr>
+        <w:t>}} taxed</w:t>
       </w:r>
     </w:p>
     <w:p>
@@ -1459,7 +1764,27 @@
           <w:szCs w:val="20"/>
           <w:lang w:val="en-US"/>
         </w:rPr>
-        <w:t>{{callBackRate}} taxed</w:t>
+        <w:t>{{</w:t>
+      </w:r>
+      <w:proofErr w:type="spellStart"/>
+      <w:r>
+        <w:rPr>
+          <w:rFonts w:ascii="Aptos" w:hAnsi="Aptos" w:cstheme="minorHAnsi"/>
+          <w:sz w:val="20"/>
+          <w:szCs w:val="20"/>
+          <w:lang w:val="en-US"/>
+        </w:rPr>
+        <w:t>callBackRate</w:t>
+      </w:r>
+      <w:proofErr w:type="spellEnd"/>
+      <w:r>
+        <w:rPr>
+          <w:rFonts w:ascii="Aptos" w:hAnsi="Aptos" w:cstheme="minorHAnsi"/>
+          <w:sz w:val="20"/>
+          <w:szCs w:val="20"/>
+          <w:lang w:val="en-US"/>
+        </w:rPr>
+        <w:t>}} taxed</w:t>
       </w:r>
     </w:p>
     <w:p>
@@ -1518,7 +1843,27 @@
           <w:szCs w:val="20"/>
           <w:lang w:val="en-US"/>
         </w:rPr>
-        <w:t>{{overtimeRate}} taxed</w:t>
+        <w:t>{{</w:t>
+      </w:r>
+      <w:proofErr w:type="spellStart"/>
+      <w:r>
+        <w:rPr>
+          <w:rFonts w:ascii="Aptos" w:hAnsi="Aptos" w:cstheme="minorHAnsi"/>
+          <w:sz w:val="20"/>
+          <w:szCs w:val="20"/>
+          <w:lang w:val="en-US"/>
+        </w:rPr>
+        <w:t>overtimeRate</w:t>
+      </w:r>
+      <w:proofErr w:type="spellEnd"/>
+      <w:r>
+        <w:rPr>
+          <w:rFonts w:ascii="Aptos" w:hAnsi="Aptos" w:cstheme="minorHAnsi"/>
+          <w:sz w:val="20"/>
+          <w:szCs w:val="20"/>
+          <w:lang w:val="en-US"/>
+        </w:rPr>
+        <w:t>}} taxed</w:t>
       </w:r>
     </w:p>
     <w:p>
@@ -1579,7 +1924,27 @@
           <w:szCs w:val="20"/>
           <w:lang w:val="en-US"/>
         </w:rPr>
-        <w:t>{{holidayRate}} taxed</w:t>
+        <w:t>{{</w:t>
+      </w:r>
+      <w:proofErr w:type="spellStart"/>
+      <w:r>
+        <w:rPr>
+          <w:rFonts w:ascii="Aptos" w:hAnsi="Aptos" w:cstheme="minorHAnsi"/>
+          <w:sz w:val="20"/>
+          <w:szCs w:val="20"/>
+          <w:lang w:val="en-US"/>
+        </w:rPr>
+        <w:t>holidayRate</w:t>
+      </w:r>
+      <w:proofErr w:type="spellEnd"/>
+      <w:r>
+        <w:rPr>
+          <w:rFonts w:ascii="Aptos" w:hAnsi="Aptos" w:cstheme="minorHAnsi"/>
+          <w:sz w:val="20"/>
+          <w:szCs w:val="20"/>
+          <w:lang w:val="en-US"/>
+        </w:rPr>
+        <w:t>}} taxed</w:t>
       </w:r>
     </w:p>
     <w:p>
@@ -1640,7 +2005,27 @@
           <w:szCs w:val="20"/>
           <w:lang w:val="en-US"/>
         </w:rPr>
-        <w:t>{{extensionBonus}}</w:t>
+        <w:t>{{</w:t>
+      </w:r>
+      <w:proofErr w:type="spellStart"/>
+      <w:r>
+        <w:rPr>
+          <w:rFonts w:ascii="Aptos" w:hAnsi="Aptos" w:cstheme="minorHAnsi"/>
+          <w:sz w:val="20"/>
+          <w:szCs w:val="20"/>
+          <w:lang w:val="en-US"/>
+        </w:rPr>
+        <w:t>extensionBonus</w:t>
+      </w:r>
+      <w:proofErr w:type="spellEnd"/>
+      <w:r>
+        <w:rPr>
+          <w:rFonts w:ascii="Aptos" w:hAnsi="Aptos" w:cstheme="minorHAnsi"/>
+          <w:sz w:val="20"/>
+          <w:szCs w:val="20"/>
+          <w:lang w:val="en-US"/>
+        </w:rPr>
+        <w:t>}}</w:t>
       </w:r>
     </w:p>
     <w:p>
@@ -1740,7 +2125,27 @@
           <w:szCs w:val="20"/>
           <w:lang w:val="en-US"/>
         </w:rPr>
-        <w:t>{{facilityName}}</w:t>
+        <w:t>{{</w:t>
+      </w:r>
+      <w:proofErr w:type="spellStart"/>
+      <w:r>
+        <w:rPr>
+          <w:rFonts w:ascii="Aptos" w:hAnsi="Aptos"/>
+          <w:sz w:val="20"/>
+          <w:szCs w:val="20"/>
+          <w:lang w:val="en-US"/>
+        </w:rPr>
+        <w:t>facilityName</w:t>
+      </w:r>
+      <w:proofErr w:type="spellEnd"/>
+      <w:r>
+        <w:rPr>
+          <w:rFonts w:ascii="Aptos" w:hAnsi="Aptos"/>
+          <w:sz w:val="20"/>
+          <w:szCs w:val="20"/>
+          <w:lang w:val="en-US"/>
+        </w:rPr>
+        <w:t>}}</w:t>
       </w:r>
     </w:p>
     <w:p>
@@ -1817,7 +2222,27 @@
           <w:szCs w:val="20"/>
           <w:lang w:val="en-US"/>
         </w:rPr>
-        <w:t>{{facilityAddress}}</w:t>
+        <w:t>{{</w:t>
+      </w:r>
+      <w:proofErr w:type="spellStart"/>
+      <w:r>
+        <w:rPr>
+          <w:rFonts w:ascii="Aptos" w:hAnsi="Aptos"/>
+          <w:sz w:val="20"/>
+          <w:szCs w:val="20"/>
+          <w:lang w:val="en-US"/>
+        </w:rPr>
+        <w:t>facilityAddress</w:t>
+      </w:r>
+      <w:proofErr w:type="spellEnd"/>
+      <w:r>
+        <w:rPr>
+          <w:rFonts w:ascii="Aptos" w:hAnsi="Aptos"/>
+          <w:sz w:val="20"/>
+          <w:szCs w:val="20"/>
+          <w:lang w:val="en-US"/>
+        </w:rPr>
+        <w:t>}}</w:t>
       </w:r>
     </w:p>
     <w:p>
@@ -1890,34 +2315,28 @@
           <w:szCs w:val="20"/>
           <w:lang w:val="en-US"/>
         </w:rPr>
-        <w:t>{{facilityCityStateZip}}</w:t>
-      </w:r>
-    </w:p>
-    <w:p>
-      <w:pPr>
-        <w:spacing w:after="120"/>
-        <w:rPr>
-          <w:rFonts w:ascii="Aptos" w:hAnsi="Aptos"/>
-          <w:b/>
-          <w:bCs/>
-          <w:sz w:val="20"/>
-          <w:szCs w:val="20"/>
-          <w:u w:val="single"/>
-        </w:rPr>
-      </w:pPr>
-    </w:p>
-    <w:p>
-      <w:pPr>
-        <w:spacing w:after="120"/>
-        <w:rPr>
-          <w:rFonts w:ascii="Aptos" w:hAnsi="Aptos"/>
-          <w:b/>
-          <w:bCs/>
-          <w:sz w:val="20"/>
-          <w:szCs w:val="20"/>
-          <w:u w:val="single"/>
-        </w:rPr>
-      </w:pPr>
+        <w:t>{{</w:t>
+      </w:r>
+      <w:proofErr w:type="spellStart"/>
+      <w:r>
+        <w:rPr>
+          <w:rFonts w:ascii="Aptos" w:hAnsi="Aptos"/>
+          <w:sz w:val="20"/>
+          <w:szCs w:val="20"/>
+          <w:lang w:val="en-US"/>
+        </w:rPr>
+        <w:t>facilityCityStateZip</w:t>
+      </w:r>
+      <w:proofErr w:type="spellEnd"/>
+      <w:r>
+        <w:rPr>
+          <w:rFonts w:ascii="Aptos" w:hAnsi="Aptos"/>
+          <w:sz w:val="20"/>
+          <w:szCs w:val="20"/>
+          <w:lang w:val="en-US"/>
+        </w:rPr>
+        <w:t>}}</w:t>
+      </w:r>
     </w:p>
     <w:p>
       <w:pPr>
@@ -1998,6 +2417,8 @@
       <w:r>
         <w:rPr>
           <w:rFonts w:ascii="Aptos" w:hAnsi="Aptos"/>
+          <w:b/>
+          <w:bCs/>
           <w:sz w:val="20"/>
           <w:szCs w:val="20"/>
         </w:rPr>
@@ -2007,6 +2428,8 @@
       <w:r>
         <w:rPr>
           <w:rFonts w:ascii="Aptos" w:hAnsi="Aptos"/>
+          <w:b/>
+          <w:bCs/>
           <w:sz w:val="20"/>
           <w:szCs w:val="20"/>
         </w:rPr>
@@ -2015,14 +2438,30 @@
       <w:r>
         <w:rPr>
           <w:rFonts w:ascii="Aptos" w:hAnsi="Aptos"/>
-          <w:sz w:val="20"/>
-          <w:szCs w:val="20"/>
-        </w:rPr>
-        <w:t>weekly by</w:t>
-      </w:r>
-      <w:r>
-        <w:rPr>
-          <w:rFonts w:ascii="Aptos" w:hAnsi="Aptos"/>
+          <w:b/>
+          <w:bCs/>
+          <w:sz w:val="20"/>
+          <w:szCs w:val="20"/>
+        </w:rPr>
+        <w:t xml:space="preserve">weekly </w:t>
+      </w:r>
+      <w:proofErr w:type="gramStart"/>
+      <w:r>
+        <w:rPr>
+          <w:rFonts w:ascii="Aptos" w:hAnsi="Aptos"/>
+          <w:b/>
+          <w:bCs/>
+          <w:sz w:val="20"/>
+          <w:szCs w:val="20"/>
+        </w:rPr>
+        <w:t>by</w:t>
+      </w:r>
+      <w:proofErr w:type="gramEnd"/>
+      <w:r>
+        <w:rPr>
+          <w:rFonts w:ascii="Aptos" w:hAnsi="Aptos"/>
+          <w:b/>
+          <w:bCs/>
           <w:sz w:val="20"/>
           <w:szCs w:val="20"/>
         </w:rPr>
@@ -2031,6 +2470,8 @@
       <w:r>
         <w:rPr>
           <w:rFonts w:ascii="Aptos" w:hAnsi="Aptos"/>
+          <w:b/>
+          <w:bCs/>
           <w:sz w:val="20"/>
           <w:szCs w:val="20"/>
         </w:rPr>
@@ -2039,10 +2480,20 @@
       <w:r>
         <w:rPr>
           <w:rFonts w:ascii="Aptos" w:hAnsi="Aptos"/>
-          <w:sz w:val="20"/>
-          <w:szCs w:val="20"/>
-        </w:rPr>
-        <w:t xml:space="preserve"> 12:00 noon </w:t>
+          <w:b/>
+          <w:bCs/>
+          <w:sz w:val="20"/>
+          <w:szCs w:val="20"/>
+        </w:rPr>
+        <w:t xml:space="preserve"> 12:00 noon</w:t>
+      </w:r>
+      <w:r>
+        <w:rPr>
+          <w:rFonts w:ascii="Aptos" w:hAnsi="Aptos"/>
+          <w:sz w:val="20"/>
+          <w:szCs w:val="20"/>
+        </w:rPr>
+        <w:t xml:space="preserve"> </w:t>
       </w:r>
       <w:r>
         <w:rPr>
@@ -2230,7 +2681,25 @@
           <w:sz w:val="20"/>
           <w:szCs w:val="20"/>
         </w:rPr>
-        <w:t>{{payScheduleFrequency}}</w:t>
+        <w:t>{{</w:t>
+      </w:r>
+      <w:proofErr w:type="spellStart"/>
+      <w:r>
+        <w:rPr>
+          <w:rFonts w:ascii="Aptos" w:hAnsi="Aptos"/>
+          <w:sz w:val="20"/>
+          <w:szCs w:val="20"/>
+        </w:rPr>
+        <w:t>payScheduleFrequency</w:t>
+      </w:r>
+      <w:proofErr w:type="spellEnd"/>
+      <w:r>
+        <w:rPr>
+          <w:rFonts w:ascii="Aptos" w:hAnsi="Aptos"/>
+          <w:sz w:val="20"/>
+          <w:szCs w:val="20"/>
+        </w:rPr>
+        <w:t>}}</w:t>
       </w:r>
       <w:r>
         <w:rPr>
@@ -2587,7 +3056,25 @@
           <w:sz w:val="20"/>
           <w:szCs w:val="20"/>
         </w:rPr>
-        <w:t>Trailblazer or the Employee may terminate this agreement at any time by providing 14 days' written notice. If the Employee terminates the assignment without the required notice, they may be subject to a $1,000 cancellation fee and/or recovery of any client-assessed penalties or other direct costs incurred by Trailblazer as a result of the Employee's early termination, where permitted by applicable law.</w:t>
+        <w:t xml:space="preserve">Trailblazer or the Employee may terminate this agreement at any time by providing 14 days' written notice. If the Employee terminates the assignment without the required notice, they may be subject to a $1,000 cancellation fee and/or recovery of any client-assessed penalties or other direct costs incurred by Trailblazer </w:t>
+      </w:r>
+      <w:proofErr w:type="gramStart"/>
+      <w:r>
+        <w:rPr>
+          <w:rFonts w:ascii="Aptos" w:hAnsi="Aptos"/>
+          <w:sz w:val="20"/>
+          <w:szCs w:val="20"/>
+        </w:rPr>
+        <w:t>as a result of</w:t>
+      </w:r>
+      <w:proofErr w:type="gramEnd"/>
+      <w:r>
+        <w:rPr>
+          <w:rFonts w:ascii="Aptos" w:hAnsi="Aptos"/>
+          <w:sz w:val="20"/>
+          <w:szCs w:val="20"/>
+        </w:rPr>
+        <w:t xml:space="preserve"> the Employee's early termination, where permitted by applicable law.</w:t>
       </w:r>
     </w:p>
     <w:p>
@@ -3397,6 +3884,55 @@
           <w:szCs w:val="20"/>
         </w:rPr>
       </w:pPr>
+      <w:r>
+        <w:rPr>
+          <w:rFonts w:ascii="Aptos" w:hAnsi="Aptos"/>
+          <w:b/>
+          <w:bCs/>
+          <w:sz w:val="20"/>
+          <w:szCs w:val="20"/>
+          <w:u w:val="single"/>
+        </w:rPr>
+        <w:t>Contract Binding</w:t>
+      </w:r>
+      <w:r>
+        <w:rPr>
+          <w:rFonts w:ascii="Aptos" w:eastAsia="Times New Roman" w:hAnsi="Aptos" w:cs="Arial"/>
+          <w:b/>
+          <w:bCs/>
+          <w:sz w:val="20"/>
+          <w:szCs w:val="20"/>
+          <w:u w:val="single"/>
+          <w:lang w:eastAsia="en-AU"/>
+        </w:rPr>
+        <w:t xml:space="preserve"> Authority:</w:t>
+      </w:r>
+      <w:r>
+        <w:rPr>
+          <w:rFonts w:ascii="Aptos" w:eastAsia="Times New Roman" w:hAnsi="Aptos" w:cs="Arial"/>
+          <w:b/>
+          <w:bCs/>
+          <w:sz w:val="20"/>
+          <w:szCs w:val="20"/>
+          <w:lang w:eastAsia="en-AU"/>
+        </w:rPr>
+        <w:t xml:space="preserve"> </w:t>
+      </w:r>
+      <w:r>
+        <w:rPr>
+          <w:rFonts w:ascii="Aptos" w:hAnsi="Aptos"/>
+          <w:sz w:val="20"/>
+          <w:szCs w:val="20"/>
+        </w:rPr>
+        <w:t>Notwithstanding any other term or condition expressed or implied in this offer letter to the contrary, you will not have the authority to enter into any contracts or commitments for or on behalf of TrailBlazer without first obtaining the express written consent of TrailBlazer.</w:t>
+      </w:r>
+    </w:p>
+    <w:p>
+      <w:pPr>
+        <w:rPr>
+          <w:lang w:val="en-AU" w:eastAsia="en-AU"/>
+        </w:rPr>
+      </w:pPr>
     </w:p>
     <w:p>
       <w:pPr>
@@ -3421,7 +3957,25 @@
           <w:sz w:val="20"/>
           <w:szCs w:val="20"/>
         </w:rPr>
-        <w:t>e would like to take this opportunity to thank you for accepting our offer and welcome you to TrailBlazer Staffing Solutions.</w:t>
+        <w:t xml:space="preserve">e would like to take this opportunity to thank you for accepting our offer and </w:t>
+      </w:r>
+      <w:proofErr w:type="gramStart"/>
+      <w:r>
+        <w:rPr>
+          <w:rFonts w:ascii="Aptos" w:hAnsi="Aptos"/>
+          <w:sz w:val="20"/>
+          <w:szCs w:val="20"/>
+        </w:rPr>
+        <w:t>welcome</w:t>
+      </w:r>
+      <w:proofErr w:type="gramEnd"/>
+      <w:r>
+        <w:rPr>
+          <w:rFonts w:ascii="Aptos" w:hAnsi="Aptos"/>
+          <w:sz w:val="20"/>
+          <w:szCs w:val="20"/>
+        </w:rPr>
+        <w:t xml:space="preserve"> you to TrailBlazer Staffing Solutions.</w:t>
       </w:r>
     </w:p>
     <w:p>
@@ -3459,13 +4013,23 @@
           <w:szCs w:val="36"/>
         </w:rPr>
       </w:pPr>
+      <w:proofErr w:type="spellStart"/>
       <w:r>
         <w:rPr>
           <w:rFonts w:ascii="Bradley Hand ITC" w:hAnsi="Bradley Hand ITC"/>
           <w:sz w:val="36"/>
           <w:szCs w:val="36"/>
         </w:rPr>
-        <w:t>Purba Majumder</w:t>
+        <w:t>Purba</w:t>
+      </w:r>
+      <w:proofErr w:type="spellEnd"/>
+      <w:r>
+        <w:rPr>
+          <w:rFonts w:ascii="Bradley Hand ITC" w:hAnsi="Bradley Hand ITC"/>
+          <w:sz w:val="36"/>
+          <w:szCs w:val="36"/>
+        </w:rPr>
+        <w:t xml:space="preserve"> Majumder</w:t>
       </w:r>
     </w:p>
     <w:p>
@@ -3479,15 +4043,27 @@
           <w:szCs w:val="20"/>
         </w:rPr>
       </w:pPr>
-      <w:r>
-        <w:rPr>
-          <w:rFonts w:ascii="Aptos" w:hAnsi="Aptos"/>
-          <w:b/>
-          <w:bCs/>
-          <w:sz w:val="20"/>
-          <w:szCs w:val="20"/>
-        </w:rPr>
-        <w:t>Purba B.</w:t>
+      <w:proofErr w:type="spellStart"/>
+      <w:r>
+        <w:rPr>
+          <w:rFonts w:ascii="Aptos" w:hAnsi="Aptos"/>
+          <w:b/>
+          <w:bCs/>
+          <w:sz w:val="20"/>
+          <w:szCs w:val="20"/>
+        </w:rPr>
+        <w:t>Purba</w:t>
+      </w:r>
+      <w:proofErr w:type="spellEnd"/>
+      <w:r>
+        <w:rPr>
+          <w:rFonts w:ascii="Aptos" w:hAnsi="Aptos"/>
+          <w:b/>
+          <w:bCs/>
+          <w:sz w:val="20"/>
+          <w:szCs w:val="20"/>
+        </w:rPr>
+        <w:t xml:space="preserve"> B.</w:t>
       </w:r>
       <w:r>
         <w:rPr>
@@ -3638,7 +4214,7 @@
 </file>
 
 <file path=word/endnotes.xml><?xml version="1.0" encoding="utf-8"?>
-<w:endnotes xmlns:wpc="http://schemas.microsoft.com/office/word/2010/wordprocessingCanvas" xmlns:cx="http://schemas.microsoft.com/office/drawing/2014/chartex" xmlns:cx1="http://schemas.microsoft.com/office/drawing/2015/9/8/chartex" xmlns:cx2="http://schemas.microsoft.com/office/drawing/2015/10/21/chartex" xmlns:cx3="http://schemas.microsoft.com/office/drawing/2016/5/9/chartex" xmlns:cx4="http://schemas.microsoft.com/office/drawing/2016/5/10/chartex" xmlns:cx5="http://schemas.microsoft.com/office/drawing/2016/5/11/chartex" xmlns:cx6="http://schemas.microsoft.com/office/drawing/2016/5/12/chartex" xmlns:cx7="http://schemas.microsoft.com/office/drawing/2016/5/13/chartex" xmlns:cx8="http://schemas.microsoft.com/office/drawing/2016/5/14/chartex" xmlns:mc="http://schemas.openxmlformats.org/markup-compatibility/2006" xmlns:aink="http://schemas.microsoft.com/office/drawing/2016/ink" xmlns:am3d="http://schemas.microsoft.com/office/drawing/2017/model3d" xmlns:o="urn:schemas-microsoft-com:office:office" xmlns:oel="http://schemas.microsoft.com/office/2019/extlst" xmlns:r="http://schemas.openxmlformats.org/officeDocument/2006/relationships" xmlns:m="http://schemas.openxmlformats.org/officeDocument/2006/math" xmlns:v="urn:schemas-microsoft-com:vml" xmlns:wp14="http://schemas.microsoft.com/office/word/2010/wordprocessingDrawing" xmlns:wp="http://schemas.openxmlformats.org/drawingml/2006/wordprocessingDrawing" xmlns:w10="urn:schemas-microsoft-com:office:word" xmlns:w="http://schemas.openxmlformats.org/wordprocessingml/2006/main" xmlns:w14="http://schemas.microsoft.com/office/word/2010/wordml" xmlns:w15="http://schemas.microsoft.com/office/word/2012/wordml" xmlns:w16cex="http://schemas.microsoft.com/office/word/2018/wordml/cex" xmlns:w16cid="http://schemas.microsoft.com/office/word/2016/wordml/cid" xmlns:w16="http://schemas.microsoft.com/office/word/2018/wordml" xmlns:w16du="http://schemas.microsoft.com/office/word/2023/wordml/word16du" xmlns:w16sdtdh="http://schemas.microsoft.com/office/word/2020/wordml/sdtdatahash" xmlns:w16sdtfl="http://schemas.microsoft.com/office/word/2024/wordml/sdtformatlock" xmlns:w16se="http://schemas.microsoft.com/office/word/2015/wordml/symex" xmlns:wpg="http://schemas.microsoft.com/office/word/2010/wordprocessingGroup" xmlns:wpi="http://schemas.microsoft.com/office/word/2010/wordprocessingInk" xmlns:wne="http://schemas.microsoft.com/office/word/2006/wordml" xmlns:wps="http://schemas.microsoft.com/office/word/2010/wordprocessingShape" mc:Ignorable="w14 w15 w16se w16cid w16 w16cex w16sdtdh w16sdtfl w16du wp14">
+<w:endnotes xmlns:wpc="http://schemas.microsoft.com/office/word/2010/wordprocessingCanvas" xmlns:cx="http://schemas.microsoft.com/office/drawing/2014/chartex" xmlns:cx1="http://schemas.microsoft.com/office/drawing/2015/9/8/chartex" xmlns:cx2="http://schemas.microsoft.com/office/drawing/2015/10/21/chartex" xmlns:cx3="http://schemas.microsoft.com/office/drawing/2016/5/9/chartex" xmlns:cx4="http://schemas.microsoft.com/office/drawing/2016/5/10/chartex" xmlns:cx5="http://schemas.microsoft.com/office/drawing/2016/5/11/chartex" xmlns:cx6="http://schemas.microsoft.com/office/drawing/2016/5/12/chartex" xmlns:cx7="http://schemas.microsoft.com/office/drawing/2016/5/13/chartex" xmlns:cx8="http://schemas.microsoft.com/office/drawing/2016/5/14/chartex" xmlns:mc="http://schemas.openxmlformats.org/markup-compatibility/2006" xmlns:aink="http://schemas.microsoft.com/office/drawing/2016/ink" xmlns:am3d="http://schemas.microsoft.com/office/drawing/2017/model3d" xmlns:o="urn:schemas-microsoft-com:office:office" xmlns:oel="http://schemas.microsoft.com/office/2019/extlst" xmlns:r="http://schemas.openxmlformats.org/officeDocument/2006/relationships" xmlns:m="http://schemas.openxmlformats.org/officeDocument/2006/math" xmlns:v="urn:schemas-microsoft-com:vml" xmlns:wp14="http://schemas.microsoft.com/office/word/2010/wordprocessingDrawing" xmlns:wp="http://schemas.openxmlformats.org/drawingml/2006/wordprocessingDrawing" xmlns:w10="urn:schemas-microsoft-com:office:word" xmlns:w="http://schemas.openxmlformats.org/wordprocessingml/2006/main" xmlns:w14="http://schemas.microsoft.com/office/word/2010/wordml" xmlns:w15="http://schemas.microsoft.com/office/word/2012/wordml" xmlns:w16cei="http://schemas.microsoft.com/office/word/2026/wordml/cei" xmlns:w16cex="http://schemas.microsoft.com/office/word/2018/wordml/cex" xmlns:w16cid="http://schemas.microsoft.com/office/word/2016/wordml/cid" xmlns:w16="http://schemas.microsoft.com/office/word/2018/wordml" xmlns:w16du="http://schemas.microsoft.com/office/word/2023/wordml/word16du" xmlns:w16sdtdh="http://schemas.microsoft.com/office/word/2020/wordml/sdtdatahash" xmlns:w16sdtfl="http://schemas.microsoft.com/office/word/2024/wordml/sdtformatlock" xmlns:w16se="http://schemas.microsoft.com/office/word/2015/wordml/symex" xmlns:wpg="http://schemas.microsoft.com/office/word/2010/wordprocessingGroup" xmlns:wpi="http://schemas.microsoft.com/office/word/2010/wordprocessingInk" xmlns:wne="http://schemas.microsoft.com/office/word/2006/wordml" xmlns:wps="http://schemas.microsoft.com/office/word/2010/wordprocessingShape" mc:Ignorable="w14 w15 w16se w16cid w16 w16cex w16sdtdh w16sdtfl w16du wp14">
   <w:endnote w:type="separator" w:id="-1">
     <w:p>
       <w:pPr>
@@ -3663,7 +4239,7 @@
 </file>
 
 <file path=word/footer1.xml><?xml version="1.0" encoding="utf-8"?>
-<w:ftr xmlns:wpc="http://schemas.microsoft.com/office/word/2010/wordprocessingCanvas" xmlns:cx="http://schemas.microsoft.com/office/drawing/2014/chartex" xmlns:cx1="http://schemas.microsoft.com/office/drawing/2015/9/8/chartex" xmlns:cx2="http://schemas.microsoft.com/office/drawing/2015/10/21/chartex" xmlns:cx3="http://schemas.microsoft.com/office/drawing/2016/5/9/chartex" xmlns:cx4="http://schemas.microsoft.com/office/drawing/2016/5/10/chartex" xmlns:cx5="http://schemas.microsoft.com/office/drawing/2016/5/11/chartex" xmlns:cx6="http://schemas.microsoft.com/office/drawing/2016/5/12/chartex" xmlns:cx7="http://schemas.microsoft.com/office/drawing/2016/5/13/chartex" xmlns:cx8="http://schemas.microsoft.com/office/drawing/2016/5/14/chartex" xmlns:mc="http://schemas.openxmlformats.org/markup-compatibility/2006" xmlns:aink="http://schemas.microsoft.com/office/drawing/2016/ink" xmlns:am3d="http://schemas.microsoft.com/office/drawing/2017/model3d" xmlns:o="urn:schemas-microsoft-com:office:office" xmlns:oel="http://schemas.microsoft.com/office/2019/extlst" xmlns:r="http://schemas.openxmlformats.org/officeDocument/2006/relationships" xmlns:m="http://schemas.openxmlformats.org/officeDocument/2006/math" xmlns:v="urn:schemas-microsoft-com:vml" xmlns:wp14="http://schemas.microsoft.com/office/word/2010/wordprocessingDrawing" xmlns:wp="http://schemas.openxmlformats.org/drawingml/2006/wordprocessingDrawing" xmlns:w10="urn:schemas-microsoft-com:office:word" xmlns:w="http://schemas.openxmlformats.org/wordprocessingml/2006/main" xmlns:w14="http://schemas.microsoft.com/office/word/2010/wordml" xmlns:w15="http://schemas.microsoft.com/office/word/2012/wordml" xmlns:w16cex="http://schemas.microsoft.com/office/word/2018/wordml/cex" xmlns:w16cid="http://schemas.microsoft.com/office/word/2016/wordml/cid" xmlns:w16="http://schemas.microsoft.com/office/word/2018/wordml" xmlns:w16du="http://schemas.microsoft.com/office/word/2023/wordml/word16du" xmlns:w16sdtdh="http://schemas.microsoft.com/office/word/2020/wordml/sdtdatahash" xmlns:w16sdtfl="http://schemas.microsoft.com/office/word/2024/wordml/sdtformatlock" xmlns:w16se="http://schemas.microsoft.com/office/word/2015/wordml/symex" xmlns:wpg="http://schemas.microsoft.com/office/word/2010/wordprocessingGroup" xmlns:wpi="http://schemas.microsoft.com/office/word/2010/wordprocessingInk" xmlns:wne="http://schemas.microsoft.com/office/word/2006/wordml" xmlns:wps="http://schemas.microsoft.com/office/word/2010/wordprocessingShape" mc:Ignorable="w14 w15 w16se w16cid w16 w16cex w16sdtdh w16sdtfl w16du wp14">
+<w:ftr xmlns:wpc="http://schemas.microsoft.com/office/word/2010/wordprocessingCanvas" xmlns:cx="http://schemas.microsoft.com/office/drawing/2014/chartex" xmlns:cx1="http://schemas.microsoft.com/office/drawing/2015/9/8/chartex" xmlns:cx2="http://schemas.microsoft.com/office/drawing/2015/10/21/chartex" xmlns:cx3="http://schemas.microsoft.com/office/drawing/2016/5/9/chartex" xmlns:cx4="http://schemas.microsoft.com/office/drawing/2016/5/10/chartex" xmlns:cx5="http://schemas.microsoft.com/office/drawing/2016/5/11/chartex" xmlns:cx6="http://schemas.microsoft.com/office/drawing/2016/5/12/chartex" xmlns:cx7="http://schemas.microsoft.com/office/drawing/2016/5/13/chartex" xmlns:cx8="http://schemas.microsoft.com/office/drawing/2016/5/14/chartex" xmlns:mc="http://schemas.openxmlformats.org/markup-compatibility/2006" xmlns:aink="http://schemas.microsoft.com/office/drawing/2016/ink" xmlns:am3d="http://schemas.microsoft.com/office/drawing/2017/model3d" xmlns:o="urn:schemas-microsoft-com:office:office" xmlns:oel="http://schemas.microsoft.com/office/2019/extlst" xmlns:r="http://schemas.openxmlformats.org/officeDocument/2006/relationships" xmlns:m="http://schemas.openxmlformats.org/officeDocument/2006/math" xmlns:v="urn:schemas-microsoft-com:vml" xmlns:wp14="http://schemas.microsoft.com/office/word/2010/wordprocessingDrawing" xmlns:wp="http://schemas.openxmlformats.org/drawingml/2006/wordprocessingDrawing" xmlns:w10="urn:schemas-microsoft-com:office:word" xmlns:w="http://schemas.openxmlformats.org/wordprocessingml/2006/main" xmlns:w14="http://schemas.microsoft.com/office/word/2010/wordml" xmlns:w15="http://schemas.microsoft.com/office/word/2012/wordml" xmlns:w16cei="http://schemas.microsoft.com/office/word/2026/wordml/cei" xmlns:w16cex="http://schemas.microsoft.com/office/word/2018/wordml/cex" xmlns:w16cid="http://schemas.microsoft.com/office/word/2016/wordml/cid" xmlns:w16="http://schemas.microsoft.com/office/word/2018/wordml" xmlns:w16du="http://schemas.microsoft.com/office/word/2023/wordml/word16du" xmlns:w16sdtdh="http://schemas.microsoft.com/office/word/2020/wordml/sdtdatahash" xmlns:w16sdtfl="http://schemas.microsoft.com/office/word/2024/wordml/sdtformatlock" xmlns:w16se="http://schemas.microsoft.com/office/word/2015/wordml/symex" xmlns:wpg="http://schemas.microsoft.com/office/word/2010/wordprocessingGroup" xmlns:wpi="http://schemas.microsoft.com/office/word/2010/wordprocessingInk" xmlns:wne="http://schemas.microsoft.com/office/word/2006/wordml" xmlns:wps="http://schemas.microsoft.com/office/word/2010/wordprocessingShape" mc:Ignorable="w14 w15 w16se w16cid w16 w16cex w16sdtdh w16sdtfl w16du wp14">
   <w:p>
     <w:pPr>
       <w:pStyle w:val="Footer"/>
@@ -3940,7 +4516,7 @@
 </file>
 
 <file path=word/footnotes.xml><?xml version="1.0" encoding="utf-8"?>
-<w:footnotes xmlns:wpc="http://schemas.microsoft.com/office/word/2010/wordprocessingCanvas" xmlns:cx="http://schemas.microsoft.com/office/drawing/2014/chartex" xmlns:cx1="http://schemas.microsoft.com/office/drawing/2015/9/8/chartex" xmlns:cx2="http://schemas.microsoft.com/office/drawing/2015/10/21/chartex" xmlns:cx3="http://schemas.microsoft.com/office/drawing/2016/5/9/chartex" xmlns:cx4="http://schemas.microsoft.com/office/drawing/2016/5/10/chartex" xmlns:cx5="http://schemas.microsoft.com/office/drawing/2016/5/11/chartex" xmlns:cx6="http://schemas.microsoft.com/office/drawing/2016/5/12/chartex" xmlns:cx7="http://schemas.microsoft.com/office/drawing/2016/5/13/chartex" xmlns:cx8="http://schemas.microsoft.com/office/drawing/2016/5/14/chartex" xmlns:mc="http://schemas.openxmlformats.org/markup-compatibility/2006" xmlns:aink="http://schemas.microsoft.com/office/drawing/2016/ink" xmlns:am3d="http://schemas.microsoft.com/office/drawing/2017/model3d" xmlns:o="urn:schemas-microsoft-com:office:office" xmlns:oel="http://schemas.microsoft.com/office/2019/extlst" xmlns:r="http://schemas.openxmlformats.org/officeDocument/2006/relationships" xmlns:m="http://schemas.openxmlformats.org/officeDocument/2006/math" xmlns:v="urn:schemas-microsoft-com:vml" xmlns:wp14="http://schemas.microsoft.com/office/word/2010/wordprocessingDrawing" xmlns:wp="http://schemas.openxmlformats.org/drawingml/2006/wordprocessingDrawing" xmlns:w10="urn:schemas-microsoft-com:office:word" xmlns:w="http://schemas.openxmlformats.org/wordprocessingml/2006/main" xmlns:w14="http://schemas.microsoft.com/office/word/2010/wordml" xmlns:w15="http://schemas.microsoft.com/office/word/2012/wordml" xmlns:w16cex="http://schemas.microsoft.com/office/word/2018/wordml/cex" xmlns:w16cid="http://schemas.microsoft.com/office/word/2016/wordml/cid" xmlns:w16="http://schemas.microsoft.com/office/word/2018/wordml" xmlns:w16du="http://schemas.microsoft.com/office/word/2023/wordml/word16du" xmlns:w16sdtdh="http://schemas.microsoft.com/office/word/2020/wordml/sdtdatahash" xmlns:w16sdtfl="http://schemas.microsoft.com/office/word/2024/wordml/sdtformatlock" xmlns:w16se="http://schemas.microsoft.com/office/word/2015/wordml/symex" xmlns:wpg="http://schemas.microsoft.com/office/word/2010/wordprocessingGroup" xmlns:wpi="http://schemas.microsoft.com/office/word/2010/wordprocessingInk" xmlns:wne="http://schemas.microsoft.com/office/word/2006/wordml" xmlns:wps="http://schemas.microsoft.com/office/word/2010/wordprocessingShape" mc:Ignorable="w14 w15 w16se w16cid w16 w16cex w16sdtdh w16sdtfl w16du wp14">
+<w:footnotes xmlns:wpc="http://schemas.microsoft.com/office/word/2010/wordprocessingCanvas" xmlns:cx="http://schemas.microsoft.com/office/drawing/2014/chartex" xmlns:cx1="http://schemas.microsoft.com/office/drawing/2015/9/8/chartex" xmlns:cx2="http://schemas.microsoft.com/office/drawing/2015/10/21/chartex" xmlns:cx3="http://schemas.microsoft.com/office/drawing/2016/5/9/chartex" xmlns:cx4="http://schemas.microsoft.com/office/drawing/2016/5/10/chartex" xmlns:cx5="http://schemas.microsoft.com/office/drawing/2016/5/11/chartex" xmlns:cx6="http://schemas.microsoft.com/office/drawing/2016/5/12/chartex" xmlns:cx7="http://schemas.microsoft.com/office/drawing/2016/5/13/chartex" xmlns:cx8="http://schemas.microsoft.com/office/drawing/2016/5/14/chartex" xmlns:mc="http://schemas.openxmlformats.org/markup-compatibility/2006" xmlns:aink="http://schemas.microsoft.com/office/drawing/2016/ink" xmlns:am3d="http://schemas.microsoft.com/office/drawing/2017/model3d" xmlns:o="urn:schemas-microsoft-com:office:office" xmlns:oel="http://schemas.microsoft.com/office/2019/extlst" xmlns:r="http://schemas.openxmlformats.org/officeDocument/2006/relationships" xmlns:m="http://schemas.openxmlformats.org/officeDocument/2006/math" xmlns:v="urn:schemas-microsoft-com:vml" xmlns:wp14="http://schemas.microsoft.com/office/word/2010/wordprocessingDrawing" xmlns:wp="http://schemas.openxmlformats.org/drawingml/2006/wordprocessingDrawing" xmlns:w10="urn:schemas-microsoft-com:office:word" xmlns:w="http://schemas.openxmlformats.org/wordprocessingml/2006/main" xmlns:w14="http://schemas.microsoft.com/office/word/2010/wordml" xmlns:w15="http://schemas.microsoft.com/office/word/2012/wordml" xmlns:w16cei="http://schemas.microsoft.com/office/word/2026/wordml/cei" xmlns:w16cex="http://schemas.microsoft.com/office/word/2018/wordml/cex" xmlns:w16cid="http://schemas.microsoft.com/office/word/2016/wordml/cid" xmlns:w16="http://schemas.microsoft.com/office/word/2018/wordml" xmlns:w16du="http://schemas.microsoft.com/office/word/2023/wordml/word16du" xmlns:w16sdtdh="http://schemas.microsoft.com/office/word/2020/wordml/sdtdatahash" xmlns:w16sdtfl="http://schemas.microsoft.com/office/word/2024/wordml/sdtformatlock" xmlns:w16se="http://schemas.microsoft.com/office/word/2015/wordml/symex" xmlns:wpg="http://schemas.microsoft.com/office/word/2010/wordprocessingGroup" xmlns:wpi="http://schemas.microsoft.com/office/word/2010/wordprocessingInk" xmlns:wne="http://schemas.microsoft.com/office/word/2006/wordml" xmlns:wps="http://schemas.microsoft.com/office/word/2010/wordprocessingShape" mc:Ignorable="w14 w15 w16se w16cid w16 w16cex w16sdtdh w16sdtfl w16du wp14">
   <w:footnote w:type="separator" w:id="-1">
     <w:p>
       <w:pPr>
@@ -3965,7 +4541,7 @@
 </file>
 
 <file path=word/numbering.xml><?xml version="1.0" encoding="utf-8"?>
-<w:numbering xmlns:wpc="http://schemas.microsoft.com/office/word/2010/wordprocessingCanvas" xmlns:cx="http://schemas.microsoft.com/office/drawing/2014/chartex" xmlns:cx1="http://schemas.microsoft.com/office/drawing/2015/9/8/chartex" xmlns:cx2="http://schemas.microsoft.com/office/drawing/2015/10/21/chartex" xmlns:cx3="http://schemas.microsoft.com/office/drawing/2016/5/9/chartex" xmlns:cx4="http://schemas.microsoft.com/office/drawing/2016/5/10/chartex" xmlns:cx5="http://schemas.microsoft.com/office/drawing/2016/5/11/chartex" xmlns:cx6="http://schemas.microsoft.com/office/drawing/2016/5/12/chartex" xmlns:cx7="http://schemas.microsoft.com/office/drawing/2016/5/13/chartex" xmlns:cx8="http://schemas.microsoft.com/office/drawing/2016/5/14/chartex" xmlns:mc="http://schemas.openxmlformats.org/markup-compatibility/2006" xmlns:aink="http://schemas.microsoft.com/office/drawing/2016/ink" xmlns:am3d="http://schemas.microsoft.com/office/drawing/2017/model3d" xmlns:o="urn:schemas-microsoft-com:office:office" xmlns:oel="http://schemas.microsoft.com/office/2019/extlst" xmlns:r="http://schemas.openxmlformats.org/officeDocument/2006/relationships" xmlns:m="http://schemas.openxmlformats.org/officeDocument/2006/math" xmlns:v="urn:schemas-microsoft-com:vml" xmlns:wp14="http://schemas.microsoft.com/office/word/2010/wordprocessingDrawing" xmlns:wp="http://schemas.openxmlformats.org/drawingml/2006/wordprocessingDrawing" xmlns:w10="urn:schemas-microsoft-com:office:word" xmlns:w="http://schemas.openxmlformats.org/wordprocessingml/2006/main" xmlns:w14="http://schemas.microsoft.com/office/word/2010/wordml" xmlns:w15="http://schemas.microsoft.com/office/word/2012/wordml" xmlns:w16cex="http://schemas.microsoft.com/office/word/2018/wordml/cex" xmlns:w16cid="http://schemas.microsoft.com/office/word/2016/wordml/cid" xmlns:w16="http://schemas.microsoft.com/office/word/2018/wordml" xmlns:w16du="http://schemas.microsoft.com/office/word/2023/wordml/word16du" xmlns:w16sdtdh="http://schemas.microsoft.com/office/word/2020/wordml/sdtdatahash" xmlns:w16sdtfl="http://schemas.microsoft.com/office/word/2024/wordml/sdtformatlock" xmlns:w16se="http://schemas.microsoft.com/office/word/2015/wordml/symex" xmlns:wpg="http://schemas.microsoft.com/office/word/2010/wordprocessingGroup" xmlns:wpi="http://schemas.microsoft.com/office/word/2010/wordprocessingInk" xmlns:wne="http://schemas.microsoft.com/office/word/2006/wordml" xmlns:wps="http://schemas.microsoft.com/office/word/2010/wordprocessingShape" mc:Ignorable="w14 w15 w16se w16cid w16 w16cex w16sdtdh w16sdtfl w16du wp14">
+<w:numbering xmlns:wpc="http://schemas.microsoft.com/office/word/2010/wordprocessingCanvas" xmlns:cx="http://schemas.microsoft.com/office/drawing/2014/chartex" xmlns:cx1="http://schemas.microsoft.com/office/drawing/2015/9/8/chartex" xmlns:cx2="http://schemas.microsoft.com/office/drawing/2015/10/21/chartex" xmlns:cx3="http://schemas.microsoft.com/office/drawing/2016/5/9/chartex" xmlns:cx4="http://schemas.microsoft.com/office/drawing/2016/5/10/chartex" xmlns:cx5="http://schemas.microsoft.com/office/drawing/2016/5/11/chartex" xmlns:cx6="http://schemas.microsoft.com/office/drawing/2016/5/12/chartex" xmlns:cx7="http://schemas.microsoft.com/office/drawing/2016/5/13/chartex" xmlns:cx8="http://schemas.microsoft.com/office/drawing/2016/5/14/chartex" xmlns:mc="http://schemas.openxmlformats.org/markup-compatibility/2006" xmlns:aink="http://schemas.microsoft.com/office/drawing/2016/ink" xmlns:am3d="http://schemas.microsoft.com/office/drawing/2017/model3d" xmlns:o="urn:schemas-microsoft-com:office:office" xmlns:oel="http://schemas.microsoft.com/office/2019/extlst" xmlns:r="http://schemas.openxmlformats.org/officeDocument/2006/relationships" xmlns:m="http://schemas.openxmlformats.org/officeDocument/2006/math" xmlns:v="urn:schemas-microsoft-com:vml" xmlns:wp14="http://schemas.microsoft.com/office/word/2010/wordprocessingDrawing" xmlns:wp="http://schemas.openxmlformats.org/drawingml/2006/wordprocessingDrawing" xmlns:w10="urn:schemas-microsoft-com:office:word" xmlns:w="http://schemas.openxmlformats.org/wordprocessingml/2006/main" xmlns:w14="http://schemas.microsoft.com/office/word/2010/wordml" xmlns:w15="http://schemas.microsoft.com/office/word/2012/wordml" xmlns:w16cei="http://schemas.microsoft.com/office/word/2026/wordml/cei" xmlns:w16cex="http://schemas.microsoft.com/office/word/2018/wordml/cex" xmlns:w16cid="http://schemas.microsoft.com/office/word/2016/wordml/cid" xmlns:w16="http://schemas.microsoft.com/office/word/2018/wordml" xmlns:w16du="http://schemas.microsoft.com/office/word/2023/wordml/word16du" xmlns:w16sdtdh="http://schemas.microsoft.com/office/word/2020/wordml/sdtdatahash" xmlns:w16sdtfl="http://schemas.microsoft.com/office/word/2024/wordml/sdtformatlock" xmlns:w16se="http://schemas.microsoft.com/office/word/2015/wordml/symex" xmlns:wpg="http://schemas.microsoft.com/office/word/2010/wordprocessingGroup" xmlns:wpi="http://schemas.microsoft.com/office/word/2010/wordprocessingInk" xmlns:wne="http://schemas.microsoft.com/office/word/2006/wordml" xmlns:wps="http://schemas.microsoft.com/office/word/2010/wordprocessingShape" mc:Ignorable="w14 w15 w16se w16cid w16 w16cex w16sdtdh w16sdtfl w16du wp14">
   <w:abstractNum w:abstractNumId="0" w15:restartNumberingAfterBreak="0">
     <w:nsid w:val="1B6D4E71"/>
     <w:multiLevelType w:val="multilevel"/>
@@ -6835,23 +7411,6 @@
 </file>
 
 <file path=customXml/item1.xml><?xml version="1.0" encoding="utf-8"?>
-<?mso-contentType ?>
-<FormTemplates xmlns="http://schemas.microsoft.com/sharepoint/v3/contenttype/forms">
-  <Display>DocumentLibraryForm</Display>
-  <Edit>DocumentLibraryForm</Edit>
-  <New>DocumentLibraryForm</New>
-</FormTemplates>
-</file>
-
-<file path=customXml/item2.xml><?xml version="1.0" encoding="utf-8"?>
-<p:properties xmlns:p="http://schemas.microsoft.com/office/2006/metadata/properties" xmlns:xsi="http://www.w3.org/2001/XMLSchema-instance" xmlns:pc="http://schemas.microsoft.com/office/infopath/2007/PartnerControls">
-  <documentManagement>
-    <_activity xmlns="2169045f-e607-4534-844d-fccd73ad8fdf" xsi:nil="true"/>
-  </documentManagement>
-</p:properties>
-</file>
-
-<file path=customXml/item3.xml><?xml version="1.0" encoding="utf-8"?>
 <ct:contentTypeSchema xmlns:ct="http://schemas.microsoft.com/office/2006/metadata/contentType" xmlns:ma="http://schemas.microsoft.com/office/2006/metadata/properties/metaAttributes" ct:_="" ma:_="" ma:contentTypeName="Document" ma:contentTypeID="0x010100F3365D30B7BA604CBF10B41D4887A9AD" ma:contentTypeVersion="9" ma:contentTypeDescription="Create a new document." ma:contentTypeScope="" ma:versionID="0039b0dff1a773dffb7957b278b56eef">
   <xsd:schema xmlns:xsd="http://www.w3.org/2001/XMLSchema" xmlns:xs="http://www.w3.org/2001/XMLSchema" xmlns:p="http://schemas.microsoft.com/office/2006/metadata/properties" xmlns:ns3="2169045f-e607-4534-844d-fccd73ad8fdf" targetNamespace="http://schemas.microsoft.com/office/2006/metadata/properties" ma:root="true" ma:fieldsID="2a088f01f83aaa5fd78ab1ee0be9b847" ns3:_="">
     <xsd:import namespace="2169045f-e607-4534-844d-fccd73ad8fdf"/>
@@ -7027,10 +7586,37 @@
 </ct:contentTypeSchema>
 </file>
 
+<file path=customXml/item2.xml><?xml version="1.0" encoding="utf-8"?>
+<p:properties xmlns:p="http://schemas.microsoft.com/office/2006/metadata/properties" xmlns:xsi="http://www.w3.org/2001/XMLSchema-instance" xmlns:pc="http://schemas.microsoft.com/office/infopath/2007/PartnerControls">
+  <documentManagement>
+    <_activity xmlns="2169045f-e607-4534-844d-fccd73ad8fdf" xsi:nil="true"/>
+  </documentManagement>
+</p:properties>
+</file>
+
+<file path=customXml/item3.xml><?xml version="1.0" encoding="utf-8"?>
+<?mso-contentType ?>
+<FormTemplates xmlns="http://schemas.microsoft.com/sharepoint/v3/contenttype/forms">
+  <Display>DocumentLibraryForm</Display>
+  <Edit>DocumentLibraryForm</Edit>
+  <New>DocumentLibraryForm</New>
+</FormTemplates>
+</file>
+
 <file path=customXml/itemProps1.xml><?xml version="1.0" encoding="utf-8"?>
-<ds:datastoreItem xmlns:ds="http://schemas.openxmlformats.org/officeDocument/2006/customXml" ds:itemID="{59393987-0C0B-4D6F-A718-E27F3D924901}">
+<ds:datastoreItem xmlns:ds="http://schemas.openxmlformats.org/officeDocument/2006/customXml" ds:itemID="{F096A583-D72D-443E-A7C0-05E146F2C94E}">
   <ds:schemaRefs>
-    <ds:schemaRef ds:uri="http://schemas.microsoft.com/sharepoint/v3/contenttype/forms"/>
+    <ds:schemaRef ds:uri="http://schemas.microsoft.com/office/2006/metadata/contentType"/>
+    <ds:schemaRef ds:uri="http://schemas.microsoft.com/office/2006/metadata/properties/metaAttributes"/>
+    <ds:schemaRef ds:uri="http://www.w3.org/2001/XMLSchema"/>
+    <ds:schemaRef ds:uri="http://schemas.microsoft.com/office/2006/metadata/properties"/>
+    <ds:schemaRef ds:uri="2169045f-e607-4534-844d-fccd73ad8fdf"/>
+    <ds:schemaRef ds:uri="http://schemas.microsoft.com/office/2006/documentManagement/types"/>
+    <ds:schemaRef ds:uri="http://schemas.microsoft.com/office/infopath/2007/PartnerControls"/>
+    <ds:schemaRef ds:uri="http://schemas.openxmlformats.org/package/2006/metadata/core-properties"/>
+    <ds:schemaRef ds:uri="http://purl.org/dc/elements/1.1/"/>
+    <ds:schemaRef ds:uri="http://purl.org/dc/terms/"/>
+    <ds:schemaRef ds:uri="http://schemas.microsoft.com/internal/obd"/>
   </ds:schemaRefs>
 </ds:datastoreItem>
 </file>
@@ -7046,19 +7632,9 @@
 </file>
 
 <file path=customXml/itemProps3.xml><?xml version="1.0" encoding="utf-8"?>
-<ds:datastoreItem xmlns:ds="http://schemas.openxmlformats.org/officeDocument/2006/customXml" ds:itemID="{F096A583-D72D-443E-A7C0-05E146F2C94E}">
+<ds:datastoreItem xmlns:ds="http://schemas.openxmlformats.org/officeDocument/2006/customXml" ds:itemID="{59393987-0C0B-4D6F-A718-E27F3D924901}">
   <ds:schemaRefs>
-    <ds:schemaRef ds:uri="http://schemas.microsoft.com/office/2006/metadata/contentType"/>
-    <ds:schemaRef ds:uri="http://schemas.microsoft.com/office/2006/metadata/properties/metaAttributes"/>
-    <ds:schemaRef ds:uri="http://www.w3.org/2001/XMLSchema"/>
-    <ds:schemaRef ds:uri="http://schemas.microsoft.com/office/2006/metadata/properties"/>
-    <ds:schemaRef ds:uri="2169045f-e607-4534-844d-fccd73ad8fdf"/>
-    <ds:schemaRef ds:uri="http://schemas.microsoft.com/office/2006/documentManagement/types"/>
-    <ds:schemaRef ds:uri="http://schemas.microsoft.com/office/infopath/2007/PartnerControls"/>
-    <ds:schemaRef ds:uri="http://schemas.openxmlformats.org/package/2006/metadata/core-properties"/>
-    <ds:schemaRef ds:uri="http://purl.org/dc/elements/1.1/"/>
-    <ds:schemaRef ds:uri="http://purl.org/dc/terms/"/>
-    <ds:schemaRef ds:uri="http://schemas.microsoft.com/internal/obd"/>
+    <ds:schemaRef ds:uri="http://schemas.microsoft.com/sharepoint/v3/contenttype/forms"/>
   </ds:schemaRefs>
 </ds:datastoreItem>
 </file>
</xml_diff>